<commit_message>
Publish revised diploma submission and supporting visuals
</commit_message>
<xml_diff>
--- a/submission/diploma-final-proposal-and-analysis.docx
+++ b/submission/diploma-final-proposal-and-analysis.docx
@@ -4,7 +4,7 @@
   <ns0:body>
     <ns0:p>
       <ns0:pPr>
-        <ns0:spacing ns0:before="0" ns0:after="0"/>
+        <ns0:spacing ns0:after="0" ns0:before="0"/>
         <ns0:ind ns0:firstLine="0"/>
         <ns0:jc ns0:val="center"/>
       </ns0:pPr>
@@ -19,7 +19,7 @@
     </ns0:p>
     <ns0:p>
       <ns0:pPr>
-        <ns0:spacing ns0:before="0" ns0:after="2200"/>
+        <ns0:spacing ns0:after="2200" ns0:before="0"/>
         <ns0:ind ns0:firstLine="0"/>
         <ns0:jc ns0:val="center"/>
       </ns0:pPr>
@@ -34,7 +34,7 @@
     </ns0:p>
     <ns0:p>
       <ns0:pPr>
-        <ns0:spacing ns0:before="0" ns0:after="240"/>
+        <ns0:spacing ns0:after="240" ns0:before="0"/>
         <ns0:ind ns0:firstLine="0"/>
         <ns0:jc ns0:val="center"/>
       </ns0:pPr>
@@ -50,7 +50,7 @@
     <ns0:p>
       <ns0:pPr>
         <ns0:pStyle ns0:val="Title"/>
-        <ns0:spacing ns0:before="0" ns0:after="240"/>
+        <ns0:spacing ns0:after="240" ns0:before="0"/>
         <ns0:jc ns0:val="center"/>
       </ns0:pPr>
       <ns0:r>
@@ -64,7 +64,7 @@
     </ns0:p>
     <ns0:p>
       <ns0:pPr>
-        <ns0:spacing ns0:before="0" ns0:after="360"/>
+        <ns0:spacing ns0:after="360" ns0:before="0"/>
         <ns0:ind ns0:firstLine="0"/>
         <ns0:jc ns0:val="center"/>
       </ns0:pPr>
@@ -79,7 +79,7 @@
     </ns0:p>
     <ns0:p>
       <ns0:pPr>
-        <ns0:spacing ns0:before="0" ns0:after="2300"/>
+        <ns0:spacing ns0:after="2300" ns0:before="0"/>
         <ns0:ind ns0:firstLine="0"/>
         <ns0:jc ns0:val="center"/>
       </ns0:pPr>
@@ -94,7 +94,7 @@
     </ns0:p>
     <ns0:p>
       <ns0:pPr>
-        <ns0:spacing ns0:before="0" ns0:after="100"/>
+        <ns0:spacing ns0:after="100" ns0:before="0"/>
         <ns0:ind ns0:firstLine="0"/>
         <ns0:jc ns0:val="right"/>
       </ns0:pPr>
@@ -109,7 +109,7 @@
     </ns0:p>
     <ns0:p>
       <ns0:pPr>
-        <ns0:spacing ns0:before="0" ns0:after="1800"/>
+        <ns0:spacing ns0:after="1800" ns0:before="0"/>
         <ns0:ind ns0:firstLine="0"/>
         <ns0:jc ns0:val="right"/>
       </ns0:pPr>
@@ -124,7 +124,7 @@
     </ns0:p>
     <ns0:p>
       <ns0:pPr>
-        <ns0:spacing ns0:before="0" ns0:after="0"/>
+        <ns0:spacing ns0:after="0" ns0:before="0"/>
         <ns0:ind ns0:firstLine="0"/>
         <ns0:jc ns0:val="center"/>
       </ns0:pPr>
@@ -185,7 +185,7 @@
     </ns0:p>
     <ns0:p>
       <ns0:r>
-        <ns0:t>Prospective game creators may possess an original concept or storyline without the programming and game-engine expertise needed to implement it as a playable digital game. The proposed platform would accept a user-authored narrative and selected game preferences, then generate a complete 2D game that can be launched and played in a web browser. The central technical problem is to convert an underspecified narrative into a consistent representation of game state, player actions, progression rules and a reachable ending while retaining the essential elements of the original concept. The intended primary users are people without game-development experience; writers, educators and small creative teams are candidate groups for investigation. Their actual needs, preferred workflows and tolerance for simplification remain to be established through direct research.</ns0:t>
+        <ns0:t>Prospective game creators may possess an original concept or storyline without the programming and game-engine expertise needed to implement it as a playable digital game. The proposed platform would accept a user-authored narrative and selected game preferences, then generate a complete 2D game that can be launched and played in a web browser. The central technical problem is to convert an underspecified narrative into a consistent representation of game state, player actions, progression rules and a reachable ending while retaining the essential elements of the original concept. The intended primary users are people without game-development experience; writers, educators and small creative teams are candidate groups for investigation. Planned user research will examine these groups’ needs, preferred workflows and tolerance for simplifying requested mechanics.</ns0:t>
       </ns0:r>
     </ns0:p>
     <ns0:p>
@@ -269,7 +269,7 @@
     <ns0:p>
       <ns0:pPr>
         <ns0:keepNext/>
-        <ns0:spacing ns0:before="160" ns0:after="80"/>
+        <ns0:spacing ns0:after="80" ns0:before="160"/>
         <ns0:ind ns0:firstLine="0"/>
         <ns0:jc ns0:val="left"/>
       </ns0:pPr>
@@ -303,16 +303,16 @@
             <ns0:vAlign ns0:val="center"/>
             <ns0:shd ns0:fill="F1F1F1"/>
             <ns0:tcBorders>
-              <ns0:top ns0:val="single" ns0:sz="4" ns0:color="D9D9D9"/>
-              <ns0:left ns0:val="single" ns0:sz="4" ns0:color="D9D9D9"/>
-              <ns0:bottom ns0:val="single" ns0:sz="4" ns0:color="D9D9D9"/>
-              <ns0:right ns0:val="single" ns0:sz="4" ns0:color="D9D9D9"/>
+              <ns0:top ns0:color="D9D9D9" ns0:sz="4" ns0:val="single"/>
+              <ns0:left ns0:color="D9D9D9" ns0:sz="4" ns0:val="single"/>
+              <ns0:bottom ns0:color="D9D9D9" ns0:sz="4" ns0:val="single"/>
+              <ns0:right ns0:color="D9D9D9" ns0:sz="4" ns0:val="single"/>
             </ns0:tcBorders>
             <ns0:tcMar>
-              <ns0:top ns0:w="95" ns0:type="dxa"/>
-              <ns0:left ns0:w="95" ns0:type="dxa"/>
-              <ns0:bottom ns0:w="95" ns0:type="dxa"/>
-              <ns0:right ns0:w="95" ns0:type="dxa"/>
+              <ns0:top ns0:type="dxa" ns0:w="95"/>
+              <ns0:left ns0:type="dxa" ns0:w="95"/>
+              <ns0:bottom ns0:type="dxa" ns0:w="95"/>
+              <ns0:right ns0:type="dxa" ns0:w="95"/>
             </ns0:tcMar>
           </ns0:tcPr>
           <ns0:p>
@@ -337,16 +337,16 @@
             <ns0:vAlign ns0:val="center"/>
             <ns0:shd ns0:fill="F1F1F1"/>
             <ns0:tcBorders>
-              <ns0:top ns0:val="single" ns0:sz="4" ns0:color="D9D9D9"/>
-              <ns0:left ns0:val="single" ns0:sz="4" ns0:color="D9D9D9"/>
-              <ns0:bottom ns0:val="single" ns0:sz="4" ns0:color="D9D9D9"/>
-              <ns0:right ns0:val="single" ns0:sz="4" ns0:color="D9D9D9"/>
+              <ns0:top ns0:color="D9D9D9" ns0:sz="4" ns0:val="single"/>
+              <ns0:left ns0:color="D9D9D9" ns0:sz="4" ns0:val="single"/>
+              <ns0:bottom ns0:color="D9D9D9" ns0:sz="4" ns0:val="single"/>
+              <ns0:right ns0:color="D9D9D9" ns0:sz="4" ns0:val="single"/>
             </ns0:tcBorders>
             <ns0:tcMar>
-              <ns0:top ns0:w="95" ns0:type="dxa"/>
-              <ns0:left ns0:w="95" ns0:type="dxa"/>
-              <ns0:bottom ns0:w="95" ns0:type="dxa"/>
-              <ns0:right ns0:w="95" ns0:type="dxa"/>
+              <ns0:top ns0:type="dxa" ns0:w="95"/>
+              <ns0:left ns0:type="dxa" ns0:w="95"/>
+              <ns0:bottom ns0:type="dxa" ns0:w="95"/>
+              <ns0:right ns0:type="dxa" ns0:w="95"/>
             </ns0:tcMar>
           </ns0:tcPr>
           <ns0:p>
@@ -375,16 +375,16 @@
             <ns0:tcW ns0:type="dxa" ns0:w="2268"/>
             <ns0:vAlign ns0:val="center"/>
             <ns0:tcBorders>
-              <ns0:top ns0:val="single" ns0:sz="4" ns0:color="D9D9D9"/>
-              <ns0:left ns0:val="single" ns0:sz="4" ns0:color="D9D9D9"/>
-              <ns0:bottom ns0:val="single" ns0:sz="4" ns0:color="D9D9D9"/>
-              <ns0:right ns0:val="single" ns0:sz="4" ns0:color="D9D9D9"/>
+              <ns0:top ns0:color="D9D9D9" ns0:sz="4" ns0:val="single"/>
+              <ns0:left ns0:color="D9D9D9" ns0:sz="4" ns0:val="single"/>
+              <ns0:bottom ns0:color="D9D9D9" ns0:sz="4" ns0:val="single"/>
+              <ns0:right ns0:color="D9D9D9" ns0:sz="4" ns0:val="single"/>
             </ns0:tcBorders>
             <ns0:tcMar>
-              <ns0:top ns0:w="95" ns0:type="dxa"/>
-              <ns0:left ns0:w="95" ns0:type="dxa"/>
-              <ns0:bottom ns0:w="95" ns0:type="dxa"/>
-              <ns0:right ns0:w="95" ns0:type="dxa"/>
+              <ns0:top ns0:type="dxa" ns0:w="95"/>
+              <ns0:left ns0:type="dxa" ns0:w="95"/>
+              <ns0:bottom ns0:type="dxa" ns0:w="95"/>
+              <ns0:right ns0:type="dxa" ns0:w="95"/>
             </ns0:tcMar>
           </ns0:tcPr>
           <ns0:p>
@@ -407,16 +407,16 @@
             <ns0:tcW ns0:type="dxa" ns0:w="6633"/>
             <ns0:vAlign ns0:val="center"/>
             <ns0:tcBorders>
-              <ns0:top ns0:val="single" ns0:sz="4" ns0:color="D9D9D9"/>
-              <ns0:left ns0:val="single" ns0:sz="4" ns0:color="D9D9D9"/>
-              <ns0:bottom ns0:val="single" ns0:sz="4" ns0:color="D9D9D9"/>
-              <ns0:right ns0:val="single" ns0:sz="4" ns0:color="D9D9D9"/>
+              <ns0:top ns0:color="D9D9D9" ns0:sz="4" ns0:val="single"/>
+              <ns0:left ns0:color="D9D9D9" ns0:sz="4" ns0:val="single"/>
+              <ns0:bottom ns0:color="D9D9D9" ns0:sz="4" ns0:val="single"/>
+              <ns0:right ns0:color="D9D9D9" ns0:sz="4" ns0:val="single"/>
             </ns0:tcBorders>
             <ns0:tcMar>
-              <ns0:top ns0:w="95" ns0:type="dxa"/>
-              <ns0:left ns0:w="95" ns0:type="dxa"/>
-              <ns0:bottom ns0:w="95" ns0:type="dxa"/>
-              <ns0:right ns0:w="95" ns0:type="dxa"/>
+              <ns0:top ns0:type="dxa" ns0:w="95"/>
+              <ns0:left ns0:type="dxa" ns0:w="95"/>
+              <ns0:bottom ns0:type="dxa" ns0:w="95"/>
+              <ns0:right ns0:type="dxa" ns0:w="95"/>
             </ns0:tcMar>
           </ns0:tcPr>
           <ns0:p>
@@ -445,16 +445,16 @@
             <ns0:vAlign ns0:val="center"/>
             <ns0:shd ns0:fill="FAFAFA"/>
             <ns0:tcBorders>
-              <ns0:top ns0:val="single" ns0:sz="4" ns0:color="D9D9D9"/>
-              <ns0:left ns0:val="single" ns0:sz="4" ns0:color="D9D9D9"/>
-              <ns0:bottom ns0:val="single" ns0:sz="4" ns0:color="D9D9D9"/>
-              <ns0:right ns0:val="single" ns0:sz="4" ns0:color="D9D9D9"/>
+              <ns0:top ns0:color="D9D9D9" ns0:sz="4" ns0:val="single"/>
+              <ns0:left ns0:color="D9D9D9" ns0:sz="4" ns0:val="single"/>
+              <ns0:bottom ns0:color="D9D9D9" ns0:sz="4" ns0:val="single"/>
+              <ns0:right ns0:color="D9D9D9" ns0:sz="4" ns0:val="single"/>
             </ns0:tcBorders>
             <ns0:tcMar>
-              <ns0:top ns0:w="95" ns0:type="dxa"/>
-              <ns0:left ns0:w="95" ns0:type="dxa"/>
-              <ns0:bottom ns0:w="95" ns0:type="dxa"/>
-              <ns0:right ns0:w="95" ns0:type="dxa"/>
+              <ns0:top ns0:type="dxa" ns0:w="95"/>
+              <ns0:left ns0:type="dxa" ns0:w="95"/>
+              <ns0:bottom ns0:type="dxa" ns0:w="95"/>
+              <ns0:right ns0:type="dxa" ns0:w="95"/>
             </ns0:tcMar>
           </ns0:tcPr>
           <ns0:p>
@@ -478,16 +478,16 @@
             <ns0:vAlign ns0:val="center"/>
             <ns0:shd ns0:fill="FAFAFA"/>
             <ns0:tcBorders>
-              <ns0:top ns0:val="single" ns0:sz="4" ns0:color="D9D9D9"/>
-              <ns0:left ns0:val="single" ns0:sz="4" ns0:color="D9D9D9"/>
-              <ns0:bottom ns0:val="single" ns0:sz="4" ns0:color="D9D9D9"/>
-              <ns0:right ns0:val="single" ns0:sz="4" ns0:color="D9D9D9"/>
+              <ns0:top ns0:color="D9D9D9" ns0:sz="4" ns0:val="single"/>
+              <ns0:left ns0:color="D9D9D9" ns0:sz="4" ns0:val="single"/>
+              <ns0:bottom ns0:color="D9D9D9" ns0:sz="4" ns0:val="single"/>
+              <ns0:right ns0:color="D9D9D9" ns0:sz="4" ns0:val="single"/>
             </ns0:tcBorders>
             <ns0:tcMar>
-              <ns0:top ns0:w="95" ns0:type="dxa"/>
-              <ns0:left ns0:w="95" ns0:type="dxa"/>
-              <ns0:bottom ns0:w="95" ns0:type="dxa"/>
-              <ns0:right ns0:w="95" ns0:type="dxa"/>
+              <ns0:top ns0:type="dxa" ns0:w="95"/>
+              <ns0:left ns0:type="dxa" ns0:w="95"/>
+              <ns0:bottom ns0:type="dxa" ns0:w="95"/>
+              <ns0:right ns0:type="dxa" ns0:w="95"/>
             </ns0:tcMar>
           </ns0:tcPr>
           <ns0:p>
@@ -515,16 +515,16 @@
             <ns0:tcW ns0:type="dxa" ns0:w="2268"/>
             <ns0:vAlign ns0:val="center"/>
             <ns0:tcBorders>
-              <ns0:top ns0:val="single" ns0:sz="4" ns0:color="D9D9D9"/>
-              <ns0:left ns0:val="single" ns0:sz="4" ns0:color="D9D9D9"/>
-              <ns0:bottom ns0:val="single" ns0:sz="4" ns0:color="D9D9D9"/>
-              <ns0:right ns0:val="single" ns0:sz="4" ns0:color="D9D9D9"/>
+              <ns0:top ns0:color="D9D9D9" ns0:sz="4" ns0:val="single"/>
+              <ns0:left ns0:color="D9D9D9" ns0:sz="4" ns0:val="single"/>
+              <ns0:bottom ns0:color="D9D9D9" ns0:sz="4" ns0:val="single"/>
+              <ns0:right ns0:color="D9D9D9" ns0:sz="4" ns0:val="single"/>
             </ns0:tcBorders>
             <ns0:tcMar>
-              <ns0:top ns0:w="95" ns0:type="dxa"/>
-              <ns0:left ns0:w="95" ns0:type="dxa"/>
-              <ns0:bottom ns0:w="95" ns0:type="dxa"/>
-              <ns0:right ns0:w="95" ns0:type="dxa"/>
+              <ns0:top ns0:type="dxa" ns0:w="95"/>
+              <ns0:left ns0:type="dxa" ns0:w="95"/>
+              <ns0:bottom ns0:type="dxa" ns0:w="95"/>
+              <ns0:right ns0:type="dxa" ns0:w="95"/>
             </ns0:tcMar>
           </ns0:tcPr>
           <ns0:p>
@@ -547,16 +547,16 @@
             <ns0:tcW ns0:type="dxa" ns0:w="6633"/>
             <ns0:vAlign ns0:val="center"/>
             <ns0:tcBorders>
-              <ns0:top ns0:val="single" ns0:sz="4" ns0:color="D9D9D9"/>
-              <ns0:left ns0:val="single" ns0:sz="4" ns0:color="D9D9D9"/>
-              <ns0:bottom ns0:val="single" ns0:sz="4" ns0:color="D9D9D9"/>
-              <ns0:right ns0:val="single" ns0:sz="4" ns0:color="D9D9D9"/>
+              <ns0:top ns0:color="D9D9D9" ns0:sz="4" ns0:val="single"/>
+              <ns0:left ns0:color="D9D9D9" ns0:sz="4" ns0:val="single"/>
+              <ns0:bottom ns0:color="D9D9D9" ns0:sz="4" ns0:val="single"/>
+              <ns0:right ns0:color="D9D9D9" ns0:sz="4" ns0:val="single"/>
             </ns0:tcBorders>
             <ns0:tcMar>
-              <ns0:top ns0:w="95" ns0:type="dxa"/>
-              <ns0:left ns0:w="95" ns0:type="dxa"/>
-              <ns0:bottom ns0:w="95" ns0:type="dxa"/>
-              <ns0:right ns0:w="95" ns0:type="dxa"/>
+              <ns0:top ns0:type="dxa" ns0:w="95"/>
+              <ns0:left ns0:type="dxa" ns0:w="95"/>
+              <ns0:bottom ns0:type="dxa" ns0:w="95"/>
+              <ns0:right ns0:type="dxa" ns0:w="95"/>
             </ns0:tcMar>
           </ns0:tcPr>
           <ns0:p>
@@ -617,7 +617,7 @@
     </ns0:p>
     <ns0:p>
       <ns0:r>
-        <ns0:t>Research on generated text games distinguishes execution from fidelity and winnability [4]. Although that setting differs from 2D browser games generated from user stories, it motivates separate evaluation criteria. Human–AI interaction guidelines support making capabilities and failures understandable [5]. Neither source measures demand for this platform or predicts its technical success. The supplied questionnaire export offers preliminary descriptive input; prototype evidence remains unavailable.</ns0:t>
+        <ns0:t>Research on generated text games distinguishes execution from fidelity and winnability [4]. Although that setting differs from 2D browser games generated from user stories, it motivates separate evaluation criteria. Human–AI interaction guidelines support making capabilities and failures understandable [5]. Neither source measures demand for this platform or predicts its technical success. The supplied questionnaire export provides preliminary descriptive input for the proposed scope.</ns0:t>
       </ns0:r>
     </ns0:p>
     <ns0:p>
@@ -634,7 +634,7 @@
     </ns0:p>
     <ns0:p>
       <ns0:r>
-        <ns0:t>The team supplied a Google Forms export with 142 response records dated 23 October 2026. Of these, 98 records (69.0%) indicate no or beginner programming/game-engine experience. An immediately playable browser game is the most selected single output, with 65 records (45.8%); this is a plurality, not a majority. Asked about trying a future prototype, 57 records (40.1%) select yes, 48 (33.8%) maybe and 37 (26.1%) no. The most frequently selected barriers are translating a story into gameplay rules (48; 33.8%) and programming (47; 33.1%). These are descriptions of the supplied export, not estimates of demand or evidence of adoption. The team reports that students submitted the answers. The export does not independently establish respondent identity or distinct participation, and this convenience sample cannot represent the wider population of prospective creators. No product trial has been conducted. Neither the required three to five user discussions nor substantive client agreement is documented; survey records do not satisfy that separate criterion.</ns0:t>
+        <ns0:t>The team supplied a Google Forms export with 142 response records dated 23 October 2026. Of these, 98 records (69.0%) indicate no or beginner programming/game-engine experience. An immediately playable browser game is the most selected single output, with 65 records (45.8%); this is a plurality, not a majority. Asked about trying a future prototype, 57 records (40.1%) select yes, 48 (33.8%) maybe and 37 (26.1%) no. The most frequently selected barriers are translating a story into gameplay rules (48; 33.8%) and programming (47; 33.1%). These are descriptions of the supplied export, not estimates of demand or evidence of adoption. The team describes the respondents as students in a convenience sample. Self-reported preferences from this sample cannot represent the wider population of prospective creators. The questionnaire concerns a proposed product rather than a product trial.</ns0:t>
       </ns0:r>
     </ns0:p>
     <ns0:p>
@@ -652,7 +652,7 @@
     <ns0:p>
       <ns0:pPr>
         <ns0:keepNext/>
-        <ns0:spacing ns0:before="160" ns0:after="80"/>
+        <ns0:spacing ns0:after="80" ns0:before="160"/>
         <ns0:ind ns0:firstLine="0"/>
         <ns0:jc ns0:val="left"/>
       </ns0:pPr>
@@ -686,16 +686,16 @@
             <ns0:vAlign ns0:val="center"/>
             <ns0:shd ns0:fill="F1F1F1"/>
             <ns0:tcBorders>
-              <ns0:top ns0:val="single" ns0:sz="4" ns0:color="D9D9D9"/>
-              <ns0:left ns0:val="single" ns0:sz="4" ns0:color="D9D9D9"/>
-              <ns0:bottom ns0:val="single" ns0:sz="4" ns0:color="D9D9D9"/>
-              <ns0:right ns0:val="single" ns0:sz="4" ns0:color="D9D9D9"/>
+              <ns0:top ns0:color="D9D9D9" ns0:sz="4" ns0:val="single"/>
+              <ns0:left ns0:color="D9D9D9" ns0:sz="4" ns0:val="single"/>
+              <ns0:bottom ns0:color="D9D9D9" ns0:sz="4" ns0:val="single"/>
+              <ns0:right ns0:color="D9D9D9" ns0:sz="4" ns0:val="single"/>
             </ns0:tcBorders>
             <ns0:tcMar>
-              <ns0:top ns0:w="95" ns0:type="dxa"/>
-              <ns0:left ns0:w="95" ns0:type="dxa"/>
-              <ns0:bottom ns0:w="95" ns0:type="dxa"/>
-              <ns0:right ns0:w="95" ns0:type="dxa"/>
+              <ns0:top ns0:type="dxa" ns0:w="95"/>
+              <ns0:left ns0:type="dxa" ns0:w="95"/>
+              <ns0:bottom ns0:type="dxa" ns0:w="95"/>
+              <ns0:right ns0:type="dxa" ns0:w="95"/>
             </ns0:tcMar>
           </ns0:tcPr>
           <ns0:p>
@@ -720,16 +720,16 @@
             <ns0:vAlign ns0:val="center"/>
             <ns0:shd ns0:fill="F1F1F1"/>
             <ns0:tcBorders>
-              <ns0:top ns0:val="single" ns0:sz="4" ns0:color="D9D9D9"/>
-              <ns0:left ns0:val="single" ns0:sz="4" ns0:color="D9D9D9"/>
-              <ns0:bottom ns0:val="single" ns0:sz="4" ns0:color="D9D9D9"/>
-              <ns0:right ns0:val="single" ns0:sz="4" ns0:color="D9D9D9"/>
+              <ns0:top ns0:color="D9D9D9" ns0:sz="4" ns0:val="single"/>
+              <ns0:left ns0:color="D9D9D9" ns0:sz="4" ns0:val="single"/>
+              <ns0:bottom ns0:color="D9D9D9" ns0:sz="4" ns0:val="single"/>
+              <ns0:right ns0:color="D9D9D9" ns0:sz="4" ns0:val="single"/>
             </ns0:tcBorders>
             <ns0:tcMar>
-              <ns0:top ns0:w="95" ns0:type="dxa"/>
-              <ns0:left ns0:w="95" ns0:type="dxa"/>
-              <ns0:bottom ns0:w="95" ns0:type="dxa"/>
-              <ns0:right ns0:w="95" ns0:type="dxa"/>
+              <ns0:top ns0:type="dxa" ns0:w="95"/>
+              <ns0:left ns0:type="dxa" ns0:w="95"/>
+              <ns0:bottom ns0:type="dxa" ns0:w="95"/>
+              <ns0:right ns0:type="dxa" ns0:w="95"/>
             </ns0:tcMar>
           </ns0:tcPr>
           <ns0:p>
@@ -758,16 +758,16 @@
             <ns0:tcW ns0:type="dxa" ns0:w="2381"/>
             <ns0:vAlign ns0:val="center"/>
             <ns0:tcBorders>
-              <ns0:top ns0:val="single" ns0:sz="4" ns0:color="D9D9D9"/>
-              <ns0:left ns0:val="single" ns0:sz="4" ns0:color="D9D9D9"/>
-              <ns0:bottom ns0:val="single" ns0:sz="4" ns0:color="D9D9D9"/>
-              <ns0:right ns0:val="single" ns0:sz="4" ns0:color="D9D9D9"/>
+              <ns0:top ns0:color="D9D9D9" ns0:sz="4" ns0:val="single"/>
+              <ns0:left ns0:color="D9D9D9" ns0:sz="4" ns0:val="single"/>
+              <ns0:bottom ns0:color="D9D9D9" ns0:sz="4" ns0:val="single"/>
+              <ns0:right ns0:color="D9D9D9" ns0:sz="4" ns0:val="single"/>
             </ns0:tcBorders>
             <ns0:tcMar>
-              <ns0:top ns0:w="95" ns0:type="dxa"/>
-              <ns0:left ns0:w="95" ns0:type="dxa"/>
-              <ns0:bottom ns0:w="95" ns0:type="dxa"/>
-              <ns0:right ns0:w="95" ns0:type="dxa"/>
+              <ns0:top ns0:type="dxa" ns0:w="95"/>
+              <ns0:left ns0:type="dxa" ns0:w="95"/>
+              <ns0:bottom ns0:type="dxa" ns0:w="95"/>
+              <ns0:right ns0:type="dxa" ns0:w="95"/>
             </ns0:tcMar>
           </ns0:tcPr>
           <ns0:p>
@@ -790,16 +790,16 @@
             <ns0:tcW ns0:type="dxa" ns0:w="6520"/>
             <ns0:vAlign ns0:val="center"/>
             <ns0:tcBorders>
-              <ns0:top ns0:val="single" ns0:sz="4" ns0:color="D9D9D9"/>
-              <ns0:left ns0:val="single" ns0:sz="4" ns0:color="D9D9D9"/>
-              <ns0:bottom ns0:val="single" ns0:sz="4" ns0:color="D9D9D9"/>
-              <ns0:right ns0:val="single" ns0:sz="4" ns0:color="D9D9D9"/>
+              <ns0:top ns0:color="D9D9D9" ns0:sz="4" ns0:val="single"/>
+              <ns0:left ns0:color="D9D9D9" ns0:sz="4" ns0:val="single"/>
+              <ns0:bottom ns0:color="D9D9D9" ns0:sz="4" ns0:val="single"/>
+              <ns0:right ns0:color="D9D9D9" ns0:sz="4" ns0:val="single"/>
             </ns0:tcBorders>
             <ns0:tcMar>
-              <ns0:top ns0:w="95" ns0:type="dxa"/>
-              <ns0:left ns0:w="95" ns0:type="dxa"/>
-              <ns0:bottom ns0:w="95" ns0:type="dxa"/>
-              <ns0:right ns0:w="95" ns0:type="dxa"/>
+              <ns0:top ns0:type="dxa" ns0:w="95"/>
+              <ns0:left ns0:type="dxa" ns0:w="95"/>
+              <ns0:bottom ns0:type="dxa" ns0:w="95"/>
+              <ns0:right ns0:type="dxa" ns0:w="95"/>
             </ns0:tcMar>
           </ns0:tcPr>
           <ns0:p>
@@ -828,16 +828,16 @@
             <ns0:vAlign ns0:val="center"/>
             <ns0:shd ns0:fill="FAFAFA"/>
             <ns0:tcBorders>
-              <ns0:top ns0:val="single" ns0:sz="4" ns0:color="D9D9D9"/>
-              <ns0:left ns0:val="single" ns0:sz="4" ns0:color="D9D9D9"/>
-              <ns0:bottom ns0:val="single" ns0:sz="4" ns0:color="D9D9D9"/>
-              <ns0:right ns0:val="single" ns0:sz="4" ns0:color="D9D9D9"/>
+              <ns0:top ns0:color="D9D9D9" ns0:sz="4" ns0:val="single"/>
+              <ns0:left ns0:color="D9D9D9" ns0:sz="4" ns0:val="single"/>
+              <ns0:bottom ns0:color="D9D9D9" ns0:sz="4" ns0:val="single"/>
+              <ns0:right ns0:color="D9D9D9" ns0:sz="4" ns0:val="single"/>
             </ns0:tcBorders>
             <ns0:tcMar>
-              <ns0:top ns0:w="95" ns0:type="dxa"/>
-              <ns0:left ns0:w="95" ns0:type="dxa"/>
-              <ns0:bottom ns0:w="95" ns0:type="dxa"/>
-              <ns0:right ns0:w="95" ns0:type="dxa"/>
+              <ns0:top ns0:type="dxa" ns0:w="95"/>
+              <ns0:left ns0:type="dxa" ns0:w="95"/>
+              <ns0:bottom ns0:type="dxa" ns0:w="95"/>
+              <ns0:right ns0:type="dxa" ns0:w="95"/>
             </ns0:tcMar>
           </ns0:tcPr>
           <ns0:p>
@@ -861,16 +861,16 @@
             <ns0:vAlign ns0:val="center"/>
             <ns0:shd ns0:fill="FAFAFA"/>
             <ns0:tcBorders>
-              <ns0:top ns0:val="single" ns0:sz="4" ns0:color="D9D9D9"/>
-              <ns0:left ns0:val="single" ns0:sz="4" ns0:color="D9D9D9"/>
-              <ns0:bottom ns0:val="single" ns0:sz="4" ns0:color="D9D9D9"/>
-              <ns0:right ns0:val="single" ns0:sz="4" ns0:color="D9D9D9"/>
+              <ns0:top ns0:color="D9D9D9" ns0:sz="4" ns0:val="single"/>
+              <ns0:left ns0:color="D9D9D9" ns0:sz="4" ns0:val="single"/>
+              <ns0:bottom ns0:color="D9D9D9" ns0:sz="4" ns0:val="single"/>
+              <ns0:right ns0:color="D9D9D9" ns0:sz="4" ns0:val="single"/>
             </ns0:tcBorders>
             <ns0:tcMar>
-              <ns0:top ns0:w="95" ns0:type="dxa"/>
-              <ns0:left ns0:w="95" ns0:type="dxa"/>
-              <ns0:bottom ns0:w="95" ns0:type="dxa"/>
-              <ns0:right ns0:w="95" ns0:type="dxa"/>
+              <ns0:top ns0:type="dxa" ns0:w="95"/>
+              <ns0:left ns0:type="dxa" ns0:w="95"/>
+              <ns0:bottom ns0:type="dxa" ns0:w="95"/>
+              <ns0:right ns0:type="dxa" ns0:w="95"/>
             </ns0:tcMar>
           </ns0:tcPr>
           <ns0:p>
@@ -898,16 +898,16 @@
             <ns0:tcW ns0:type="dxa" ns0:w="2381"/>
             <ns0:vAlign ns0:val="center"/>
             <ns0:tcBorders>
-              <ns0:top ns0:val="single" ns0:sz="4" ns0:color="D9D9D9"/>
-              <ns0:left ns0:val="single" ns0:sz="4" ns0:color="D9D9D9"/>
-              <ns0:bottom ns0:val="single" ns0:sz="4" ns0:color="D9D9D9"/>
-              <ns0:right ns0:val="single" ns0:sz="4" ns0:color="D9D9D9"/>
+              <ns0:top ns0:color="D9D9D9" ns0:sz="4" ns0:val="single"/>
+              <ns0:left ns0:color="D9D9D9" ns0:sz="4" ns0:val="single"/>
+              <ns0:bottom ns0:color="D9D9D9" ns0:sz="4" ns0:val="single"/>
+              <ns0:right ns0:color="D9D9D9" ns0:sz="4" ns0:val="single"/>
             </ns0:tcBorders>
             <ns0:tcMar>
-              <ns0:top ns0:w="95" ns0:type="dxa"/>
-              <ns0:left ns0:w="95" ns0:type="dxa"/>
-              <ns0:bottom ns0:w="95" ns0:type="dxa"/>
-              <ns0:right ns0:w="95" ns0:type="dxa"/>
+              <ns0:top ns0:type="dxa" ns0:w="95"/>
+              <ns0:left ns0:type="dxa" ns0:w="95"/>
+              <ns0:bottom ns0:type="dxa" ns0:w="95"/>
+              <ns0:right ns0:type="dxa" ns0:w="95"/>
             </ns0:tcMar>
           </ns0:tcPr>
           <ns0:p>
@@ -930,16 +930,16 @@
             <ns0:tcW ns0:type="dxa" ns0:w="6520"/>
             <ns0:vAlign ns0:val="center"/>
             <ns0:tcBorders>
-              <ns0:top ns0:val="single" ns0:sz="4" ns0:color="D9D9D9"/>
-              <ns0:left ns0:val="single" ns0:sz="4" ns0:color="D9D9D9"/>
-              <ns0:bottom ns0:val="single" ns0:sz="4" ns0:color="D9D9D9"/>
-              <ns0:right ns0:val="single" ns0:sz="4" ns0:color="D9D9D9"/>
+              <ns0:top ns0:color="D9D9D9" ns0:sz="4" ns0:val="single"/>
+              <ns0:left ns0:color="D9D9D9" ns0:sz="4" ns0:val="single"/>
+              <ns0:bottom ns0:color="D9D9D9" ns0:sz="4" ns0:val="single"/>
+              <ns0:right ns0:color="D9D9D9" ns0:sz="4" ns0:val="single"/>
             </ns0:tcBorders>
             <ns0:tcMar>
-              <ns0:top ns0:w="95" ns0:type="dxa"/>
-              <ns0:left ns0:w="95" ns0:type="dxa"/>
-              <ns0:bottom ns0:w="95" ns0:type="dxa"/>
-              <ns0:right ns0:w="95" ns0:type="dxa"/>
+              <ns0:top ns0:type="dxa" ns0:w="95"/>
+              <ns0:left ns0:type="dxa" ns0:w="95"/>
+              <ns0:bottom ns0:type="dxa" ns0:w="95"/>
+              <ns0:right ns0:type="dxa" ns0:w="95"/>
             </ns0:tcMar>
           </ns0:tcPr>
           <ns0:p>
@@ -968,16 +968,16 @@
             <ns0:vAlign ns0:val="center"/>
             <ns0:shd ns0:fill="FAFAFA"/>
             <ns0:tcBorders>
-              <ns0:top ns0:val="single" ns0:sz="4" ns0:color="D9D9D9"/>
-              <ns0:left ns0:val="single" ns0:sz="4" ns0:color="D9D9D9"/>
-              <ns0:bottom ns0:val="single" ns0:sz="4" ns0:color="D9D9D9"/>
-              <ns0:right ns0:val="single" ns0:sz="4" ns0:color="D9D9D9"/>
+              <ns0:top ns0:color="D9D9D9" ns0:sz="4" ns0:val="single"/>
+              <ns0:left ns0:color="D9D9D9" ns0:sz="4" ns0:val="single"/>
+              <ns0:bottom ns0:color="D9D9D9" ns0:sz="4" ns0:val="single"/>
+              <ns0:right ns0:color="D9D9D9" ns0:sz="4" ns0:val="single"/>
             </ns0:tcBorders>
             <ns0:tcMar>
-              <ns0:top ns0:w="95" ns0:type="dxa"/>
-              <ns0:left ns0:w="95" ns0:type="dxa"/>
-              <ns0:bottom ns0:w="95" ns0:type="dxa"/>
-              <ns0:right ns0:w="95" ns0:type="dxa"/>
+              <ns0:top ns0:type="dxa" ns0:w="95"/>
+              <ns0:left ns0:type="dxa" ns0:w="95"/>
+              <ns0:bottom ns0:type="dxa" ns0:w="95"/>
+              <ns0:right ns0:type="dxa" ns0:w="95"/>
             </ns0:tcMar>
           </ns0:tcPr>
           <ns0:p>
@@ -1001,16 +1001,16 @@
             <ns0:vAlign ns0:val="center"/>
             <ns0:shd ns0:fill="FAFAFA"/>
             <ns0:tcBorders>
-              <ns0:top ns0:val="single" ns0:sz="4" ns0:color="D9D9D9"/>
-              <ns0:left ns0:val="single" ns0:sz="4" ns0:color="D9D9D9"/>
-              <ns0:bottom ns0:val="single" ns0:sz="4" ns0:color="D9D9D9"/>
-              <ns0:right ns0:val="single" ns0:sz="4" ns0:color="D9D9D9"/>
+              <ns0:top ns0:color="D9D9D9" ns0:sz="4" ns0:val="single"/>
+              <ns0:left ns0:color="D9D9D9" ns0:sz="4" ns0:val="single"/>
+              <ns0:bottom ns0:color="D9D9D9" ns0:sz="4" ns0:val="single"/>
+              <ns0:right ns0:color="D9D9D9" ns0:sz="4" ns0:val="single"/>
             </ns0:tcBorders>
             <ns0:tcMar>
-              <ns0:top ns0:w="95" ns0:type="dxa"/>
-              <ns0:left ns0:w="95" ns0:type="dxa"/>
-              <ns0:bottom ns0:w="95" ns0:type="dxa"/>
-              <ns0:right ns0:w="95" ns0:type="dxa"/>
+              <ns0:top ns0:type="dxa" ns0:w="95"/>
+              <ns0:left ns0:type="dxa" ns0:w="95"/>
+              <ns0:bottom ns0:type="dxa" ns0:w="95"/>
+              <ns0:right ns0:type="dxa" ns0:w="95"/>
             </ns0:tcMar>
           </ns0:tcPr>
           <ns0:p>
@@ -1060,7 +1060,7 @@
     <ns0:p>
       <ns0:pPr>
         <ns0:keepNext/>
-        <ns0:spacing ns0:before="160" ns0:after="80"/>
+        <ns0:spacing ns0:after="80" ns0:before="160"/>
         <ns0:ind ns0:firstLine="0"/>
         <ns0:jc ns0:val="left"/>
       </ns0:pPr>
@@ -1094,16 +1094,16 @@
             <ns0:vAlign ns0:val="center"/>
             <ns0:shd ns0:fill="F1F1F1"/>
             <ns0:tcBorders>
-              <ns0:top ns0:val="single" ns0:sz="4" ns0:color="D9D9D9"/>
-              <ns0:left ns0:val="single" ns0:sz="4" ns0:color="D9D9D9"/>
-              <ns0:bottom ns0:val="single" ns0:sz="4" ns0:color="D9D9D9"/>
-              <ns0:right ns0:val="single" ns0:sz="4" ns0:color="D9D9D9"/>
+              <ns0:top ns0:color="D9D9D9" ns0:sz="4" ns0:val="single"/>
+              <ns0:left ns0:color="D9D9D9" ns0:sz="4" ns0:val="single"/>
+              <ns0:bottom ns0:color="D9D9D9" ns0:sz="4" ns0:val="single"/>
+              <ns0:right ns0:color="D9D9D9" ns0:sz="4" ns0:val="single"/>
             </ns0:tcBorders>
             <ns0:tcMar>
-              <ns0:top ns0:w="95" ns0:type="dxa"/>
-              <ns0:left ns0:w="95" ns0:type="dxa"/>
-              <ns0:bottom ns0:w="95" ns0:type="dxa"/>
-              <ns0:right ns0:w="95" ns0:type="dxa"/>
+              <ns0:top ns0:type="dxa" ns0:w="95"/>
+              <ns0:left ns0:type="dxa" ns0:w="95"/>
+              <ns0:bottom ns0:type="dxa" ns0:w="95"/>
+              <ns0:right ns0:type="dxa" ns0:w="95"/>
             </ns0:tcMar>
           </ns0:tcPr>
           <ns0:p>
@@ -1128,16 +1128,16 @@
             <ns0:vAlign ns0:val="center"/>
             <ns0:shd ns0:fill="F1F1F1"/>
             <ns0:tcBorders>
-              <ns0:top ns0:val="single" ns0:sz="4" ns0:color="D9D9D9"/>
-              <ns0:left ns0:val="single" ns0:sz="4" ns0:color="D9D9D9"/>
-              <ns0:bottom ns0:val="single" ns0:sz="4" ns0:color="D9D9D9"/>
-              <ns0:right ns0:val="single" ns0:sz="4" ns0:color="D9D9D9"/>
+              <ns0:top ns0:color="D9D9D9" ns0:sz="4" ns0:val="single"/>
+              <ns0:left ns0:color="D9D9D9" ns0:sz="4" ns0:val="single"/>
+              <ns0:bottom ns0:color="D9D9D9" ns0:sz="4" ns0:val="single"/>
+              <ns0:right ns0:color="D9D9D9" ns0:sz="4" ns0:val="single"/>
             </ns0:tcBorders>
             <ns0:tcMar>
-              <ns0:top ns0:w="95" ns0:type="dxa"/>
-              <ns0:left ns0:w="95" ns0:type="dxa"/>
-              <ns0:bottom ns0:w="95" ns0:type="dxa"/>
-              <ns0:right ns0:w="95" ns0:type="dxa"/>
+              <ns0:top ns0:type="dxa" ns0:w="95"/>
+              <ns0:left ns0:type="dxa" ns0:w="95"/>
+              <ns0:bottom ns0:type="dxa" ns0:w="95"/>
+              <ns0:right ns0:type="dxa" ns0:w="95"/>
             </ns0:tcMar>
           </ns0:tcPr>
           <ns0:p>
@@ -1166,16 +1166,16 @@
             <ns0:tcW ns0:type="dxa" ns0:w="2608"/>
             <ns0:vAlign ns0:val="center"/>
             <ns0:tcBorders>
-              <ns0:top ns0:val="single" ns0:sz="4" ns0:color="D9D9D9"/>
-              <ns0:left ns0:val="single" ns0:sz="4" ns0:color="D9D9D9"/>
-              <ns0:bottom ns0:val="single" ns0:sz="4" ns0:color="D9D9D9"/>
-              <ns0:right ns0:val="single" ns0:sz="4" ns0:color="D9D9D9"/>
+              <ns0:top ns0:color="D9D9D9" ns0:sz="4" ns0:val="single"/>
+              <ns0:left ns0:color="D9D9D9" ns0:sz="4" ns0:val="single"/>
+              <ns0:bottom ns0:color="D9D9D9" ns0:sz="4" ns0:val="single"/>
+              <ns0:right ns0:color="D9D9D9" ns0:sz="4" ns0:val="single"/>
             </ns0:tcBorders>
             <ns0:tcMar>
-              <ns0:top ns0:w="95" ns0:type="dxa"/>
-              <ns0:left ns0:w="95" ns0:type="dxa"/>
-              <ns0:bottom ns0:w="95" ns0:type="dxa"/>
-              <ns0:right ns0:w="95" ns0:type="dxa"/>
+              <ns0:top ns0:type="dxa" ns0:w="95"/>
+              <ns0:left ns0:type="dxa" ns0:w="95"/>
+              <ns0:bottom ns0:type="dxa" ns0:w="95"/>
+              <ns0:right ns0:type="dxa" ns0:w="95"/>
             </ns0:tcMar>
           </ns0:tcPr>
           <ns0:p>
@@ -1198,16 +1198,16 @@
             <ns0:tcW ns0:type="dxa" ns0:w="6293"/>
             <ns0:vAlign ns0:val="center"/>
             <ns0:tcBorders>
-              <ns0:top ns0:val="single" ns0:sz="4" ns0:color="D9D9D9"/>
-              <ns0:left ns0:val="single" ns0:sz="4" ns0:color="D9D9D9"/>
-              <ns0:bottom ns0:val="single" ns0:sz="4" ns0:color="D9D9D9"/>
-              <ns0:right ns0:val="single" ns0:sz="4" ns0:color="D9D9D9"/>
+              <ns0:top ns0:color="D9D9D9" ns0:sz="4" ns0:val="single"/>
+              <ns0:left ns0:color="D9D9D9" ns0:sz="4" ns0:val="single"/>
+              <ns0:bottom ns0:color="D9D9D9" ns0:sz="4" ns0:val="single"/>
+              <ns0:right ns0:color="D9D9D9" ns0:sz="4" ns0:val="single"/>
             </ns0:tcBorders>
             <ns0:tcMar>
-              <ns0:top ns0:w="95" ns0:type="dxa"/>
-              <ns0:left ns0:w="95" ns0:type="dxa"/>
-              <ns0:bottom ns0:w="95" ns0:type="dxa"/>
-              <ns0:right ns0:w="95" ns0:type="dxa"/>
+              <ns0:top ns0:type="dxa" ns0:w="95"/>
+              <ns0:left ns0:type="dxa" ns0:w="95"/>
+              <ns0:bottom ns0:type="dxa" ns0:w="95"/>
+              <ns0:right ns0:type="dxa" ns0:w="95"/>
             </ns0:tcMar>
           </ns0:tcPr>
           <ns0:p>
@@ -1236,16 +1236,16 @@
             <ns0:vAlign ns0:val="center"/>
             <ns0:shd ns0:fill="FAFAFA"/>
             <ns0:tcBorders>
-              <ns0:top ns0:val="single" ns0:sz="4" ns0:color="D9D9D9"/>
-              <ns0:left ns0:val="single" ns0:sz="4" ns0:color="D9D9D9"/>
-              <ns0:bottom ns0:val="single" ns0:sz="4" ns0:color="D9D9D9"/>
-              <ns0:right ns0:val="single" ns0:sz="4" ns0:color="D9D9D9"/>
+              <ns0:top ns0:color="D9D9D9" ns0:sz="4" ns0:val="single"/>
+              <ns0:left ns0:color="D9D9D9" ns0:sz="4" ns0:val="single"/>
+              <ns0:bottom ns0:color="D9D9D9" ns0:sz="4" ns0:val="single"/>
+              <ns0:right ns0:color="D9D9D9" ns0:sz="4" ns0:val="single"/>
             </ns0:tcBorders>
             <ns0:tcMar>
-              <ns0:top ns0:w="95" ns0:type="dxa"/>
-              <ns0:left ns0:w="95" ns0:type="dxa"/>
-              <ns0:bottom ns0:w="95" ns0:type="dxa"/>
-              <ns0:right ns0:w="95" ns0:type="dxa"/>
+              <ns0:top ns0:type="dxa" ns0:w="95"/>
+              <ns0:left ns0:type="dxa" ns0:w="95"/>
+              <ns0:bottom ns0:type="dxa" ns0:w="95"/>
+              <ns0:right ns0:type="dxa" ns0:w="95"/>
             </ns0:tcMar>
           </ns0:tcPr>
           <ns0:p>
@@ -1269,16 +1269,16 @@
             <ns0:vAlign ns0:val="center"/>
             <ns0:shd ns0:fill="FAFAFA"/>
             <ns0:tcBorders>
-              <ns0:top ns0:val="single" ns0:sz="4" ns0:color="D9D9D9"/>
-              <ns0:left ns0:val="single" ns0:sz="4" ns0:color="D9D9D9"/>
-              <ns0:bottom ns0:val="single" ns0:sz="4" ns0:color="D9D9D9"/>
-              <ns0:right ns0:val="single" ns0:sz="4" ns0:color="D9D9D9"/>
+              <ns0:top ns0:color="D9D9D9" ns0:sz="4" ns0:val="single"/>
+              <ns0:left ns0:color="D9D9D9" ns0:sz="4" ns0:val="single"/>
+              <ns0:bottom ns0:color="D9D9D9" ns0:sz="4" ns0:val="single"/>
+              <ns0:right ns0:color="D9D9D9" ns0:sz="4" ns0:val="single"/>
             </ns0:tcBorders>
             <ns0:tcMar>
-              <ns0:top ns0:w="95" ns0:type="dxa"/>
-              <ns0:left ns0:w="95" ns0:type="dxa"/>
-              <ns0:bottom ns0:w="95" ns0:type="dxa"/>
-              <ns0:right ns0:w="95" ns0:type="dxa"/>
+              <ns0:top ns0:type="dxa" ns0:w="95"/>
+              <ns0:left ns0:type="dxa" ns0:w="95"/>
+              <ns0:bottom ns0:type="dxa" ns0:w="95"/>
+              <ns0:right ns0:type="dxa" ns0:w="95"/>
             </ns0:tcMar>
           </ns0:tcPr>
           <ns0:p>
@@ -1306,16 +1306,16 @@
             <ns0:tcW ns0:type="dxa" ns0:w="2608"/>
             <ns0:vAlign ns0:val="center"/>
             <ns0:tcBorders>
-              <ns0:top ns0:val="single" ns0:sz="4" ns0:color="D9D9D9"/>
-              <ns0:left ns0:val="single" ns0:sz="4" ns0:color="D9D9D9"/>
-              <ns0:bottom ns0:val="single" ns0:sz="4" ns0:color="D9D9D9"/>
-              <ns0:right ns0:val="single" ns0:sz="4" ns0:color="D9D9D9"/>
+              <ns0:top ns0:color="D9D9D9" ns0:sz="4" ns0:val="single"/>
+              <ns0:left ns0:color="D9D9D9" ns0:sz="4" ns0:val="single"/>
+              <ns0:bottom ns0:color="D9D9D9" ns0:sz="4" ns0:val="single"/>
+              <ns0:right ns0:color="D9D9D9" ns0:sz="4" ns0:val="single"/>
             </ns0:tcBorders>
             <ns0:tcMar>
-              <ns0:top ns0:w="95" ns0:type="dxa"/>
-              <ns0:left ns0:w="95" ns0:type="dxa"/>
-              <ns0:bottom ns0:w="95" ns0:type="dxa"/>
-              <ns0:right ns0:w="95" ns0:type="dxa"/>
+              <ns0:top ns0:type="dxa" ns0:w="95"/>
+              <ns0:left ns0:type="dxa" ns0:w="95"/>
+              <ns0:bottom ns0:type="dxa" ns0:w="95"/>
+              <ns0:right ns0:type="dxa" ns0:w="95"/>
             </ns0:tcMar>
           </ns0:tcPr>
           <ns0:p>
@@ -1338,16 +1338,16 @@
             <ns0:tcW ns0:type="dxa" ns0:w="6293"/>
             <ns0:vAlign ns0:val="center"/>
             <ns0:tcBorders>
-              <ns0:top ns0:val="single" ns0:sz="4" ns0:color="D9D9D9"/>
-              <ns0:left ns0:val="single" ns0:sz="4" ns0:color="D9D9D9"/>
-              <ns0:bottom ns0:val="single" ns0:sz="4" ns0:color="D9D9D9"/>
-              <ns0:right ns0:val="single" ns0:sz="4" ns0:color="D9D9D9"/>
+              <ns0:top ns0:color="D9D9D9" ns0:sz="4" ns0:val="single"/>
+              <ns0:left ns0:color="D9D9D9" ns0:sz="4" ns0:val="single"/>
+              <ns0:bottom ns0:color="D9D9D9" ns0:sz="4" ns0:val="single"/>
+              <ns0:right ns0:color="D9D9D9" ns0:sz="4" ns0:val="single"/>
             </ns0:tcBorders>
             <ns0:tcMar>
-              <ns0:top ns0:w="95" ns0:type="dxa"/>
-              <ns0:left ns0:w="95" ns0:type="dxa"/>
-              <ns0:bottom ns0:w="95" ns0:type="dxa"/>
-              <ns0:right ns0:w="95" ns0:type="dxa"/>
+              <ns0:top ns0:type="dxa" ns0:w="95"/>
+              <ns0:left ns0:type="dxa" ns0:w="95"/>
+              <ns0:bottom ns0:type="dxa" ns0:w="95"/>
+              <ns0:right ns0:type="dxa" ns0:w="95"/>
             </ns0:tcMar>
           </ns0:tcPr>
           <ns0:p>
@@ -1376,16 +1376,16 @@
             <ns0:vAlign ns0:val="center"/>
             <ns0:shd ns0:fill="FAFAFA"/>
             <ns0:tcBorders>
-              <ns0:top ns0:val="single" ns0:sz="4" ns0:color="D9D9D9"/>
-              <ns0:left ns0:val="single" ns0:sz="4" ns0:color="D9D9D9"/>
-              <ns0:bottom ns0:val="single" ns0:sz="4" ns0:color="D9D9D9"/>
-              <ns0:right ns0:val="single" ns0:sz="4" ns0:color="D9D9D9"/>
+              <ns0:top ns0:color="D9D9D9" ns0:sz="4" ns0:val="single"/>
+              <ns0:left ns0:color="D9D9D9" ns0:sz="4" ns0:val="single"/>
+              <ns0:bottom ns0:color="D9D9D9" ns0:sz="4" ns0:val="single"/>
+              <ns0:right ns0:color="D9D9D9" ns0:sz="4" ns0:val="single"/>
             </ns0:tcBorders>
             <ns0:tcMar>
-              <ns0:top ns0:w="95" ns0:type="dxa"/>
-              <ns0:left ns0:w="95" ns0:type="dxa"/>
-              <ns0:bottom ns0:w="95" ns0:type="dxa"/>
-              <ns0:right ns0:w="95" ns0:type="dxa"/>
+              <ns0:top ns0:type="dxa" ns0:w="95"/>
+              <ns0:left ns0:type="dxa" ns0:w="95"/>
+              <ns0:bottom ns0:type="dxa" ns0:w="95"/>
+              <ns0:right ns0:type="dxa" ns0:w="95"/>
             </ns0:tcMar>
           </ns0:tcPr>
           <ns0:p>
@@ -1409,16 +1409,16 @@
             <ns0:vAlign ns0:val="center"/>
             <ns0:shd ns0:fill="FAFAFA"/>
             <ns0:tcBorders>
-              <ns0:top ns0:val="single" ns0:sz="4" ns0:color="D9D9D9"/>
-              <ns0:left ns0:val="single" ns0:sz="4" ns0:color="D9D9D9"/>
-              <ns0:bottom ns0:val="single" ns0:sz="4" ns0:color="D9D9D9"/>
-              <ns0:right ns0:val="single" ns0:sz="4" ns0:color="D9D9D9"/>
+              <ns0:top ns0:color="D9D9D9" ns0:sz="4" ns0:val="single"/>
+              <ns0:left ns0:color="D9D9D9" ns0:sz="4" ns0:val="single"/>
+              <ns0:bottom ns0:color="D9D9D9" ns0:sz="4" ns0:val="single"/>
+              <ns0:right ns0:color="D9D9D9" ns0:sz="4" ns0:val="single"/>
             </ns0:tcBorders>
             <ns0:tcMar>
-              <ns0:top ns0:w="95" ns0:type="dxa"/>
-              <ns0:left ns0:w="95" ns0:type="dxa"/>
-              <ns0:bottom ns0:w="95" ns0:type="dxa"/>
-              <ns0:right ns0:w="95" ns0:type="dxa"/>
+              <ns0:top ns0:type="dxa" ns0:w="95"/>
+              <ns0:left ns0:type="dxa" ns0:w="95"/>
+              <ns0:bottom ns0:type="dxa" ns0:w="95"/>
+              <ns0:right ns0:type="dxa" ns0:w="95"/>
             </ns0:tcMar>
           </ns0:tcPr>
           <ns0:p>
@@ -1446,16 +1446,16 @@
             <ns0:tcW ns0:type="dxa" ns0:w="2608"/>
             <ns0:vAlign ns0:val="center"/>
             <ns0:tcBorders>
-              <ns0:top ns0:val="single" ns0:sz="4" ns0:color="D9D9D9"/>
-              <ns0:left ns0:val="single" ns0:sz="4" ns0:color="D9D9D9"/>
-              <ns0:bottom ns0:val="single" ns0:sz="4" ns0:color="D9D9D9"/>
-              <ns0:right ns0:val="single" ns0:sz="4" ns0:color="D9D9D9"/>
+              <ns0:top ns0:color="D9D9D9" ns0:sz="4" ns0:val="single"/>
+              <ns0:left ns0:color="D9D9D9" ns0:sz="4" ns0:val="single"/>
+              <ns0:bottom ns0:color="D9D9D9" ns0:sz="4" ns0:val="single"/>
+              <ns0:right ns0:color="D9D9D9" ns0:sz="4" ns0:val="single"/>
             </ns0:tcBorders>
             <ns0:tcMar>
-              <ns0:top ns0:w="95" ns0:type="dxa"/>
-              <ns0:left ns0:w="95" ns0:type="dxa"/>
-              <ns0:bottom ns0:w="95" ns0:type="dxa"/>
-              <ns0:right ns0:w="95" ns0:type="dxa"/>
+              <ns0:top ns0:type="dxa" ns0:w="95"/>
+              <ns0:left ns0:type="dxa" ns0:w="95"/>
+              <ns0:bottom ns0:type="dxa" ns0:w="95"/>
+              <ns0:right ns0:type="dxa" ns0:w="95"/>
             </ns0:tcMar>
           </ns0:tcPr>
           <ns0:p>
@@ -1478,16 +1478,16 @@
             <ns0:tcW ns0:type="dxa" ns0:w="6293"/>
             <ns0:vAlign ns0:val="center"/>
             <ns0:tcBorders>
-              <ns0:top ns0:val="single" ns0:sz="4" ns0:color="D9D9D9"/>
-              <ns0:left ns0:val="single" ns0:sz="4" ns0:color="D9D9D9"/>
-              <ns0:bottom ns0:val="single" ns0:sz="4" ns0:color="D9D9D9"/>
-              <ns0:right ns0:val="single" ns0:sz="4" ns0:color="D9D9D9"/>
+              <ns0:top ns0:color="D9D9D9" ns0:sz="4" ns0:val="single"/>
+              <ns0:left ns0:color="D9D9D9" ns0:sz="4" ns0:val="single"/>
+              <ns0:bottom ns0:color="D9D9D9" ns0:sz="4" ns0:val="single"/>
+              <ns0:right ns0:color="D9D9D9" ns0:sz="4" ns0:val="single"/>
             </ns0:tcBorders>
             <ns0:tcMar>
-              <ns0:top ns0:w="95" ns0:type="dxa"/>
-              <ns0:left ns0:w="95" ns0:type="dxa"/>
-              <ns0:bottom ns0:w="95" ns0:type="dxa"/>
-              <ns0:right ns0:w="95" ns0:type="dxa"/>
+              <ns0:top ns0:type="dxa" ns0:w="95"/>
+              <ns0:left ns0:type="dxa" ns0:w="95"/>
+              <ns0:bottom ns0:type="dxa" ns0:w="95"/>
+              <ns0:right ns0:type="dxa" ns0:w="95"/>
             </ns0:tcMar>
           </ns0:tcPr>
           <ns0:p>
@@ -1516,16 +1516,16 @@
             <ns0:vAlign ns0:val="center"/>
             <ns0:shd ns0:fill="FAFAFA"/>
             <ns0:tcBorders>
-              <ns0:top ns0:val="single" ns0:sz="4" ns0:color="D9D9D9"/>
-              <ns0:left ns0:val="single" ns0:sz="4" ns0:color="D9D9D9"/>
-              <ns0:bottom ns0:val="single" ns0:sz="4" ns0:color="D9D9D9"/>
-              <ns0:right ns0:val="single" ns0:sz="4" ns0:color="D9D9D9"/>
+              <ns0:top ns0:color="D9D9D9" ns0:sz="4" ns0:val="single"/>
+              <ns0:left ns0:color="D9D9D9" ns0:sz="4" ns0:val="single"/>
+              <ns0:bottom ns0:color="D9D9D9" ns0:sz="4" ns0:val="single"/>
+              <ns0:right ns0:color="D9D9D9" ns0:sz="4" ns0:val="single"/>
             </ns0:tcBorders>
             <ns0:tcMar>
-              <ns0:top ns0:w="95" ns0:type="dxa"/>
-              <ns0:left ns0:w="95" ns0:type="dxa"/>
-              <ns0:bottom ns0:w="95" ns0:type="dxa"/>
-              <ns0:right ns0:w="95" ns0:type="dxa"/>
+              <ns0:top ns0:type="dxa" ns0:w="95"/>
+              <ns0:left ns0:type="dxa" ns0:w="95"/>
+              <ns0:bottom ns0:type="dxa" ns0:w="95"/>
+              <ns0:right ns0:type="dxa" ns0:w="95"/>
             </ns0:tcMar>
           </ns0:tcPr>
           <ns0:p>
@@ -1549,16 +1549,16 @@
             <ns0:vAlign ns0:val="center"/>
             <ns0:shd ns0:fill="FAFAFA"/>
             <ns0:tcBorders>
-              <ns0:top ns0:val="single" ns0:sz="4" ns0:color="D9D9D9"/>
-              <ns0:left ns0:val="single" ns0:sz="4" ns0:color="D9D9D9"/>
-              <ns0:bottom ns0:val="single" ns0:sz="4" ns0:color="D9D9D9"/>
-              <ns0:right ns0:val="single" ns0:sz="4" ns0:color="D9D9D9"/>
+              <ns0:top ns0:color="D9D9D9" ns0:sz="4" ns0:val="single"/>
+              <ns0:left ns0:color="D9D9D9" ns0:sz="4" ns0:val="single"/>
+              <ns0:bottom ns0:color="D9D9D9" ns0:sz="4" ns0:val="single"/>
+              <ns0:right ns0:color="D9D9D9" ns0:sz="4" ns0:val="single"/>
             </ns0:tcBorders>
             <ns0:tcMar>
-              <ns0:top ns0:w="95" ns0:type="dxa"/>
-              <ns0:left ns0:w="95" ns0:type="dxa"/>
-              <ns0:bottom ns0:w="95" ns0:type="dxa"/>
-              <ns0:right ns0:w="95" ns0:type="dxa"/>
+              <ns0:top ns0:type="dxa" ns0:w="95"/>
+              <ns0:left ns0:type="dxa" ns0:w="95"/>
+              <ns0:bottom ns0:type="dxa" ns0:w="95"/>
+              <ns0:right ns0:type="dxa" ns0:w="95"/>
             </ns0:tcMar>
           </ns0:tcPr>
           <ns0:p>
@@ -1586,16 +1586,16 @@
             <ns0:tcW ns0:type="dxa" ns0:w="2608"/>
             <ns0:vAlign ns0:val="center"/>
             <ns0:tcBorders>
-              <ns0:top ns0:val="single" ns0:sz="4" ns0:color="D9D9D9"/>
-              <ns0:left ns0:val="single" ns0:sz="4" ns0:color="D9D9D9"/>
-              <ns0:bottom ns0:val="single" ns0:sz="4" ns0:color="D9D9D9"/>
-              <ns0:right ns0:val="single" ns0:sz="4" ns0:color="D9D9D9"/>
+              <ns0:top ns0:color="D9D9D9" ns0:sz="4" ns0:val="single"/>
+              <ns0:left ns0:color="D9D9D9" ns0:sz="4" ns0:val="single"/>
+              <ns0:bottom ns0:color="D9D9D9" ns0:sz="4" ns0:val="single"/>
+              <ns0:right ns0:color="D9D9D9" ns0:sz="4" ns0:val="single"/>
             </ns0:tcBorders>
             <ns0:tcMar>
-              <ns0:top ns0:w="95" ns0:type="dxa"/>
-              <ns0:left ns0:w="95" ns0:type="dxa"/>
-              <ns0:bottom ns0:w="95" ns0:type="dxa"/>
-              <ns0:right ns0:w="95" ns0:type="dxa"/>
+              <ns0:top ns0:type="dxa" ns0:w="95"/>
+              <ns0:left ns0:type="dxa" ns0:w="95"/>
+              <ns0:bottom ns0:type="dxa" ns0:w="95"/>
+              <ns0:right ns0:type="dxa" ns0:w="95"/>
             </ns0:tcMar>
           </ns0:tcPr>
           <ns0:p>
@@ -1618,16 +1618,16 @@
             <ns0:tcW ns0:type="dxa" ns0:w="6293"/>
             <ns0:vAlign ns0:val="center"/>
             <ns0:tcBorders>
-              <ns0:top ns0:val="single" ns0:sz="4" ns0:color="D9D9D9"/>
-              <ns0:left ns0:val="single" ns0:sz="4" ns0:color="D9D9D9"/>
-              <ns0:bottom ns0:val="single" ns0:sz="4" ns0:color="D9D9D9"/>
-              <ns0:right ns0:val="single" ns0:sz="4" ns0:color="D9D9D9"/>
+              <ns0:top ns0:color="D9D9D9" ns0:sz="4" ns0:val="single"/>
+              <ns0:left ns0:color="D9D9D9" ns0:sz="4" ns0:val="single"/>
+              <ns0:bottom ns0:color="D9D9D9" ns0:sz="4" ns0:val="single"/>
+              <ns0:right ns0:color="D9D9D9" ns0:sz="4" ns0:val="single"/>
             </ns0:tcBorders>
             <ns0:tcMar>
-              <ns0:top ns0:w="95" ns0:type="dxa"/>
-              <ns0:left ns0:w="95" ns0:type="dxa"/>
-              <ns0:bottom ns0:w="95" ns0:type="dxa"/>
-              <ns0:right ns0:w="95" ns0:type="dxa"/>
+              <ns0:top ns0:type="dxa" ns0:w="95"/>
+              <ns0:left ns0:type="dxa" ns0:w="95"/>
+              <ns0:bottom ns0:type="dxa" ns0:w="95"/>
+              <ns0:right ns0:type="dxa" ns0:w="95"/>
             </ns0:tcMar>
           </ns0:tcPr>
           <ns0:p>
@@ -1656,16 +1656,16 @@
             <ns0:vAlign ns0:val="center"/>
             <ns0:shd ns0:fill="FAFAFA"/>
             <ns0:tcBorders>
-              <ns0:top ns0:val="single" ns0:sz="4" ns0:color="D9D9D9"/>
-              <ns0:left ns0:val="single" ns0:sz="4" ns0:color="D9D9D9"/>
-              <ns0:bottom ns0:val="single" ns0:sz="4" ns0:color="D9D9D9"/>
-              <ns0:right ns0:val="single" ns0:sz="4" ns0:color="D9D9D9"/>
+              <ns0:top ns0:color="D9D9D9" ns0:sz="4" ns0:val="single"/>
+              <ns0:left ns0:color="D9D9D9" ns0:sz="4" ns0:val="single"/>
+              <ns0:bottom ns0:color="D9D9D9" ns0:sz="4" ns0:val="single"/>
+              <ns0:right ns0:color="D9D9D9" ns0:sz="4" ns0:val="single"/>
             </ns0:tcBorders>
             <ns0:tcMar>
-              <ns0:top ns0:w="95" ns0:type="dxa"/>
-              <ns0:left ns0:w="95" ns0:type="dxa"/>
-              <ns0:bottom ns0:w="95" ns0:type="dxa"/>
-              <ns0:right ns0:w="95" ns0:type="dxa"/>
+              <ns0:top ns0:type="dxa" ns0:w="95"/>
+              <ns0:left ns0:type="dxa" ns0:w="95"/>
+              <ns0:bottom ns0:type="dxa" ns0:w="95"/>
+              <ns0:right ns0:type="dxa" ns0:w="95"/>
             </ns0:tcMar>
           </ns0:tcPr>
           <ns0:p>
@@ -1689,16 +1689,16 @@
             <ns0:vAlign ns0:val="center"/>
             <ns0:shd ns0:fill="FAFAFA"/>
             <ns0:tcBorders>
-              <ns0:top ns0:val="single" ns0:sz="4" ns0:color="D9D9D9"/>
-              <ns0:left ns0:val="single" ns0:sz="4" ns0:color="D9D9D9"/>
-              <ns0:bottom ns0:val="single" ns0:sz="4" ns0:color="D9D9D9"/>
-              <ns0:right ns0:val="single" ns0:sz="4" ns0:color="D9D9D9"/>
+              <ns0:top ns0:color="D9D9D9" ns0:sz="4" ns0:val="single"/>
+              <ns0:left ns0:color="D9D9D9" ns0:sz="4" ns0:val="single"/>
+              <ns0:bottom ns0:color="D9D9D9" ns0:sz="4" ns0:val="single"/>
+              <ns0:right ns0:color="D9D9D9" ns0:sz="4" ns0:val="single"/>
             </ns0:tcBorders>
             <ns0:tcMar>
-              <ns0:top ns0:w="95" ns0:type="dxa"/>
-              <ns0:left ns0:w="95" ns0:type="dxa"/>
-              <ns0:bottom ns0:w="95" ns0:type="dxa"/>
-              <ns0:right ns0:w="95" ns0:type="dxa"/>
+              <ns0:top ns0:type="dxa" ns0:w="95"/>
+              <ns0:left ns0:type="dxa" ns0:w="95"/>
+              <ns0:bottom ns0:type="dxa" ns0:w="95"/>
+              <ns0:right ns0:type="dxa" ns0:w="95"/>
             </ns0:tcMar>
           </ns0:tcPr>
           <ns0:p>
@@ -1726,16 +1726,16 @@
             <ns0:tcW ns0:type="dxa" ns0:w="2608"/>
             <ns0:vAlign ns0:val="center"/>
             <ns0:tcBorders>
-              <ns0:top ns0:val="single" ns0:sz="4" ns0:color="D9D9D9"/>
-              <ns0:left ns0:val="single" ns0:sz="4" ns0:color="D9D9D9"/>
-              <ns0:bottom ns0:val="single" ns0:sz="4" ns0:color="D9D9D9"/>
-              <ns0:right ns0:val="single" ns0:sz="4" ns0:color="D9D9D9"/>
+              <ns0:top ns0:color="D9D9D9" ns0:sz="4" ns0:val="single"/>
+              <ns0:left ns0:color="D9D9D9" ns0:sz="4" ns0:val="single"/>
+              <ns0:bottom ns0:color="D9D9D9" ns0:sz="4" ns0:val="single"/>
+              <ns0:right ns0:color="D9D9D9" ns0:sz="4" ns0:val="single"/>
             </ns0:tcBorders>
             <ns0:tcMar>
-              <ns0:top ns0:w="95" ns0:type="dxa"/>
-              <ns0:left ns0:w="95" ns0:type="dxa"/>
-              <ns0:bottom ns0:w="95" ns0:type="dxa"/>
-              <ns0:right ns0:w="95" ns0:type="dxa"/>
+              <ns0:top ns0:type="dxa" ns0:w="95"/>
+              <ns0:left ns0:type="dxa" ns0:w="95"/>
+              <ns0:bottom ns0:type="dxa" ns0:w="95"/>
+              <ns0:right ns0:type="dxa" ns0:w="95"/>
             </ns0:tcMar>
           </ns0:tcPr>
           <ns0:p>
@@ -1758,16 +1758,16 @@
             <ns0:tcW ns0:type="dxa" ns0:w="6293"/>
             <ns0:vAlign ns0:val="center"/>
             <ns0:tcBorders>
-              <ns0:top ns0:val="single" ns0:sz="4" ns0:color="D9D9D9"/>
-              <ns0:left ns0:val="single" ns0:sz="4" ns0:color="D9D9D9"/>
-              <ns0:bottom ns0:val="single" ns0:sz="4" ns0:color="D9D9D9"/>
-              <ns0:right ns0:val="single" ns0:sz="4" ns0:color="D9D9D9"/>
+              <ns0:top ns0:color="D9D9D9" ns0:sz="4" ns0:val="single"/>
+              <ns0:left ns0:color="D9D9D9" ns0:sz="4" ns0:val="single"/>
+              <ns0:bottom ns0:color="D9D9D9" ns0:sz="4" ns0:val="single"/>
+              <ns0:right ns0:color="D9D9D9" ns0:sz="4" ns0:val="single"/>
             </ns0:tcBorders>
             <ns0:tcMar>
-              <ns0:top ns0:w="95" ns0:type="dxa"/>
-              <ns0:left ns0:w="95" ns0:type="dxa"/>
-              <ns0:bottom ns0:w="95" ns0:type="dxa"/>
-              <ns0:right ns0:w="95" ns0:type="dxa"/>
+              <ns0:top ns0:type="dxa" ns0:w="95"/>
+              <ns0:left ns0:type="dxa" ns0:w="95"/>
+              <ns0:bottom ns0:type="dxa" ns0:w="95"/>
+              <ns0:right ns0:type="dxa" ns0:w="95"/>
             </ns0:tcMar>
           </ns0:tcPr>
           <ns0:p>
@@ -1796,16 +1796,16 @@
             <ns0:vAlign ns0:val="center"/>
             <ns0:shd ns0:fill="FAFAFA"/>
             <ns0:tcBorders>
-              <ns0:top ns0:val="single" ns0:sz="4" ns0:color="D9D9D9"/>
-              <ns0:left ns0:val="single" ns0:sz="4" ns0:color="D9D9D9"/>
-              <ns0:bottom ns0:val="single" ns0:sz="4" ns0:color="D9D9D9"/>
-              <ns0:right ns0:val="single" ns0:sz="4" ns0:color="D9D9D9"/>
+              <ns0:top ns0:color="D9D9D9" ns0:sz="4" ns0:val="single"/>
+              <ns0:left ns0:color="D9D9D9" ns0:sz="4" ns0:val="single"/>
+              <ns0:bottom ns0:color="D9D9D9" ns0:sz="4" ns0:val="single"/>
+              <ns0:right ns0:color="D9D9D9" ns0:sz="4" ns0:val="single"/>
             </ns0:tcBorders>
             <ns0:tcMar>
-              <ns0:top ns0:w="95" ns0:type="dxa"/>
-              <ns0:left ns0:w="95" ns0:type="dxa"/>
-              <ns0:bottom ns0:w="95" ns0:type="dxa"/>
-              <ns0:right ns0:w="95" ns0:type="dxa"/>
+              <ns0:top ns0:type="dxa" ns0:w="95"/>
+              <ns0:left ns0:type="dxa" ns0:w="95"/>
+              <ns0:bottom ns0:type="dxa" ns0:w="95"/>
+              <ns0:right ns0:type="dxa" ns0:w="95"/>
             </ns0:tcMar>
           </ns0:tcPr>
           <ns0:p>
@@ -1829,16 +1829,16 @@
             <ns0:vAlign ns0:val="center"/>
             <ns0:shd ns0:fill="FAFAFA"/>
             <ns0:tcBorders>
-              <ns0:top ns0:val="single" ns0:sz="4" ns0:color="D9D9D9"/>
-              <ns0:left ns0:val="single" ns0:sz="4" ns0:color="D9D9D9"/>
-              <ns0:bottom ns0:val="single" ns0:sz="4" ns0:color="D9D9D9"/>
-              <ns0:right ns0:val="single" ns0:sz="4" ns0:color="D9D9D9"/>
+              <ns0:top ns0:color="D9D9D9" ns0:sz="4" ns0:val="single"/>
+              <ns0:left ns0:color="D9D9D9" ns0:sz="4" ns0:val="single"/>
+              <ns0:bottom ns0:color="D9D9D9" ns0:sz="4" ns0:val="single"/>
+              <ns0:right ns0:color="D9D9D9" ns0:sz="4" ns0:val="single"/>
             </ns0:tcBorders>
             <ns0:tcMar>
-              <ns0:top ns0:w="95" ns0:type="dxa"/>
-              <ns0:left ns0:w="95" ns0:type="dxa"/>
-              <ns0:bottom ns0:w="95" ns0:type="dxa"/>
-              <ns0:right ns0:w="95" ns0:type="dxa"/>
+              <ns0:top ns0:type="dxa" ns0:w="95"/>
+              <ns0:left ns0:type="dxa" ns0:w="95"/>
+              <ns0:bottom ns0:type="dxa" ns0:w="95"/>
+              <ns0:right ns0:type="dxa" ns0:w="95"/>
             </ns0:tcMar>
           </ns0:tcPr>
           <ns0:p>
@@ -1866,16 +1866,16 @@
             <ns0:tcW ns0:type="dxa" ns0:w="2608"/>
             <ns0:vAlign ns0:val="center"/>
             <ns0:tcBorders>
-              <ns0:top ns0:val="single" ns0:sz="4" ns0:color="D9D9D9"/>
-              <ns0:left ns0:val="single" ns0:sz="4" ns0:color="D9D9D9"/>
-              <ns0:bottom ns0:val="single" ns0:sz="4" ns0:color="D9D9D9"/>
-              <ns0:right ns0:val="single" ns0:sz="4" ns0:color="D9D9D9"/>
+              <ns0:top ns0:color="D9D9D9" ns0:sz="4" ns0:val="single"/>
+              <ns0:left ns0:color="D9D9D9" ns0:sz="4" ns0:val="single"/>
+              <ns0:bottom ns0:color="D9D9D9" ns0:sz="4" ns0:val="single"/>
+              <ns0:right ns0:color="D9D9D9" ns0:sz="4" ns0:val="single"/>
             </ns0:tcBorders>
             <ns0:tcMar>
-              <ns0:top ns0:w="95" ns0:type="dxa"/>
-              <ns0:left ns0:w="95" ns0:type="dxa"/>
-              <ns0:bottom ns0:w="95" ns0:type="dxa"/>
-              <ns0:right ns0:w="95" ns0:type="dxa"/>
+              <ns0:top ns0:type="dxa" ns0:w="95"/>
+              <ns0:left ns0:type="dxa" ns0:w="95"/>
+              <ns0:bottom ns0:type="dxa" ns0:w="95"/>
+              <ns0:right ns0:type="dxa" ns0:w="95"/>
             </ns0:tcMar>
           </ns0:tcPr>
           <ns0:p>
@@ -1898,16 +1898,16 @@
             <ns0:tcW ns0:type="dxa" ns0:w="6293"/>
             <ns0:vAlign ns0:val="center"/>
             <ns0:tcBorders>
-              <ns0:top ns0:val="single" ns0:sz="4" ns0:color="D9D9D9"/>
-              <ns0:left ns0:val="single" ns0:sz="4" ns0:color="D9D9D9"/>
-              <ns0:bottom ns0:val="single" ns0:sz="4" ns0:color="D9D9D9"/>
-              <ns0:right ns0:val="single" ns0:sz="4" ns0:color="D9D9D9"/>
+              <ns0:top ns0:color="D9D9D9" ns0:sz="4" ns0:val="single"/>
+              <ns0:left ns0:color="D9D9D9" ns0:sz="4" ns0:val="single"/>
+              <ns0:bottom ns0:color="D9D9D9" ns0:sz="4" ns0:val="single"/>
+              <ns0:right ns0:color="D9D9D9" ns0:sz="4" ns0:val="single"/>
             </ns0:tcBorders>
             <ns0:tcMar>
-              <ns0:top ns0:w="95" ns0:type="dxa"/>
-              <ns0:left ns0:w="95" ns0:type="dxa"/>
-              <ns0:bottom ns0:w="95" ns0:type="dxa"/>
-              <ns0:right ns0:w="95" ns0:type="dxa"/>
+              <ns0:top ns0:type="dxa" ns0:w="95"/>
+              <ns0:left ns0:type="dxa" ns0:w="95"/>
+              <ns0:bottom ns0:type="dxa" ns0:w="95"/>
+              <ns0:right ns0:type="dxa" ns0:w="95"/>
             </ns0:tcMar>
           </ns0:tcPr>
           <ns0:p>
@@ -1936,16 +1936,16 @@
             <ns0:vAlign ns0:val="center"/>
             <ns0:shd ns0:fill="FAFAFA"/>
             <ns0:tcBorders>
-              <ns0:top ns0:val="single" ns0:sz="4" ns0:color="D9D9D9"/>
-              <ns0:left ns0:val="single" ns0:sz="4" ns0:color="D9D9D9"/>
-              <ns0:bottom ns0:val="single" ns0:sz="4" ns0:color="D9D9D9"/>
-              <ns0:right ns0:val="single" ns0:sz="4" ns0:color="D9D9D9"/>
+              <ns0:top ns0:color="D9D9D9" ns0:sz="4" ns0:val="single"/>
+              <ns0:left ns0:color="D9D9D9" ns0:sz="4" ns0:val="single"/>
+              <ns0:bottom ns0:color="D9D9D9" ns0:sz="4" ns0:val="single"/>
+              <ns0:right ns0:color="D9D9D9" ns0:sz="4" ns0:val="single"/>
             </ns0:tcBorders>
             <ns0:tcMar>
-              <ns0:top ns0:w="95" ns0:type="dxa"/>
-              <ns0:left ns0:w="95" ns0:type="dxa"/>
-              <ns0:bottom ns0:w="95" ns0:type="dxa"/>
-              <ns0:right ns0:w="95" ns0:type="dxa"/>
+              <ns0:top ns0:type="dxa" ns0:w="95"/>
+              <ns0:left ns0:type="dxa" ns0:w="95"/>
+              <ns0:bottom ns0:type="dxa" ns0:w="95"/>
+              <ns0:right ns0:type="dxa" ns0:w="95"/>
             </ns0:tcMar>
           </ns0:tcPr>
           <ns0:p>
@@ -1969,16 +1969,16 @@
             <ns0:vAlign ns0:val="center"/>
             <ns0:shd ns0:fill="FAFAFA"/>
             <ns0:tcBorders>
-              <ns0:top ns0:val="single" ns0:sz="4" ns0:color="D9D9D9"/>
-              <ns0:left ns0:val="single" ns0:sz="4" ns0:color="D9D9D9"/>
-              <ns0:bottom ns0:val="single" ns0:sz="4" ns0:color="D9D9D9"/>
-              <ns0:right ns0:val="single" ns0:sz="4" ns0:color="D9D9D9"/>
+              <ns0:top ns0:color="D9D9D9" ns0:sz="4" ns0:val="single"/>
+              <ns0:left ns0:color="D9D9D9" ns0:sz="4" ns0:val="single"/>
+              <ns0:bottom ns0:color="D9D9D9" ns0:sz="4" ns0:val="single"/>
+              <ns0:right ns0:color="D9D9D9" ns0:sz="4" ns0:val="single"/>
             </ns0:tcBorders>
             <ns0:tcMar>
-              <ns0:top ns0:w="95" ns0:type="dxa"/>
-              <ns0:left ns0:w="95" ns0:type="dxa"/>
-              <ns0:bottom ns0:w="95" ns0:type="dxa"/>
-              <ns0:right ns0:w="95" ns0:type="dxa"/>
+              <ns0:top ns0:type="dxa" ns0:w="95"/>
+              <ns0:left ns0:type="dxa" ns0:w="95"/>
+              <ns0:bottom ns0:type="dxa" ns0:w="95"/>
+              <ns0:right ns0:type="dxa" ns0:w="95"/>
             </ns0:tcMar>
           </ns0:tcPr>
           <ns0:p>
@@ -2022,13 +2022,13 @@
     </ns0:p>
     <ns0:p>
       <ns0:r>
-        <ns0:t>Official documentation for three related systems was compared on nine common criteria [1–3, 16]. “Not established” denotes a documentation gap rather than proof of absence. No hands-on reliability test has yet been conducted.</ns0:t>
+        <ns0:t>Official documentation for three related systems was compared on nine common criteria [1–3, 16]. “Not established” denotes a documentation gap rather than proof of absence. This documentation review informs the proposed system scope and evaluation criteria.</ns0:t>
       </ns0:r>
     </ns0:p>
     <ns0:p>
       <ns0:pPr>
         <ns0:keepNext/>
-        <ns0:spacing ns0:before="160" ns0:after="80"/>
+        <ns0:spacing ns0:after="80" ns0:before="160"/>
         <ns0:ind ns0:firstLine="0"/>
         <ns0:jc ns0:val="left"/>
       </ns0:pPr>
@@ -2064,16 +2064,16 @@
             <ns0:vAlign ns0:val="center"/>
             <ns0:shd ns0:fill="F1F1F1"/>
             <ns0:tcBorders>
-              <ns0:top ns0:val="single" ns0:sz="4" ns0:color="D9D9D9"/>
-              <ns0:left ns0:val="single" ns0:sz="4" ns0:color="D9D9D9"/>
-              <ns0:bottom ns0:val="single" ns0:sz="4" ns0:color="D9D9D9"/>
-              <ns0:right ns0:val="single" ns0:sz="4" ns0:color="D9D9D9"/>
+              <ns0:top ns0:color="D9D9D9" ns0:sz="4" ns0:val="single"/>
+              <ns0:left ns0:color="D9D9D9" ns0:sz="4" ns0:val="single"/>
+              <ns0:bottom ns0:color="D9D9D9" ns0:sz="4" ns0:val="single"/>
+              <ns0:right ns0:color="D9D9D9" ns0:sz="4" ns0:val="single"/>
             </ns0:tcBorders>
             <ns0:tcMar>
-              <ns0:top ns0:w="95" ns0:type="dxa"/>
-              <ns0:left ns0:w="95" ns0:type="dxa"/>
-              <ns0:bottom ns0:w="95" ns0:type="dxa"/>
-              <ns0:right ns0:w="95" ns0:type="dxa"/>
+              <ns0:top ns0:type="dxa" ns0:w="95"/>
+              <ns0:left ns0:type="dxa" ns0:w="95"/>
+              <ns0:bottom ns0:type="dxa" ns0:w="95"/>
+              <ns0:right ns0:type="dxa" ns0:w="95"/>
             </ns0:tcMar>
           </ns0:tcPr>
           <ns0:p>
@@ -2098,16 +2098,16 @@
             <ns0:vAlign ns0:val="center"/>
             <ns0:shd ns0:fill="F1F1F1"/>
             <ns0:tcBorders>
-              <ns0:top ns0:val="single" ns0:sz="4" ns0:color="D9D9D9"/>
-              <ns0:left ns0:val="single" ns0:sz="4" ns0:color="D9D9D9"/>
-              <ns0:bottom ns0:val="single" ns0:sz="4" ns0:color="D9D9D9"/>
-              <ns0:right ns0:val="single" ns0:sz="4" ns0:color="D9D9D9"/>
+              <ns0:top ns0:color="D9D9D9" ns0:sz="4" ns0:val="single"/>
+              <ns0:left ns0:color="D9D9D9" ns0:sz="4" ns0:val="single"/>
+              <ns0:bottom ns0:color="D9D9D9" ns0:sz="4" ns0:val="single"/>
+              <ns0:right ns0:color="D9D9D9" ns0:sz="4" ns0:val="single"/>
             </ns0:tcBorders>
             <ns0:tcMar>
-              <ns0:top ns0:w="95" ns0:type="dxa"/>
-              <ns0:left ns0:w="95" ns0:type="dxa"/>
-              <ns0:bottom ns0:w="95" ns0:type="dxa"/>
-              <ns0:right ns0:w="95" ns0:type="dxa"/>
+              <ns0:top ns0:type="dxa" ns0:w="95"/>
+              <ns0:left ns0:type="dxa" ns0:w="95"/>
+              <ns0:bottom ns0:type="dxa" ns0:w="95"/>
+              <ns0:right ns0:type="dxa" ns0:w="95"/>
             </ns0:tcMar>
           </ns0:tcPr>
           <ns0:p>
@@ -2132,16 +2132,16 @@
             <ns0:vAlign ns0:val="center"/>
             <ns0:shd ns0:fill="F1F1F1"/>
             <ns0:tcBorders>
-              <ns0:top ns0:val="single" ns0:sz="4" ns0:color="D9D9D9"/>
-              <ns0:left ns0:val="single" ns0:sz="4" ns0:color="D9D9D9"/>
-              <ns0:bottom ns0:val="single" ns0:sz="4" ns0:color="D9D9D9"/>
-              <ns0:right ns0:val="single" ns0:sz="4" ns0:color="D9D9D9"/>
+              <ns0:top ns0:color="D9D9D9" ns0:sz="4" ns0:val="single"/>
+              <ns0:left ns0:color="D9D9D9" ns0:sz="4" ns0:val="single"/>
+              <ns0:bottom ns0:color="D9D9D9" ns0:sz="4" ns0:val="single"/>
+              <ns0:right ns0:color="D9D9D9" ns0:sz="4" ns0:val="single"/>
             </ns0:tcBorders>
             <ns0:tcMar>
-              <ns0:top ns0:w="95" ns0:type="dxa"/>
-              <ns0:left ns0:w="95" ns0:type="dxa"/>
-              <ns0:bottom ns0:w="95" ns0:type="dxa"/>
-              <ns0:right ns0:w="95" ns0:type="dxa"/>
+              <ns0:top ns0:type="dxa" ns0:w="95"/>
+              <ns0:left ns0:type="dxa" ns0:w="95"/>
+              <ns0:bottom ns0:type="dxa" ns0:w="95"/>
+              <ns0:right ns0:type="dxa" ns0:w="95"/>
             </ns0:tcMar>
           </ns0:tcPr>
           <ns0:p>
@@ -2168,16 +2168,16 @@
             <ns0:vAlign ns0:val="center"/>
             <ns0:shd ns0:fill="F1F1F1"/>
             <ns0:tcBorders>
-              <ns0:top ns0:val="single" ns0:sz="4" ns0:color="D9D9D9"/>
-              <ns0:left ns0:val="single" ns0:sz="4" ns0:color="D9D9D9"/>
-              <ns0:bottom ns0:val="single" ns0:sz="4" ns0:color="D9D9D9"/>
-              <ns0:right ns0:val="single" ns0:sz="4" ns0:color="D9D9D9"/>
+              <ns0:top ns0:color="D9D9D9" ns0:sz="4" ns0:val="single"/>
+              <ns0:left ns0:color="D9D9D9" ns0:sz="4" ns0:val="single"/>
+              <ns0:bottom ns0:color="D9D9D9" ns0:sz="4" ns0:val="single"/>
+              <ns0:right ns0:color="D9D9D9" ns0:sz="4" ns0:val="single"/>
             </ns0:tcBorders>
             <ns0:tcMar>
-              <ns0:top ns0:w="95" ns0:type="dxa"/>
-              <ns0:left ns0:w="95" ns0:type="dxa"/>
-              <ns0:bottom ns0:w="95" ns0:type="dxa"/>
-              <ns0:right ns0:w="95" ns0:type="dxa"/>
+              <ns0:top ns0:type="dxa" ns0:w="95"/>
+              <ns0:left ns0:type="dxa" ns0:w="95"/>
+              <ns0:bottom ns0:type="dxa" ns0:w="95"/>
+              <ns0:right ns0:type="dxa" ns0:w="95"/>
             </ns0:tcMar>
           </ns0:tcPr>
           <ns0:p>
@@ -2206,16 +2206,16 @@
             <ns0:tcW ns0:type="dxa" ns0:w="1814"/>
             <ns0:vAlign ns0:val="center"/>
             <ns0:tcBorders>
-              <ns0:top ns0:val="single" ns0:sz="4" ns0:color="D9D9D9"/>
-              <ns0:left ns0:val="single" ns0:sz="4" ns0:color="D9D9D9"/>
-              <ns0:bottom ns0:val="single" ns0:sz="4" ns0:color="D9D9D9"/>
-              <ns0:right ns0:val="single" ns0:sz="4" ns0:color="D9D9D9"/>
+              <ns0:top ns0:color="D9D9D9" ns0:sz="4" ns0:val="single"/>
+              <ns0:left ns0:color="D9D9D9" ns0:sz="4" ns0:val="single"/>
+              <ns0:bottom ns0:color="D9D9D9" ns0:sz="4" ns0:val="single"/>
+              <ns0:right ns0:color="D9D9D9" ns0:sz="4" ns0:val="single"/>
             </ns0:tcBorders>
             <ns0:tcMar>
-              <ns0:top ns0:w="95" ns0:type="dxa"/>
-              <ns0:left ns0:w="95" ns0:type="dxa"/>
-              <ns0:bottom ns0:w="95" ns0:type="dxa"/>
-              <ns0:right ns0:w="95" ns0:type="dxa"/>
+              <ns0:top ns0:type="dxa" ns0:w="95"/>
+              <ns0:left ns0:type="dxa" ns0:w="95"/>
+              <ns0:bottom ns0:type="dxa" ns0:w="95"/>
+              <ns0:right ns0:type="dxa" ns0:w="95"/>
             </ns0:tcMar>
           </ns0:tcPr>
           <ns0:p>
@@ -2238,16 +2238,16 @@
             <ns0:tcW ns0:type="dxa" ns0:w="2324"/>
             <ns0:vAlign ns0:val="center"/>
             <ns0:tcBorders>
-              <ns0:top ns0:val="single" ns0:sz="4" ns0:color="D9D9D9"/>
-              <ns0:left ns0:val="single" ns0:sz="4" ns0:color="D9D9D9"/>
-              <ns0:bottom ns0:val="single" ns0:sz="4" ns0:color="D9D9D9"/>
-              <ns0:right ns0:val="single" ns0:sz="4" ns0:color="D9D9D9"/>
+              <ns0:top ns0:color="D9D9D9" ns0:sz="4" ns0:val="single"/>
+              <ns0:left ns0:color="D9D9D9" ns0:sz="4" ns0:val="single"/>
+              <ns0:bottom ns0:color="D9D9D9" ns0:sz="4" ns0:val="single"/>
+              <ns0:right ns0:color="D9D9D9" ns0:sz="4" ns0:val="single"/>
             </ns0:tcBorders>
             <ns0:tcMar>
-              <ns0:top ns0:w="95" ns0:type="dxa"/>
-              <ns0:left ns0:w="95" ns0:type="dxa"/>
-              <ns0:bottom ns0:w="95" ns0:type="dxa"/>
-              <ns0:right ns0:w="95" ns0:type="dxa"/>
+              <ns0:top ns0:type="dxa" ns0:w="95"/>
+              <ns0:left ns0:type="dxa" ns0:w="95"/>
+              <ns0:bottom ns0:type="dxa" ns0:w="95"/>
+              <ns0:right ns0:type="dxa" ns0:w="95"/>
             </ns0:tcMar>
           </ns0:tcPr>
           <ns0:p>
@@ -2270,16 +2270,16 @@
             <ns0:tcW ns0:type="dxa" ns0:w="2381"/>
             <ns0:vAlign ns0:val="center"/>
             <ns0:tcBorders>
-              <ns0:top ns0:val="single" ns0:sz="4" ns0:color="D9D9D9"/>
-              <ns0:left ns0:val="single" ns0:sz="4" ns0:color="D9D9D9"/>
-              <ns0:bottom ns0:val="single" ns0:sz="4" ns0:color="D9D9D9"/>
-              <ns0:right ns0:val="single" ns0:sz="4" ns0:color="D9D9D9"/>
+              <ns0:top ns0:color="D9D9D9" ns0:sz="4" ns0:val="single"/>
+              <ns0:left ns0:color="D9D9D9" ns0:sz="4" ns0:val="single"/>
+              <ns0:bottom ns0:color="D9D9D9" ns0:sz="4" ns0:val="single"/>
+              <ns0:right ns0:color="D9D9D9" ns0:sz="4" ns0:val="single"/>
             </ns0:tcBorders>
             <ns0:tcMar>
-              <ns0:top ns0:w="95" ns0:type="dxa"/>
-              <ns0:left ns0:w="95" ns0:type="dxa"/>
-              <ns0:bottom ns0:w="95" ns0:type="dxa"/>
-              <ns0:right ns0:w="95" ns0:type="dxa"/>
+              <ns0:top ns0:type="dxa" ns0:w="95"/>
+              <ns0:left ns0:type="dxa" ns0:w="95"/>
+              <ns0:bottom ns0:type="dxa" ns0:w="95"/>
+              <ns0:right ns0:type="dxa" ns0:w="95"/>
             </ns0:tcMar>
           </ns0:tcPr>
           <ns0:p>
@@ -2302,16 +2302,16 @@
             <ns0:tcW ns0:type="dxa" ns0:w="2381"/>
             <ns0:vAlign ns0:val="center"/>
             <ns0:tcBorders>
-              <ns0:top ns0:val="single" ns0:sz="4" ns0:color="D9D9D9"/>
-              <ns0:left ns0:val="single" ns0:sz="4" ns0:color="D9D9D9"/>
-              <ns0:bottom ns0:val="single" ns0:sz="4" ns0:color="D9D9D9"/>
-              <ns0:right ns0:val="single" ns0:sz="4" ns0:color="D9D9D9"/>
+              <ns0:top ns0:color="D9D9D9" ns0:sz="4" ns0:val="single"/>
+              <ns0:left ns0:color="D9D9D9" ns0:sz="4" ns0:val="single"/>
+              <ns0:bottom ns0:color="D9D9D9" ns0:sz="4" ns0:val="single"/>
+              <ns0:right ns0:color="D9D9D9" ns0:sz="4" ns0:val="single"/>
             </ns0:tcBorders>
             <ns0:tcMar>
-              <ns0:top ns0:w="95" ns0:type="dxa"/>
-              <ns0:left ns0:w="95" ns0:type="dxa"/>
-              <ns0:bottom ns0:w="95" ns0:type="dxa"/>
-              <ns0:right ns0:w="95" ns0:type="dxa"/>
+              <ns0:top ns0:type="dxa" ns0:w="95"/>
+              <ns0:left ns0:type="dxa" ns0:w="95"/>
+              <ns0:bottom ns0:type="dxa" ns0:w="95"/>
+              <ns0:right ns0:type="dxa" ns0:w="95"/>
             </ns0:tcMar>
           </ns0:tcPr>
           <ns0:p>
@@ -2340,16 +2340,16 @@
             <ns0:vAlign ns0:val="center"/>
             <ns0:shd ns0:fill="FAFAFA"/>
             <ns0:tcBorders>
-              <ns0:top ns0:val="single" ns0:sz="4" ns0:color="D9D9D9"/>
-              <ns0:left ns0:val="single" ns0:sz="4" ns0:color="D9D9D9"/>
-              <ns0:bottom ns0:val="single" ns0:sz="4" ns0:color="D9D9D9"/>
-              <ns0:right ns0:val="single" ns0:sz="4" ns0:color="D9D9D9"/>
+              <ns0:top ns0:color="D9D9D9" ns0:sz="4" ns0:val="single"/>
+              <ns0:left ns0:color="D9D9D9" ns0:sz="4" ns0:val="single"/>
+              <ns0:bottom ns0:color="D9D9D9" ns0:sz="4" ns0:val="single"/>
+              <ns0:right ns0:color="D9D9D9" ns0:sz="4" ns0:val="single"/>
             </ns0:tcBorders>
             <ns0:tcMar>
-              <ns0:top ns0:w="95" ns0:type="dxa"/>
-              <ns0:left ns0:w="95" ns0:type="dxa"/>
-              <ns0:bottom ns0:w="95" ns0:type="dxa"/>
-              <ns0:right ns0:w="95" ns0:type="dxa"/>
+              <ns0:top ns0:type="dxa" ns0:w="95"/>
+              <ns0:left ns0:type="dxa" ns0:w="95"/>
+              <ns0:bottom ns0:type="dxa" ns0:w="95"/>
+              <ns0:right ns0:type="dxa" ns0:w="95"/>
             </ns0:tcMar>
           </ns0:tcPr>
           <ns0:p>
@@ -2373,16 +2373,16 @@
             <ns0:vAlign ns0:val="center"/>
             <ns0:shd ns0:fill="FAFAFA"/>
             <ns0:tcBorders>
-              <ns0:top ns0:val="single" ns0:sz="4" ns0:color="D9D9D9"/>
-              <ns0:left ns0:val="single" ns0:sz="4" ns0:color="D9D9D9"/>
-              <ns0:bottom ns0:val="single" ns0:sz="4" ns0:color="D9D9D9"/>
-              <ns0:right ns0:val="single" ns0:sz="4" ns0:color="D9D9D9"/>
+              <ns0:top ns0:color="D9D9D9" ns0:sz="4" ns0:val="single"/>
+              <ns0:left ns0:color="D9D9D9" ns0:sz="4" ns0:val="single"/>
+              <ns0:bottom ns0:color="D9D9D9" ns0:sz="4" ns0:val="single"/>
+              <ns0:right ns0:color="D9D9D9" ns0:sz="4" ns0:val="single"/>
             </ns0:tcBorders>
             <ns0:tcMar>
-              <ns0:top ns0:w="95" ns0:type="dxa"/>
-              <ns0:left ns0:w="95" ns0:type="dxa"/>
-              <ns0:bottom ns0:w="95" ns0:type="dxa"/>
-              <ns0:right ns0:w="95" ns0:type="dxa"/>
+              <ns0:top ns0:type="dxa" ns0:w="95"/>
+              <ns0:left ns0:type="dxa" ns0:w="95"/>
+              <ns0:bottom ns0:type="dxa" ns0:w="95"/>
+              <ns0:right ns0:type="dxa" ns0:w="95"/>
             </ns0:tcMar>
           </ns0:tcPr>
           <ns0:p>
@@ -2406,16 +2406,16 @@
             <ns0:vAlign ns0:val="center"/>
             <ns0:shd ns0:fill="FAFAFA"/>
             <ns0:tcBorders>
-              <ns0:top ns0:val="single" ns0:sz="4" ns0:color="D9D9D9"/>
-              <ns0:left ns0:val="single" ns0:sz="4" ns0:color="D9D9D9"/>
-              <ns0:bottom ns0:val="single" ns0:sz="4" ns0:color="D9D9D9"/>
-              <ns0:right ns0:val="single" ns0:sz="4" ns0:color="D9D9D9"/>
+              <ns0:top ns0:color="D9D9D9" ns0:sz="4" ns0:val="single"/>
+              <ns0:left ns0:color="D9D9D9" ns0:sz="4" ns0:val="single"/>
+              <ns0:bottom ns0:color="D9D9D9" ns0:sz="4" ns0:val="single"/>
+              <ns0:right ns0:color="D9D9D9" ns0:sz="4" ns0:val="single"/>
             </ns0:tcBorders>
             <ns0:tcMar>
-              <ns0:top ns0:w="95" ns0:type="dxa"/>
-              <ns0:left ns0:w="95" ns0:type="dxa"/>
-              <ns0:bottom ns0:w="95" ns0:type="dxa"/>
-              <ns0:right ns0:w="95" ns0:type="dxa"/>
+              <ns0:top ns0:type="dxa" ns0:w="95"/>
+              <ns0:left ns0:type="dxa" ns0:w="95"/>
+              <ns0:bottom ns0:type="dxa" ns0:w="95"/>
+              <ns0:right ns0:type="dxa" ns0:w="95"/>
             </ns0:tcMar>
           </ns0:tcPr>
           <ns0:p>
@@ -2439,16 +2439,16 @@
             <ns0:vAlign ns0:val="center"/>
             <ns0:shd ns0:fill="FAFAFA"/>
             <ns0:tcBorders>
-              <ns0:top ns0:val="single" ns0:sz="4" ns0:color="D9D9D9"/>
-              <ns0:left ns0:val="single" ns0:sz="4" ns0:color="D9D9D9"/>
-              <ns0:bottom ns0:val="single" ns0:sz="4" ns0:color="D9D9D9"/>
-              <ns0:right ns0:val="single" ns0:sz="4" ns0:color="D9D9D9"/>
+              <ns0:top ns0:color="D9D9D9" ns0:sz="4" ns0:val="single"/>
+              <ns0:left ns0:color="D9D9D9" ns0:sz="4" ns0:val="single"/>
+              <ns0:bottom ns0:color="D9D9D9" ns0:sz="4" ns0:val="single"/>
+              <ns0:right ns0:color="D9D9D9" ns0:sz="4" ns0:val="single"/>
             </ns0:tcBorders>
             <ns0:tcMar>
-              <ns0:top ns0:w="95" ns0:type="dxa"/>
-              <ns0:left ns0:w="95" ns0:type="dxa"/>
-              <ns0:bottom ns0:w="95" ns0:type="dxa"/>
-              <ns0:right ns0:w="95" ns0:type="dxa"/>
+              <ns0:top ns0:type="dxa" ns0:w="95"/>
+              <ns0:left ns0:type="dxa" ns0:w="95"/>
+              <ns0:bottom ns0:type="dxa" ns0:w="95"/>
+              <ns0:right ns0:type="dxa" ns0:w="95"/>
             </ns0:tcMar>
           </ns0:tcPr>
           <ns0:p>
@@ -2476,16 +2476,16 @@
             <ns0:tcW ns0:type="dxa" ns0:w="1814"/>
             <ns0:vAlign ns0:val="center"/>
             <ns0:tcBorders>
-              <ns0:top ns0:val="single" ns0:sz="4" ns0:color="D9D9D9"/>
-              <ns0:left ns0:val="single" ns0:sz="4" ns0:color="D9D9D9"/>
-              <ns0:bottom ns0:val="single" ns0:sz="4" ns0:color="D9D9D9"/>
-              <ns0:right ns0:val="single" ns0:sz="4" ns0:color="D9D9D9"/>
+              <ns0:top ns0:color="D9D9D9" ns0:sz="4" ns0:val="single"/>
+              <ns0:left ns0:color="D9D9D9" ns0:sz="4" ns0:val="single"/>
+              <ns0:bottom ns0:color="D9D9D9" ns0:sz="4" ns0:val="single"/>
+              <ns0:right ns0:color="D9D9D9" ns0:sz="4" ns0:val="single"/>
             </ns0:tcBorders>
             <ns0:tcMar>
-              <ns0:top ns0:w="95" ns0:type="dxa"/>
-              <ns0:left ns0:w="95" ns0:type="dxa"/>
-              <ns0:bottom ns0:w="95" ns0:type="dxa"/>
-              <ns0:right ns0:w="95" ns0:type="dxa"/>
+              <ns0:top ns0:type="dxa" ns0:w="95"/>
+              <ns0:left ns0:type="dxa" ns0:w="95"/>
+              <ns0:bottom ns0:type="dxa" ns0:w="95"/>
+              <ns0:right ns0:type="dxa" ns0:w="95"/>
             </ns0:tcMar>
           </ns0:tcPr>
           <ns0:p>
@@ -2508,16 +2508,16 @@
             <ns0:tcW ns0:type="dxa" ns0:w="2324"/>
             <ns0:vAlign ns0:val="center"/>
             <ns0:tcBorders>
-              <ns0:top ns0:val="single" ns0:sz="4" ns0:color="D9D9D9"/>
-              <ns0:left ns0:val="single" ns0:sz="4" ns0:color="D9D9D9"/>
-              <ns0:bottom ns0:val="single" ns0:sz="4" ns0:color="D9D9D9"/>
-              <ns0:right ns0:val="single" ns0:sz="4" ns0:color="D9D9D9"/>
+              <ns0:top ns0:color="D9D9D9" ns0:sz="4" ns0:val="single"/>
+              <ns0:left ns0:color="D9D9D9" ns0:sz="4" ns0:val="single"/>
+              <ns0:bottom ns0:color="D9D9D9" ns0:sz="4" ns0:val="single"/>
+              <ns0:right ns0:color="D9D9D9" ns0:sz="4" ns0:val="single"/>
             </ns0:tcBorders>
             <ns0:tcMar>
-              <ns0:top ns0:w="95" ns0:type="dxa"/>
-              <ns0:left ns0:w="95" ns0:type="dxa"/>
-              <ns0:bottom ns0:w="95" ns0:type="dxa"/>
-              <ns0:right ns0:w="95" ns0:type="dxa"/>
+              <ns0:top ns0:type="dxa" ns0:w="95"/>
+              <ns0:left ns0:type="dxa" ns0:w="95"/>
+              <ns0:bottom ns0:type="dxa" ns0:w="95"/>
+              <ns0:right ns0:type="dxa" ns0:w="95"/>
             </ns0:tcMar>
           </ns0:tcPr>
           <ns0:p>
@@ -2540,16 +2540,16 @@
             <ns0:tcW ns0:type="dxa" ns0:w="2381"/>
             <ns0:vAlign ns0:val="center"/>
             <ns0:tcBorders>
-              <ns0:top ns0:val="single" ns0:sz="4" ns0:color="D9D9D9"/>
-              <ns0:left ns0:val="single" ns0:sz="4" ns0:color="D9D9D9"/>
-              <ns0:bottom ns0:val="single" ns0:sz="4" ns0:color="D9D9D9"/>
-              <ns0:right ns0:val="single" ns0:sz="4" ns0:color="D9D9D9"/>
+              <ns0:top ns0:color="D9D9D9" ns0:sz="4" ns0:val="single"/>
+              <ns0:left ns0:color="D9D9D9" ns0:sz="4" ns0:val="single"/>
+              <ns0:bottom ns0:color="D9D9D9" ns0:sz="4" ns0:val="single"/>
+              <ns0:right ns0:color="D9D9D9" ns0:sz="4" ns0:val="single"/>
             </ns0:tcBorders>
             <ns0:tcMar>
-              <ns0:top ns0:w="95" ns0:type="dxa"/>
-              <ns0:left ns0:w="95" ns0:type="dxa"/>
-              <ns0:bottom ns0:w="95" ns0:type="dxa"/>
-              <ns0:right ns0:w="95" ns0:type="dxa"/>
+              <ns0:top ns0:type="dxa" ns0:w="95"/>
+              <ns0:left ns0:type="dxa" ns0:w="95"/>
+              <ns0:bottom ns0:type="dxa" ns0:w="95"/>
+              <ns0:right ns0:type="dxa" ns0:w="95"/>
             </ns0:tcMar>
           </ns0:tcPr>
           <ns0:p>
@@ -2572,16 +2572,16 @@
             <ns0:tcW ns0:type="dxa" ns0:w="2381"/>
             <ns0:vAlign ns0:val="center"/>
             <ns0:tcBorders>
-              <ns0:top ns0:val="single" ns0:sz="4" ns0:color="D9D9D9"/>
-              <ns0:left ns0:val="single" ns0:sz="4" ns0:color="D9D9D9"/>
-              <ns0:bottom ns0:val="single" ns0:sz="4" ns0:color="D9D9D9"/>
-              <ns0:right ns0:val="single" ns0:sz="4" ns0:color="D9D9D9"/>
+              <ns0:top ns0:color="D9D9D9" ns0:sz="4" ns0:val="single"/>
+              <ns0:left ns0:color="D9D9D9" ns0:sz="4" ns0:val="single"/>
+              <ns0:bottom ns0:color="D9D9D9" ns0:sz="4" ns0:val="single"/>
+              <ns0:right ns0:color="D9D9D9" ns0:sz="4" ns0:val="single"/>
             </ns0:tcBorders>
             <ns0:tcMar>
-              <ns0:top ns0:w="95" ns0:type="dxa"/>
-              <ns0:left ns0:w="95" ns0:type="dxa"/>
-              <ns0:bottom ns0:w="95" ns0:type="dxa"/>
-              <ns0:right ns0:w="95" ns0:type="dxa"/>
+              <ns0:top ns0:type="dxa" ns0:w="95"/>
+              <ns0:left ns0:type="dxa" ns0:w="95"/>
+              <ns0:bottom ns0:type="dxa" ns0:w="95"/>
+              <ns0:right ns0:type="dxa" ns0:w="95"/>
             </ns0:tcMar>
           </ns0:tcPr>
           <ns0:p>
@@ -2610,16 +2610,16 @@
             <ns0:vAlign ns0:val="center"/>
             <ns0:shd ns0:fill="FAFAFA"/>
             <ns0:tcBorders>
-              <ns0:top ns0:val="single" ns0:sz="4" ns0:color="D9D9D9"/>
-              <ns0:left ns0:val="single" ns0:sz="4" ns0:color="D9D9D9"/>
-              <ns0:bottom ns0:val="single" ns0:sz="4" ns0:color="D9D9D9"/>
-              <ns0:right ns0:val="single" ns0:sz="4" ns0:color="D9D9D9"/>
+              <ns0:top ns0:color="D9D9D9" ns0:sz="4" ns0:val="single"/>
+              <ns0:left ns0:color="D9D9D9" ns0:sz="4" ns0:val="single"/>
+              <ns0:bottom ns0:color="D9D9D9" ns0:sz="4" ns0:val="single"/>
+              <ns0:right ns0:color="D9D9D9" ns0:sz="4" ns0:val="single"/>
             </ns0:tcBorders>
             <ns0:tcMar>
-              <ns0:top ns0:w="95" ns0:type="dxa"/>
-              <ns0:left ns0:w="95" ns0:type="dxa"/>
-              <ns0:bottom ns0:w="95" ns0:type="dxa"/>
-              <ns0:right ns0:w="95" ns0:type="dxa"/>
+              <ns0:top ns0:type="dxa" ns0:w="95"/>
+              <ns0:left ns0:type="dxa" ns0:w="95"/>
+              <ns0:bottom ns0:type="dxa" ns0:w="95"/>
+              <ns0:right ns0:type="dxa" ns0:w="95"/>
             </ns0:tcMar>
           </ns0:tcPr>
           <ns0:p>
@@ -2643,16 +2643,16 @@
             <ns0:vAlign ns0:val="center"/>
             <ns0:shd ns0:fill="FAFAFA"/>
             <ns0:tcBorders>
-              <ns0:top ns0:val="single" ns0:sz="4" ns0:color="D9D9D9"/>
-              <ns0:left ns0:val="single" ns0:sz="4" ns0:color="D9D9D9"/>
-              <ns0:bottom ns0:val="single" ns0:sz="4" ns0:color="D9D9D9"/>
-              <ns0:right ns0:val="single" ns0:sz="4" ns0:color="D9D9D9"/>
+              <ns0:top ns0:color="D9D9D9" ns0:sz="4" ns0:val="single"/>
+              <ns0:left ns0:color="D9D9D9" ns0:sz="4" ns0:val="single"/>
+              <ns0:bottom ns0:color="D9D9D9" ns0:sz="4" ns0:val="single"/>
+              <ns0:right ns0:color="D9D9D9" ns0:sz="4" ns0:val="single"/>
             </ns0:tcBorders>
             <ns0:tcMar>
-              <ns0:top ns0:w="95" ns0:type="dxa"/>
-              <ns0:left ns0:w="95" ns0:type="dxa"/>
-              <ns0:bottom ns0:w="95" ns0:type="dxa"/>
-              <ns0:right ns0:w="95" ns0:type="dxa"/>
+              <ns0:top ns0:type="dxa" ns0:w="95"/>
+              <ns0:left ns0:type="dxa" ns0:w="95"/>
+              <ns0:bottom ns0:type="dxa" ns0:w="95"/>
+              <ns0:right ns0:type="dxa" ns0:w="95"/>
             </ns0:tcMar>
           </ns0:tcPr>
           <ns0:p>
@@ -2676,16 +2676,16 @@
             <ns0:vAlign ns0:val="center"/>
             <ns0:shd ns0:fill="FAFAFA"/>
             <ns0:tcBorders>
-              <ns0:top ns0:val="single" ns0:sz="4" ns0:color="D9D9D9"/>
-              <ns0:left ns0:val="single" ns0:sz="4" ns0:color="D9D9D9"/>
-              <ns0:bottom ns0:val="single" ns0:sz="4" ns0:color="D9D9D9"/>
-              <ns0:right ns0:val="single" ns0:sz="4" ns0:color="D9D9D9"/>
+              <ns0:top ns0:color="D9D9D9" ns0:sz="4" ns0:val="single"/>
+              <ns0:left ns0:color="D9D9D9" ns0:sz="4" ns0:val="single"/>
+              <ns0:bottom ns0:color="D9D9D9" ns0:sz="4" ns0:val="single"/>
+              <ns0:right ns0:color="D9D9D9" ns0:sz="4" ns0:val="single"/>
             </ns0:tcBorders>
             <ns0:tcMar>
-              <ns0:top ns0:w="95" ns0:type="dxa"/>
-              <ns0:left ns0:w="95" ns0:type="dxa"/>
-              <ns0:bottom ns0:w="95" ns0:type="dxa"/>
-              <ns0:right ns0:w="95" ns0:type="dxa"/>
+              <ns0:top ns0:type="dxa" ns0:w="95"/>
+              <ns0:left ns0:type="dxa" ns0:w="95"/>
+              <ns0:bottom ns0:type="dxa" ns0:w="95"/>
+              <ns0:right ns0:type="dxa" ns0:w="95"/>
             </ns0:tcMar>
           </ns0:tcPr>
           <ns0:p>
@@ -2709,16 +2709,16 @@
             <ns0:vAlign ns0:val="center"/>
             <ns0:shd ns0:fill="FAFAFA"/>
             <ns0:tcBorders>
-              <ns0:top ns0:val="single" ns0:sz="4" ns0:color="D9D9D9"/>
-              <ns0:left ns0:val="single" ns0:sz="4" ns0:color="D9D9D9"/>
-              <ns0:bottom ns0:val="single" ns0:sz="4" ns0:color="D9D9D9"/>
-              <ns0:right ns0:val="single" ns0:sz="4" ns0:color="D9D9D9"/>
+              <ns0:top ns0:color="D9D9D9" ns0:sz="4" ns0:val="single"/>
+              <ns0:left ns0:color="D9D9D9" ns0:sz="4" ns0:val="single"/>
+              <ns0:bottom ns0:color="D9D9D9" ns0:sz="4" ns0:val="single"/>
+              <ns0:right ns0:color="D9D9D9" ns0:sz="4" ns0:val="single"/>
             </ns0:tcBorders>
             <ns0:tcMar>
-              <ns0:top ns0:w="95" ns0:type="dxa"/>
-              <ns0:left ns0:w="95" ns0:type="dxa"/>
-              <ns0:bottom ns0:w="95" ns0:type="dxa"/>
-              <ns0:right ns0:w="95" ns0:type="dxa"/>
+              <ns0:top ns0:type="dxa" ns0:w="95"/>
+              <ns0:left ns0:type="dxa" ns0:w="95"/>
+              <ns0:bottom ns0:type="dxa" ns0:w="95"/>
+              <ns0:right ns0:type="dxa" ns0:w="95"/>
             </ns0:tcMar>
           </ns0:tcPr>
           <ns0:p>
@@ -2746,16 +2746,16 @@
             <ns0:tcW ns0:type="dxa" ns0:w="1814"/>
             <ns0:vAlign ns0:val="center"/>
             <ns0:tcBorders>
-              <ns0:top ns0:val="single" ns0:sz="4" ns0:color="D9D9D9"/>
-              <ns0:left ns0:val="single" ns0:sz="4" ns0:color="D9D9D9"/>
-              <ns0:bottom ns0:val="single" ns0:sz="4" ns0:color="D9D9D9"/>
-              <ns0:right ns0:val="single" ns0:sz="4" ns0:color="D9D9D9"/>
+              <ns0:top ns0:color="D9D9D9" ns0:sz="4" ns0:val="single"/>
+              <ns0:left ns0:color="D9D9D9" ns0:sz="4" ns0:val="single"/>
+              <ns0:bottom ns0:color="D9D9D9" ns0:sz="4" ns0:val="single"/>
+              <ns0:right ns0:color="D9D9D9" ns0:sz="4" ns0:val="single"/>
             </ns0:tcBorders>
             <ns0:tcMar>
-              <ns0:top ns0:w="95" ns0:type="dxa"/>
-              <ns0:left ns0:w="95" ns0:type="dxa"/>
-              <ns0:bottom ns0:w="95" ns0:type="dxa"/>
-              <ns0:right ns0:w="95" ns0:type="dxa"/>
+              <ns0:top ns0:type="dxa" ns0:w="95"/>
+              <ns0:left ns0:type="dxa" ns0:w="95"/>
+              <ns0:bottom ns0:type="dxa" ns0:w="95"/>
+              <ns0:right ns0:type="dxa" ns0:w="95"/>
             </ns0:tcMar>
           </ns0:tcPr>
           <ns0:p>
@@ -2778,16 +2778,16 @@
             <ns0:tcW ns0:type="dxa" ns0:w="2324"/>
             <ns0:vAlign ns0:val="center"/>
             <ns0:tcBorders>
-              <ns0:top ns0:val="single" ns0:sz="4" ns0:color="D9D9D9"/>
-              <ns0:left ns0:val="single" ns0:sz="4" ns0:color="D9D9D9"/>
-              <ns0:bottom ns0:val="single" ns0:sz="4" ns0:color="D9D9D9"/>
-              <ns0:right ns0:val="single" ns0:sz="4" ns0:color="D9D9D9"/>
+              <ns0:top ns0:color="D9D9D9" ns0:sz="4" ns0:val="single"/>
+              <ns0:left ns0:color="D9D9D9" ns0:sz="4" ns0:val="single"/>
+              <ns0:bottom ns0:color="D9D9D9" ns0:sz="4" ns0:val="single"/>
+              <ns0:right ns0:color="D9D9D9" ns0:sz="4" ns0:val="single"/>
             </ns0:tcBorders>
             <ns0:tcMar>
-              <ns0:top ns0:w="95" ns0:type="dxa"/>
-              <ns0:left ns0:w="95" ns0:type="dxa"/>
-              <ns0:bottom ns0:w="95" ns0:type="dxa"/>
-              <ns0:right ns0:w="95" ns0:type="dxa"/>
+              <ns0:top ns0:type="dxa" ns0:w="95"/>
+              <ns0:left ns0:type="dxa" ns0:w="95"/>
+              <ns0:bottom ns0:type="dxa" ns0:w="95"/>
+              <ns0:right ns0:type="dxa" ns0:w="95"/>
             </ns0:tcMar>
           </ns0:tcPr>
           <ns0:p>
@@ -2810,16 +2810,16 @@
             <ns0:tcW ns0:type="dxa" ns0:w="2381"/>
             <ns0:vAlign ns0:val="center"/>
             <ns0:tcBorders>
-              <ns0:top ns0:val="single" ns0:sz="4" ns0:color="D9D9D9"/>
-              <ns0:left ns0:val="single" ns0:sz="4" ns0:color="D9D9D9"/>
-              <ns0:bottom ns0:val="single" ns0:sz="4" ns0:color="D9D9D9"/>
-              <ns0:right ns0:val="single" ns0:sz="4" ns0:color="D9D9D9"/>
+              <ns0:top ns0:color="D9D9D9" ns0:sz="4" ns0:val="single"/>
+              <ns0:left ns0:color="D9D9D9" ns0:sz="4" ns0:val="single"/>
+              <ns0:bottom ns0:color="D9D9D9" ns0:sz="4" ns0:val="single"/>
+              <ns0:right ns0:color="D9D9D9" ns0:sz="4" ns0:val="single"/>
             </ns0:tcBorders>
             <ns0:tcMar>
-              <ns0:top ns0:w="95" ns0:type="dxa"/>
-              <ns0:left ns0:w="95" ns0:type="dxa"/>
-              <ns0:bottom ns0:w="95" ns0:type="dxa"/>
-              <ns0:right ns0:w="95" ns0:type="dxa"/>
+              <ns0:top ns0:type="dxa" ns0:w="95"/>
+              <ns0:left ns0:type="dxa" ns0:w="95"/>
+              <ns0:bottom ns0:type="dxa" ns0:w="95"/>
+              <ns0:right ns0:type="dxa" ns0:w="95"/>
             </ns0:tcMar>
           </ns0:tcPr>
           <ns0:p>
@@ -2842,16 +2842,16 @@
             <ns0:tcW ns0:type="dxa" ns0:w="2381"/>
             <ns0:vAlign ns0:val="center"/>
             <ns0:tcBorders>
-              <ns0:top ns0:val="single" ns0:sz="4" ns0:color="D9D9D9"/>
-              <ns0:left ns0:val="single" ns0:sz="4" ns0:color="D9D9D9"/>
-              <ns0:bottom ns0:val="single" ns0:sz="4" ns0:color="D9D9D9"/>
-              <ns0:right ns0:val="single" ns0:sz="4" ns0:color="D9D9D9"/>
+              <ns0:top ns0:color="D9D9D9" ns0:sz="4" ns0:val="single"/>
+              <ns0:left ns0:color="D9D9D9" ns0:sz="4" ns0:val="single"/>
+              <ns0:bottom ns0:color="D9D9D9" ns0:sz="4" ns0:val="single"/>
+              <ns0:right ns0:color="D9D9D9" ns0:sz="4" ns0:val="single"/>
             </ns0:tcBorders>
             <ns0:tcMar>
-              <ns0:top ns0:w="95" ns0:type="dxa"/>
-              <ns0:left ns0:w="95" ns0:type="dxa"/>
-              <ns0:bottom ns0:w="95" ns0:type="dxa"/>
-              <ns0:right ns0:w="95" ns0:type="dxa"/>
+              <ns0:top ns0:type="dxa" ns0:w="95"/>
+              <ns0:left ns0:type="dxa" ns0:w="95"/>
+              <ns0:bottom ns0:type="dxa" ns0:w="95"/>
+              <ns0:right ns0:type="dxa" ns0:w="95"/>
             </ns0:tcMar>
           </ns0:tcPr>
           <ns0:p>
@@ -2880,16 +2880,16 @@
             <ns0:vAlign ns0:val="center"/>
             <ns0:shd ns0:fill="FAFAFA"/>
             <ns0:tcBorders>
-              <ns0:top ns0:val="single" ns0:sz="4" ns0:color="D9D9D9"/>
-              <ns0:left ns0:val="single" ns0:sz="4" ns0:color="D9D9D9"/>
-              <ns0:bottom ns0:val="single" ns0:sz="4" ns0:color="D9D9D9"/>
-              <ns0:right ns0:val="single" ns0:sz="4" ns0:color="D9D9D9"/>
+              <ns0:top ns0:color="D9D9D9" ns0:sz="4" ns0:val="single"/>
+              <ns0:left ns0:color="D9D9D9" ns0:sz="4" ns0:val="single"/>
+              <ns0:bottom ns0:color="D9D9D9" ns0:sz="4" ns0:val="single"/>
+              <ns0:right ns0:color="D9D9D9" ns0:sz="4" ns0:val="single"/>
             </ns0:tcBorders>
             <ns0:tcMar>
-              <ns0:top ns0:w="95" ns0:type="dxa"/>
-              <ns0:left ns0:w="95" ns0:type="dxa"/>
-              <ns0:bottom ns0:w="95" ns0:type="dxa"/>
-              <ns0:right ns0:w="95" ns0:type="dxa"/>
+              <ns0:top ns0:type="dxa" ns0:w="95"/>
+              <ns0:left ns0:type="dxa" ns0:w="95"/>
+              <ns0:bottom ns0:type="dxa" ns0:w="95"/>
+              <ns0:right ns0:type="dxa" ns0:w="95"/>
             </ns0:tcMar>
           </ns0:tcPr>
           <ns0:p>
@@ -2913,16 +2913,16 @@
             <ns0:vAlign ns0:val="center"/>
             <ns0:shd ns0:fill="FAFAFA"/>
             <ns0:tcBorders>
-              <ns0:top ns0:val="single" ns0:sz="4" ns0:color="D9D9D9"/>
-              <ns0:left ns0:val="single" ns0:sz="4" ns0:color="D9D9D9"/>
-              <ns0:bottom ns0:val="single" ns0:sz="4" ns0:color="D9D9D9"/>
-              <ns0:right ns0:val="single" ns0:sz="4" ns0:color="D9D9D9"/>
+              <ns0:top ns0:color="D9D9D9" ns0:sz="4" ns0:val="single"/>
+              <ns0:left ns0:color="D9D9D9" ns0:sz="4" ns0:val="single"/>
+              <ns0:bottom ns0:color="D9D9D9" ns0:sz="4" ns0:val="single"/>
+              <ns0:right ns0:color="D9D9D9" ns0:sz="4" ns0:val="single"/>
             </ns0:tcBorders>
             <ns0:tcMar>
-              <ns0:top ns0:w="95" ns0:type="dxa"/>
-              <ns0:left ns0:w="95" ns0:type="dxa"/>
-              <ns0:bottom ns0:w="95" ns0:type="dxa"/>
-              <ns0:right ns0:w="95" ns0:type="dxa"/>
+              <ns0:top ns0:type="dxa" ns0:w="95"/>
+              <ns0:left ns0:type="dxa" ns0:w="95"/>
+              <ns0:bottom ns0:type="dxa" ns0:w="95"/>
+              <ns0:right ns0:type="dxa" ns0:w="95"/>
             </ns0:tcMar>
           </ns0:tcPr>
           <ns0:p>
@@ -2946,16 +2946,16 @@
             <ns0:vAlign ns0:val="center"/>
             <ns0:shd ns0:fill="FAFAFA"/>
             <ns0:tcBorders>
-              <ns0:top ns0:val="single" ns0:sz="4" ns0:color="D9D9D9"/>
-              <ns0:left ns0:val="single" ns0:sz="4" ns0:color="D9D9D9"/>
-              <ns0:bottom ns0:val="single" ns0:sz="4" ns0:color="D9D9D9"/>
-              <ns0:right ns0:val="single" ns0:sz="4" ns0:color="D9D9D9"/>
+              <ns0:top ns0:color="D9D9D9" ns0:sz="4" ns0:val="single"/>
+              <ns0:left ns0:color="D9D9D9" ns0:sz="4" ns0:val="single"/>
+              <ns0:bottom ns0:color="D9D9D9" ns0:sz="4" ns0:val="single"/>
+              <ns0:right ns0:color="D9D9D9" ns0:sz="4" ns0:val="single"/>
             </ns0:tcBorders>
             <ns0:tcMar>
-              <ns0:top ns0:w="95" ns0:type="dxa"/>
-              <ns0:left ns0:w="95" ns0:type="dxa"/>
-              <ns0:bottom ns0:w="95" ns0:type="dxa"/>
-              <ns0:right ns0:w="95" ns0:type="dxa"/>
+              <ns0:top ns0:type="dxa" ns0:w="95"/>
+              <ns0:left ns0:type="dxa" ns0:w="95"/>
+              <ns0:bottom ns0:type="dxa" ns0:w="95"/>
+              <ns0:right ns0:type="dxa" ns0:w="95"/>
             </ns0:tcMar>
           </ns0:tcPr>
           <ns0:p>
@@ -2979,16 +2979,16 @@
             <ns0:vAlign ns0:val="center"/>
             <ns0:shd ns0:fill="FAFAFA"/>
             <ns0:tcBorders>
-              <ns0:top ns0:val="single" ns0:sz="4" ns0:color="D9D9D9"/>
-              <ns0:left ns0:val="single" ns0:sz="4" ns0:color="D9D9D9"/>
-              <ns0:bottom ns0:val="single" ns0:sz="4" ns0:color="D9D9D9"/>
-              <ns0:right ns0:val="single" ns0:sz="4" ns0:color="D9D9D9"/>
+              <ns0:top ns0:color="D9D9D9" ns0:sz="4" ns0:val="single"/>
+              <ns0:left ns0:color="D9D9D9" ns0:sz="4" ns0:val="single"/>
+              <ns0:bottom ns0:color="D9D9D9" ns0:sz="4" ns0:val="single"/>
+              <ns0:right ns0:color="D9D9D9" ns0:sz="4" ns0:val="single"/>
             </ns0:tcBorders>
             <ns0:tcMar>
-              <ns0:top ns0:w="95" ns0:type="dxa"/>
-              <ns0:left ns0:w="95" ns0:type="dxa"/>
-              <ns0:bottom ns0:w="95" ns0:type="dxa"/>
-              <ns0:right ns0:w="95" ns0:type="dxa"/>
+              <ns0:top ns0:type="dxa" ns0:w="95"/>
+              <ns0:left ns0:type="dxa" ns0:w="95"/>
+              <ns0:bottom ns0:type="dxa" ns0:w="95"/>
+              <ns0:right ns0:type="dxa" ns0:w="95"/>
             </ns0:tcMar>
           </ns0:tcPr>
           <ns0:p>
@@ -3016,16 +3016,16 @@
             <ns0:tcW ns0:type="dxa" ns0:w="1814"/>
             <ns0:vAlign ns0:val="center"/>
             <ns0:tcBorders>
-              <ns0:top ns0:val="single" ns0:sz="4" ns0:color="D9D9D9"/>
-              <ns0:left ns0:val="single" ns0:sz="4" ns0:color="D9D9D9"/>
-              <ns0:bottom ns0:val="single" ns0:sz="4" ns0:color="D9D9D9"/>
-              <ns0:right ns0:val="single" ns0:sz="4" ns0:color="D9D9D9"/>
+              <ns0:top ns0:color="D9D9D9" ns0:sz="4" ns0:val="single"/>
+              <ns0:left ns0:color="D9D9D9" ns0:sz="4" ns0:val="single"/>
+              <ns0:bottom ns0:color="D9D9D9" ns0:sz="4" ns0:val="single"/>
+              <ns0:right ns0:color="D9D9D9" ns0:sz="4" ns0:val="single"/>
             </ns0:tcBorders>
             <ns0:tcMar>
-              <ns0:top ns0:w="95" ns0:type="dxa"/>
-              <ns0:left ns0:w="95" ns0:type="dxa"/>
-              <ns0:bottom ns0:w="95" ns0:type="dxa"/>
-              <ns0:right ns0:w="95" ns0:type="dxa"/>
+              <ns0:top ns0:type="dxa" ns0:w="95"/>
+              <ns0:left ns0:type="dxa" ns0:w="95"/>
+              <ns0:bottom ns0:type="dxa" ns0:w="95"/>
+              <ns0:right ns0:type="dxa" ns0:w="95"/>
             </ns0:tcMar>
           </ns0:tcPr>
           <ns0:p>
@@ -3048,16 +3048,16 @@
             <ns0:tcW ns0:type="dxa" ns0:w="2324"/>
             <ns0:vAlign ns0:val="center"/>
             <ns0:tcBorders>
-              <ns0:top ns0:val="single" ns0:sz="4" ns0:color="D9D9D9"/>
-              <ns0:left ns0:val="single" ns0:sz="4" ns0:color="D9D9D9"/>
-              <ns0:bottom ns0:val="single" ns0:sz="4" ns0:color="D9D9D9"/>
-              <ns0:right ns0:val="single" ns0:sz="4" ns0:color="D9D9D9"/>
+              <ns0:top ns0:color="D9D9D9" ns0:sz="4" ns0:val="single"/>
+              <ns0:left ns0:color="D9D9D9" ns0:sz="4" ns0:val="single"/>
+              <ns0:bottom ns0:color="D9D9D9" ns0:sz="4" ns0:val="single"/>
+              <ns0:right ns0:color="D9D9D9" ns0:sz="4" ns0:val="single"/>
             </ns0:tcBorders>
             <ns0:tcMar>
-              <ns0:top ns0:w="95" ns0:type="dxa"/>
-              <ns0:left ns0:w="95" ns0:type="dxa"/>
-              <ns0:bottom ns0:w="95" ns0:type="dxa"/>
-              <ns0:right ns0:w="95" ns0:type="dxa"/>
+              <ns0:top ns0:type="dxa" ns0:w="95"/>
+              <ns0:left ns0:type="dxa" ns0:w="95"/>
+              <ns0:bottom ns0:type="dxa" ns0:w="95"/>
+              <ns0:right ns0:type="dxa" ns0:w="95"/>
             </ns0:tcMar>
           </ns0:tcPr>
           <ns0:p>
@@ -3080,16 +3080,16 @@
             <ns0:tcW ns0:type="dxa" ns0:w="2381"/>
             <ns0:vAlign ns0:val="center"/>
             <ns0:tcBorders>
-              <ns0:top ns0:val="single" ns0:sz="4" ns0:color="D9D9D9"/>
-              <ns0:left ns0:val="single" ns0:sz="4" ns0:color="D9D9D9"/>
-              <ns0:bottom ns0:val="single" ns0:sz="4" ns0:color="D9D9D9"/>
-              <ns0:right ns0:val="single" ns0:sz="4" ns0:color="D9D9D9"/>
+              <ns0:top ns0:color="D9D9D9" ns0:sz="4" ns0:val="single"/>
+              <ns0:left ns0:color="D9D9D9" ns0:sz="4" ns0:val="single"/>
+              <ns0:bottom ns0:color="D9D9D9" ns0:sz="4" ns0:val="single"/>
+              <ns0:right ns0:color="D9D9D9" ns0:sz="4" ns0:val="single"/>
             </ns0:tcBorders>
             <ns0:tcMar>
-              <ns0:top ns0:w="95" ns0:type="dxa"/>
-              <ns0:left ns0:w="95" ns0:type="dxa"/>
-              <ns0:bottom ns0:w="95" ns0:type="dxa"/>
-              <ns0:right ns0:w="95" ns0:type="dxa"/>
+              <ns0:top ns0:type="dxa" ns0:w="95"/>
+              <ns0:left ns0:type="dxa" ns0:w="95"/>
+              <ns0:bottom ns0:type="dxa" ns0:w="95"/>
+              <ns0:right ns0:type="dxa" ns0:w="95"/>
             </ns0:tcMar>
           </ns0:tcPr>
           <ns0:p>
@@ -3112,16 +3112,16 @@
             <ns0:tcW ns0:type="dxa" ns0:w="2381"/>
             <ns0:vAlign ns0:val="center"/>
             <ns0:tcBorders>
-              <ns0:top ns0:val="single" ns0:sz="4" ns0:color="D9D9D9"/>
-              <ns0:left ns0:val="single" ns0:sz="4" ns0:color="D9D9D9"/>
-              <ns0:bottom ns0:val="single" ns0:sz="4" ns0:color="D9D9D9"/>
-              <ns0:right ns0:val="single" ns0:sz="4" ns0:color="D9D9D9"/>
+              <ns0:top ns0:color="D9D9D9" ns0:sz="4" ns0:val="single"/>
+              <ns0:left ns0:color="D9D9D9" ns0:sz="4" ns0:val="single"/>
+              <ns0:bottom ns0:color="D9D9D9" ns0:sz="4" ns0:val="single"/>
+              <ns0:right ns0:color="D9D9D9" ns0:sz="4" ns0:val="single"/>
             </ns0:tcBorders>
             <ns0:tcMar>
-              <ns0:top ns0:w="95" ns0:type="dxa"/>
-              <ns0:left ns0:w="95" ns0:type="dxa"/>
-              <ns0:bottom ns0:w="95" ns0:type="dxa"/>
-              <ns0:right ns0:w="95" ns0:type="dxa"/>
+              <ns0:top ns0:type="dxa" ns0:w="95"/>
+              <ns0:left ns0:type="dxa" ns0:w="95"/>
+              <ns0:bottom ns0:type="dxa" ns0:w="95"/>
+              <ns0:right ns0:type="dxa" ns0:w="95"/>
             </ns0:tcMar>
           </ns0:tcPr>
           <ns0:p>
@@ -3150,16 +3150,16 @@
             <ns0:vAlign ns0:val="center"/>
             <ns0:shd ns0:fill="FAFAFA"/>
             <ns0:tcBorders>
-              <ns0:top ns0:val="single" ns0:sz="4" ns0:color="D9D9D9"/>
-              <ns0:left ns0:val="single" ns0:sz="4" ns0:color="D9D9D9"/>
-              <ns0:bottom ns0:val="single" ns0:sz="4" ns0:color="D9D9D9"/>
-              <ns0:right ns0:val="single" ns0:sz="4" ns0:color="D9D9D9"/>
+              <ns0:top ns0:color="D9D9D9" ns0:sz="4" ns0:val="single"/>
+              <ns0:left ns0:color="D9D9D9" ns0:sz="4" ns0:val="single"/>
+              <ns0:bottom ns0:color="D9D9D9" ns0:sz="4" ns0:val="single"/>
+              <ns0:right ns0:color="D9D9D9" ns0:sz="4" ns0:val="single"/>
             </ns0:tcBorders>
             <ns0:tcMar>
-              <ns0:top ns0:w="95" ns0:type="dxa"/>
-              <ns0:left ns0:w="95" ns0:type="dxa"/>
-              <ns0:bottom ns0:w="95" ns0:type="dxa"/>
-              <ns0:right ns0:w="95" ns0:type="dxa"/>
+              <ns0:top ns0:type="dxa" ns0:w="95"/>
+              <ns0:left ns0:type="dxa" ns0:w="95"/>
+              <ns0:bottom ns0:type="dxa" ns0:w="95"/>
+              <ns0:right ns0:type="dxa" ns0:w="95"/>
             </ns0:tcMar>
           </ns0:tcPr>
           <ns0:p>
@@ -3183,16 +3183,16 @@
             <ns0:vAlign ns0:val="center"/>
             <ns0:shd ns0:fill="FAFAFA"/>
             <ns0:tcBorders>
-              <ns0:top ns0:val="single" ns0:sz="4" ns0:color="D9D9D9"/>
-              <ns0:left ns0:val="single" ns0:sz="4" ns0:color="D9D9D9"/>
-              <ns0:bottom ns0:val="single" ns0:sz="4" ns0:color="D9D9D9"/>
-              <ns0:right ns0:val="single" ns0:sz="4" ns0:color="D9D9D9"/>
+              <ns0:top ns0:color="D9D9D9" ns0:sz="4" ns0:val="single"/>
+              <ns0:left ns0:color="D9D9D9" ns0:sz="4" ns0:val="single"/>
+              <ns0:bottom ns0:color="D9D9D9" ns0:sz="4" ns0:val="single"/>
+              <ns0:right ns0:color="D9D9D9" ns0:sz="4" ns0:val="single"/>
             </ns0:tcBorders>
             <ns0:tcMar>
-              <ns0:top ns0:w="95" ns0:type="dxa"/>
-              <ns0:left ns0:w="95" ns0:type="dxa"/>
-              <ns0:bottom ns0:w="95" ns0:type="dxa"/>
-              <ns0:right ns0:w="95" ns0:type="dxa"/>
+              <ns0:top ns0:type="dxa" ns0:w="95"/>
+              <ns0:left ns0:type="dxa" ns0:w="95"/>
+              <ns0:bottom ns0:type="dxa" ns0:w="95"/>
+              <ns0:right ns0:type="dxa" ns0:w="95"/>
             </ns0:tcMar>
           </ns0:tcPr>
           <ns0:p>
@@ -3216,16 +3216,16 @@
             <ns0:vAlign ns0:val="center"/>
             <ns0:shd ns0:fill="FAFAFA"/>
             <ns0:tcBorders>
-              <ns0:top ns0:val="single" ns0:sz="4" ns0:color="D9D9D9"/>
-              <ns0:left ns0:val="single" ns0:sz="4" ns0:color="D9D9D9"/>
-              <ns0:bottom ns0:val="single" ns0:sz="4" ns0:color="D9D9D9"/>
-              <ns0:right ns0:val="single" ns0:sz="4" ns0:color="D9D9D9"/>
+              <ns0:top ns0:color="D9D9D9" ns0:sz="4" ns0:val="single"/>
+              <ns0:left ns0:color="D9D9D9" ns0:sz="4" ns0:val="single"/>
+              <ns0:bottom ns0:color="D9D9D9" ns0:sz="4" ns0:val="single"/>
+              <ns0:right ns0:color="D9D9D9" ns0:sz="4" ns0:val="single"/>
             </ns0:tcBorders>
             <ns0:tcMar>
-              <ns0:top ns0:w="95" ns0:type="dxa"/>
-              <ns0:left ns0:w="95" ns0:type="dxa"/>
-              <ns0:bottom ns0:w="95" ns0:type="dxa"/>
-              <ns0:right ns0:w="95" ns0:type="dxa"/>
+              <ns0:top ns0:type="dxa" ns0:w="95"/>
+              <ns0:left ns0:type="dxa" ns0:w="95"/>
+              <ns0:bottom ns0:type="dxa" ns0:w="95"/>
+              <ns0:right ns0:type="dxa" ns0:w="95"/>
             </ns0:tcMar>
           </ns0:tcPr>
           <ns0:p>
@@ -3249,16 +3249,16 @@
             <ns0:vAlign ns0:val="center"/>
             <ns0:shd ns0:fill="FAFAFA"/>
             <ns0:tcBorders>
-              <ns0:top ns0:val="single" ns0:sz="4" ns0:color="D9D9D9"/>
-              <ns0:left ns0:val="single" ns0:sz="4" ns0:color="D9D9D9"/>
-              <ns0:bottom ns0:val="single" ns0:sz="4" ns0:color="D9D9D9"/>
-              <ns0:right ns0:val="single" ns0:sz="4" ns0:color="D9D9D9"/>
+              <ns0:top ns0:color="D9D9D9" ns0:sz="4" ns0:val="single"/>
+              <ns0:left ns0:color="D9D9D9" ns0:sz="4" ns0:val="single"/>
+              <ns0:bottom ns0:color="D9D9D9" ns0:sz="4" ns0:val="single"/>
+              <ns0:right ns0:color="D9D9D9" ns0:sz="4" ns0:val="single"/>
             </ns0:tcBorders>
             <ns0:tcMar>
-              <ns0:top ns0:w="95" ns0:type="dxa"/>
-              <ns0:left ns0:w="95" ns0:type="dxa"/>
-              <ns0:bottom ns0:w="95" ns0:type="dxa"/>
-              <ns0:right ns0:w="95" ns0:type="dxa"/>
+              <ns0:top ns0:type="dxa" ns0:w="95"/>
+              <ns0:left ns0:type="dxa" ns0:w="95"/>
+              <ns0:bottom ns0:type="dxa" ns0:w="95"/>
+              <ns0:right ns0:type="dxa" ns0:w="95"/>
             </ns0:tcMar>
           </ns0:tcPr>
           <ns0:p>
@@ -3286,16 +3286,16 @@
             <ns0:tcW ns0:type="dxa" ns0:w="1814"/>
             <ns0:vAlign ns0:val="center"/>
             <ns0:tcBorders>
-              <ns0:top ns0:val="single" ns0:sz="4" ns0:color="D9D9D9"/>
-              <ns0:left ns0:val="single" ns0:sz="4" ns0:color="D9D9D9"/>
-              <ns0:bottom ns0:val="single" ns0:sz="4" ns0:color="D9D9D9"/>
-              <ns0:right ns0:val="single" ns0:sz="4" ns0:color="D9D9D9"/>
+              <ns0:top ns0:color="D9D9D9" ns0:sz="4" ns0:val="single"/>
+              <ns0:left ns0:color="D9D9D9" ns0:sz="4" ns0:val="single"/>
+              <ns0:bottom ns0:color="D9D9D9" ns0:sz="4" ns0:val="single"/>
+              <ns0:right ns0:color="D9D9D9" ns0:sz="4" ns0:val="single"/>
             </ns0:tcBorders>
             <ns0:tcMar>
-              <ns0:top ns0:w="95" ns0:type="dxa"/>
-              <ns0:left ns0:w="95" ns0:type="dxa"/>
-              <ns0:bottom ns0:w="95" ns0:type="dxa"/>
-              <ns0:right ns0:w="95" ns0:type="dxa"/>
+              <ns0:top ns0:type="dxa" ns0:w="95"/>
+              <ns0:left ns0:type="dxa" ns0:w="95"/>
+              <ns0:bottom ns0:type="dxa" ns0:w="95"/>
+              <ns0:right ns0:type="dxa" ns0:w="95"/>
             </ns0:tcMar>
           </ns0:tcPr>
           <ns0:p>
@@ -3318,16 +3318,16 @@
             <ns0:tcW ns0:type="dxa" ns0:w="2324"/>
             <ns0:vAlign ns0:val="center"/>
             <ns0:tcBorders>
-              <ns0:top ns0:val="single" ns0:sz="4" ns0:color="D9D9D9"/>
-              <ns0:left ns0:val="single" ns0:sz="4" ns0:color="D9D9D9"/>
-              <ns0:bottom ns0:val="single" ns0:sz="4" ns0:color="D9D9D9"/>
-              <ns0:right ns0:val="single" ns0:sz="4" ns0:color="D9D9D9"/>
+              <ns0:top ns0:color="D9D9D9" ns0:sz="4" ns0:val="single"/>
+              <ns0:left ns0:color="D9D9D9" ns0:sz="4" ns0:val="single"/>
+              <ns0:bottom ns0:color="D9D9D9" ns0:sz="4" ns0:val="single"/>
+              <ns0:right ns0:color="D9D9D9" ns0:sz="4" ns0:val="single"/>
             </ns0:tcBorders>
             <ns0:tcMar>
-              <ns0:top ns0:w="95" ns0:type="dxa"/>
-              <ns0:left ns0:w="95" ns0:type="dxa"/>
-              <ns0:bottom ns0:w="95" ns0:type="dxa"/>
-              <ns0:right ns0:w="95" ns0:type="dxa"/>
+              <ns0:top ns0:type="dxa" ns0:w="95"/>
+              <ns0:left ns0:type="dxa" ns0:w="95"/>
+              <ns0:bottom ns0:type="dxa" ns0:w="95"/>
+              <ns0:right ns0:type="dxa" ns0:w="95"/>
             </ns0:tcMar>
           </ns0:tcPr>
           <ns0:p>
@@ -3350,16 +3350,16 @@
             <ns0:tcW ns0:type="dxa" ns0:w="2381"/>
             <ns0:vAlign ns0:val="center"/>
             <ns0:tcBorders>
-              <ns0:top ns0:val="single" ns0:sz="4" ns0:color="D9D9D9"/>
-              <ns0:left ns0:val="single" ns0:sz="4" ns0:color="D9D9D9"/>
-              <ns0:bottom ns0:val="single" ns0:sz="4" ns0:color="D9D9D9"/>
-              <ns0:right ns0:val="single" ns0:sz="4" ns0:color="D9D9D9"/>
+              <ns0:top ns0:color="D9D9D9" ns0:sz="4" ns0:val="single"/>
+              <ns0:left ns0:color="D9D9D9" ns0:sz="4" ns0:val="single"/>
+              <ns0:bottom ns0:color="D9D9D9" ns0:sz="4" ns0:val="single"/>
+              <ns0:right ns0:color="D9D9D9" ns0:sz="4" ns0:val="single"/>
             </ns0:tcBorders>
             <ns0:tcMar>
-              <ns0:top ns0:w="95" ns0:type="dxa"/>
-              <ns0:left ns0:w="95" ns0:type="dxa"/>
-              <ns0:bottom ns0:w="95" ns0:type="dxa"/>
-              <ns0:right ns0:w="95" ns0:type="dxa"/>
+              <ns0:top ns0:type="dxa" ns0:w="95"/>
+              <ns0:left ns0:type="dxa" ns0:w="95"/>
+              <ns0:bottom ns0:type="dxa" ns0:w="95"/>
+              <ns0:right ns0:type="dxa" ns0:w="95"/>
             </ns0:tcMar>
           </ns0:tcPr>
           <ns0:p>
@@ -3382,16 +3382,16 @@
             <ns0:tcW ns0:type="dxa" ns0:w="2381"/>
             <ns0:vAlign ns0:val="center"/>
             <ns0:tcBorders>
-              <ns0:top ns0:val="single" ns0:sz="4" ns0:color="D9D9D9"/>
-              <ns0:left ns0:val="single" ns0:sz="4" ns0:color="D9D9D9"/>
-              <ns0:bottom ns0:val="single" ns0:sz="4" ns0:color="D9D9D9"/>
-              <ns0:right ns0:val="single" ns0:sz="4" ns0:color="D9D9D9"/>
+              <ns0:top ns0:color="D9D9D9" ns0:sz="4" ns0:val="single"/>
+              <ns0:left ns0:color="D9D9D9" ns0:sz="4" ns0:val="single"/>
+              <ns0:bottom ns0:color="D9D9D9" ns0:sz="4" ns0:val="single"/>
+              <ns0:right ns0:color="D9D9D9" ns0:sz="4" ns0:val="single"/>
             </ns0:tcBorders>
             <ns0:tcMar>
-              <ns0:top ns0:w="95" ns0:type="dxa"/>
-              <ns0:left ns0:w="95" ns0:type="dxa"/>
-              <ns0:bottom ns0:w="95" ns0:type="dxa"/>
-              <ns0:right ns0:w="95" ns0:type="dxa"/>
+              <ns0:top ns0:type="dxa" ns0:w="95"/>
+              <ns0:left ns0:type="dxa" ns0:w="95"/>
+              <ns0:bottom ns0:type="dxa" ns0:w="95"/>
+              <ns0:right ns0:type="dxa" ns0:w="95"/>
             </ns0:tcMar>
           </ns0:tcPr>
           <ns0:p>
@@ -3435,13 +3435,13 @@
     </ns0:p>
     <ns0:p>
       <ns0:r>
-        <ns0:t>The following choices are provisional. A small integration experiment and team review will determine the implementation stack; no alternative has yet been benchmarked in this project.</ns0:t>
+        <ns0:t>The proposed technology choices will be assessed through a small integration experiment and a comparison of implementation effort, validation support and runtime behavior. Team review will use these results to select the implementation stack.</ns0:t>
       </ns0:r>
     </ns0:p>
     <ns0:p>
       <ns0:pPr>
         <ns0:keepNext/>
-        <ns0:spacing ns0:before="160" ns0:after="80"/>
+        <ns0:spacing ns0:after="80" ns0:before="160"/>
         <ns0:ind ns0:firstLine="0"/>
         <ns0:jc ns0:val="left"/>
       </ns0:pPr>
@@ -3476,16 +3476,16 @@
             <ns0:vAlign ns0:val="center"/>
             <ns0:shd ns0:fill="F1F1F1"/>
             <ns0:tcBorders>
-              <ns0:top ns0:val="single" ns0:sz="4" ns0:color="D9D9D9"/>
-              <ns0:left ns0:val="single" ns0:sz="4" ns0:color="D9D9D9"/>
-              <ns0:bottom ns0:val="single" ns0:sz="4" ns0:color="D9D9D9"/>
-              <ns0:right ns0:val="single" ns0:sz="4" ns0:color="D9D9D9"/>
+              <ns0:top ns0:color="D9D9D9" ns0:sz="4" ns0:val="single"/>
+              <ns0:left ns0:color="D9D9D9" ns0:sz="4" ns0:val="single"/>
+              <ns0:bottom ns0:color="D9D9D9" ns0:sz="4" ns0:val="single"/>
+              <ns0:right ns0:color="D9D9D9" ns0:sz="4" ns0:val="single"/>
             </ns0:tcBorders>
             <ns0:tcMar>
-              <ns0:top ns0:w="95" ns0:type="dxa"/>
-              <ns0:left ns0:w="95" ns0:type="dxa"/>
-              <ns0:bottom ns0:w="95" ns0:type="dxa"/>
-              <ns0:right ns0:w="95" ns0:type="dxa"/>
+              <ns0:top ns0:type="dxa" ns0:w="95"/>
+              <ns0:left ns0:type="dxa" ns0:w="95"/>
+              <ns0:bottom ns0:type="dxa" ns0:w="95"/>
+              <ns0:right ns0:type="dxa" ns0:w="95"/>
             </ns0:tcMar>
           </ns0:tcPr>
           <ns0:p>
@@ -3510,16 +3510,16 @@
             <ns0:vAlign ns0:val="center"/>
             <ns0:shd ns0:fill="F1F1F1"/>
             <ns0:tcBorders>
-              <ns0:top ns0:val="single" ns0:sz="4" ns0:color="D9D9D9"/>
-              <ns0:left ns0:val="single" ns0:sz="4" ns0:color="D9D9D9"/>
-              <ns0:bottom ns0:val="single" ns0:sz="4" ns0:color="D9D9D9"/>
-              <ns0:right ns0:val="single" ns0:sz="4" ns0:color="D9D9D9"/>
+              <ns0:top ns0:color="D9D9D9" ns0:sz="4" ns0:val="single"/>
+              <ns0:left ns0:color="D9D9D9" ns0:sz="4" ns0:val="single"/>
+              <ns0:bottom ns0:color="D9D9D9" ns0:sz="4" ns0:val="single"/>
+              <ns0:right ns0:color="D9D9D9" ns0:sz="4" ns0:val="single"/>
             </ns0:tcBorders>
             <ns0:tcMar>
-              <ns0:top ns0:w="95" ns0:type="dxa"/>
-              <ns0:left ns0:w="95" ns0:type="dxa"/>
-              <ns0:bottom ns0:w="95" ns0:type="dxa"/>
-              <ns0:right ns0:w="95" ns0:type="dxa"/>
+              <ns0:top ns0:type="dxa" ns0:w="95"/>
+              <ns0:left ns0:type="dxa" ns0:w="95"/>
+              <ns0:bottom ns0:type="dxa" ns0:w="95"/>
+              <ns0:right ns0:type="dxa" ns0:w="95"/>
             </ns0:tcMar>
           </ns0:tcPr>
           <ns0:p>
@@ -3544,16 +3544,16 @@
             <ns0:vAlign ns0:val="center"/>
             <ns0:shd ns0:fill="F1F1F1"/>
             <ns0:tcBorders>
-              <ns0:top ns0:val="single" ns0:sz="4" ns0:color="D9D9D9"/>
-              <ns0:left ns0:val="single" ns0:sz="4" ns0:color="D9D9D9"/>
-              <ns0:bottom ns0:val="single" ns0:sz="4" ns0:color="D9D9D9"/>
-              <ns0:right ns0:val="single" ns0:sz="4" ns0:color="D9D9D9"/>
+              <ns0:top ns0:color="D9D9D9" ns0:sz="4" ns0:val="single"/>
+              <ns0:left ns0:color="D9D9D9" ns0:sz="4" ns0:val="single"/>
+              <ns0:bottom ns0:color="D9D9D9" ns0:sz="4" ns0:val="single"/>
+              <ns0:right ns0:color="D9D9D9" ns0:sz="4" ns0:val="single"/>
             </ns0:tcBorders>
             <ns0:tcMar>
-              <ns0:top ns0:w="95" ns0:type="dxa"/>
-              <ns0:left ns0:w="95" ns0:type="dxa"/>
-              <ns0:bottom ns0:w="95" ns0:type="dxa"/>
-              <ns0:right ns0:w="95" ns0:type="dxa"/>
+              <ns0:top ns0:type="dxa" ns0:w="95"/>
+              <ns0:left ns0:type="dxa" ns0:w="95"/>
+              <ns0:bottom ns0:type="dxa" ns0:w="95"/>
+              <ns0:right ns0:type="dxa" ns0:w="95"/>
             </ns0:tcMar>
           </ns0:tcPr>
           <ns0:p>
@@ -3582,16 +3582,16 @@
             <ns0:tcW ns0:type="dxa" ns0:w="1701"/>
             <ns0:vAlign ns0:val="center"/>
             <ns0:tcBorders>
-              <ns0:top ns0:val="single" ns0:sz="4" ns0:color="D9D9D9"/>
-              <ns0:left ns0:val="single" ns0:sz="4" ns0:color="D9D9D9"/>
-              <ns0:bottom ns0:val="single" ns0:sz="4" ns0:color="D9D9D9"/>
-              <ns0:right ns0:val="single" ns0:sz="4" ns0:color="D9D9D9"/>
+              <ns0:top ns0:color="D9D9D9" ns0:sz="4" ns0:val="single"/>
+              <ns0:left ns0:color="D9D9D9" ns0:sz="4" ns0:val="single"/>
+              <ns0:bottom ns0:color="D9D9D9" ns0:sz="4" ns0:val="single"/>
+              <ns0:right ns0:color="D9D9D9" ns0:sz="4" ns0:val="single"/>
             </ns0:tcBorders>
             <ns0:tcMar>
-              <ns0:top ns0:w="95" ns0:type="dxa"/>
-              <ns0:left ns0:w="95" ns0:type="dxa"/>
-              <ns0:bottom ns0:w="95" ns0:type="dxa"/>
-              <ns0:right ns0:w="95" ns0:type="dxa"/>
+              <ns0:top ns0:type="dxa" ns0:w="95"/>
+              <ns0:left ns0:type="dxa" ns0:w="95"/>
+              <ns0:bottom ns0:type="dxa" ns0:w="95"/>
+              <ns0:right ns0:type="dxa" ns0:w="95"/>
             </ns0:tcMar>
           </ns0:tcPr>
           <ns0:p>
@@ -3614,16 +3614,16 @@
             <ns0:tcW ns0:type="dxa" ns0:w="5216"/>
             <ns0:vAlign ns0:val="center"/>
             <ns0:tcBorders>
-              <ns0:top ns0:val="single" ns0:sz="4" ns0:color="D9D9D9"/>
-              <ns0:left ns0:val="single" ns0:sz="4" ns0:color="D9D9D9"/>
-              <ns0:bottom ns0:val="single" ns0:sz="4" ns0:color="D9D9D9"/>
-              <ns0:right ns0:val="single" ns0:sz="4" ns0:color="D9D9D9"/>
+              <ns0:top ns0:color="D9D9D9" ns0:sz="4" ns0:val="single"/>
+              <ns0:left ns0:color="D9D9D9" ns0:sz="4" ns0:val="single"/>
+              <ns0:bottom ns0:color="D9D9D9" ns0:sz="4" ns0:val="single"/>
+              <ns0:right ns0:color="D9D9D9" ns0:sz="4" ns0:val="single"/>
             </ns0:tcBorders>
             <ns0:tcMar>
-              <ns0:top ns0:w="95" ns0:type="dxa"/>
-              <ns0:left ns0:w="95" ns0:type="dxa"/>
-              <ns0:bottom ns0:w="95" ns0:type="dxa"/>
-              <ns0:right ns0:w="95" ns0:type="dxa"/>
+              <ns0:top ns0:type="dxa" ns0:w="95"/>
+              <ns0:left ns0:type="dxa" ns0:w="95"/>
+              <ns0:bottom ns0:type="dxa" ns0:w="95"/>
+              <ns0:right ns0:type="dxa" ns0:w="95"/>
             </ns0:tcMar>
           </ns0:tcPr>
           <ns0:p>
@@ -3646,16 +3646,16 @@
             <ns0:tcW ns0:type="dxa" ns0:w="1984"/>
             <ns0:vAlign ns0:val="center"/>
             <ns0:tcBorders>
-              <ns0:top ns0:val="single" ns0:sz="4" ns0:color="D9D9D9"/>
-              <ns0:left ns0:val="single" ns0:sz="4" ns0:color="D9D9D9"/>
-              <ns0:bottom ns0:val="single" ns0:sz="4" ns0:color="D9D9D9"/>
-              <ns0:right ns0:val="single" ns0:sz="4" ns0:color="D9D9D9"/>
+              <ns0:top ns0:color="D9D9D9" ns0:sz="4" ns0:val="single"/>
+              <ns0:left ns0:color="D9D9D9" ns0:sz="4" ns0:val="single"/>
+              <ns0:bottom ns0:color="D9D9D9" ns0:sz="4" ns0:val="single"/>
+              <ns0:right ns0:color="D9D9D9" ns0:sz="4" ns0:val="single"/>
             </ns0:tcBorders>
             <ns0:tcMar>
-              <ns0:top ns0:w="95" ns0:type="dxa"/>
-              <ns0:left ns0:w="95" ns0:type="dxa"/>
-              <ns0:bottom ns0:w="95" ns0:type="dxa"/>
-              <ns0:right ns0:w="95" ns0:type="dxa"/>
+              <ns0:top ns0:type="dxa" ns0:w="95"/>
+              <ns0:left ns0:type="dxa" ns0:w="95"/>
+              <ns0:bottom ns0:type="dxa" ns0:w="95"/>
+              <ns0:right ns0:type="dxa" ns0:w="95"/>
             </ns0:tcMar>
           </ns0:tcPr>
           <ns0:p>
@@ -3684,16 +3684,16 @@
             <ns0:vAlign ns0:val="center"/>
             <ns0:shd ns0:fill="FAFAFA"/>
             <ns0:tcBorders>
-              <ns0:top ns0:val="single" ns0:sz="4" ns0:color="D9D9D9"/>
-              <ns0:left ns0:val="single" ns0:sz="4" ns0:color="D9D9D9"/>
-              <ns0:bottom ns0:val="single" ns0:sz="4" ns0:color="D9D9D9"/>
-              <ns0:right ns0:val="single" ns0:sz="4" ns0:color="D9D9D9"/>
+              <ns0:top ns0:color="D9D9D9" ns0:sz="4" ns0:val="single"/>
+              <ns0:left ns0:color="D9D9D9" ns0:sz="4" ns0:val="single"/>
+              <ns0:bottom ns0:color="D9D9D9" ns0:sz="4" ns0:val="single"/>
+              <ns0:right ns0:color="D9D9D9" ns0:sz="4" ns0:val="single"/>
             </ns0:tcBorders>
             <ns0:tcMar>
-              <ns0:top ns0:w="95" ns0:type="dxa"/>
-              <ns0:left ns0:w="95" ns0:type="dxa"/>
-              <ns0:bottom ns0:w="95" ns0:type="dxa"/>
-              <ns0:right ns0:w="95" ns0:type="dxa"/>
+              <ns0:top ns0:type="dxa" ns0:w="95"/>
+              <ns0:left ns0:type="dxa" ns0:w="95"/>
+              <ns0:bottom ns0:type="dxa" ns0:w="95"/>
+              <ns0:right ns0:type="dxa" ns0:w="95"/>
             </ns0:tcMar>
           </ns0:tcPr>
           <ns0:p>
@@ -3717,16 +3717,16 @@
             <ns0:vAlign ns0:val="center"/>
             <ns0:shd ns0:fill="FAFAFA"/>
             <ns0:tcBorders>
-              <ns0:top ns0:val="single" ns0:sz="4" ns0:color="D9D9D9"/>
-              <ns0:left ns0:val="single" ns0:sz="4" ns0:color="D9D9D9"/>
-              <ns0:bottom ns0:val="single" ns0:sz="4" ns0:color="D9D9D9"/>
-              <ns0:right ns0:val="single" ns0:sz="4" ns0:color="D9D9D9"/>
+              <ns0:top ns0:color="D9D9D9" ns0:sz="4" ns0:val="single"/>
+              <ns0:left ns0:color="D9D9D9" ns0:sz="4" ns0:val="single"/>
+              <ns0:bottom ns0:color="D9D9D9" ns0:sz="4" ns0:val="single"/>
+              <ns0:right ns0:color="D9D9D9" ns0:sz="4" ns0:val="single"/>
             </ns0:tcBorders>
             <ns0:tcMar>
-              <ns0:top ns0:w="95" ns0:type="dxa"/>
-              <ns0:left ns0:w="95" ns0:type="dxa"/>
-              <ns0:bottom ns0:w="95" ns0:type="dxa"/>
-              <ns0:right ns0:w="95" ns0:type="dxa"/>
+              <ns0:top ns0:type="dxa" ns0:w="95"/>
+              <ns0:left ns0:type="dxa" ns0:w="95"/>
+              <ns0:bottom ns0:type="dxa" ns0:w="95"/>
+              <ns0:right ns0:type="dxa" ns0:w="95"/>
             </ns0:tcMar>
           </ns0:tcPr>
           <ns0:p>
@@ -3750,16 +3750,16 @@
             <ns0:vAlign ns0:val="center"/>
             <ns0:shd ns0:fill="FAFAFA"/>
             <ns0:tcBorders>
-              <ns0:top ns0:val="single" ns0:sz="4" ns0:color="D9D9D9"/>
-              <ns0:left ns0:val="single" ns0:sz="4" ns0:color="D9D9D9"/>
-              <ns0:bottom ns0:val="single" ns0:sz="4" ns0:color="D9D9D9"/>
-              <ns0:right ns0:val="single" ns0:sz="4" ns0:color="D9D9D9"/>
+              <ns0:top ns0:color="D9D9D9" ns0:sz="4" ns0:val="single"/>
+              <ns0:left ns0:color="D9D9D9" ns0:sz="4" ns0:val="single"/>
+              <ns0:bottom ns0:color="D9D9D9" ns0:sz="4" ns0:val="single"/>
+              <ns0:right ns0:color="D9D9D9" ns0:sz="4" ns0:val="single"/>
             </ns0:tcBorders>
             <ns0:tcMar>
-              <ns0:top ns0:w="95" ns0:type="dxa"/>
-              <ns0:left ns0:w="95" ns0:type="dxa"/>
-              <ns0:bottom ns0:w="95" ns0:type="dxa"/>
-              <ns0:right ns0:w="95" ns0:type="dxa"/>
+              <ns0:top ns0:type="dxa" ns0:w="95"/>
+              <ns0:left ns0:type="dxa" ns0:w="95"/>
+              <ns0:bottom ns0:type="dxa" ns0:w="95"/>
+              <ns0:right ns0:type="dxa" ns0:w="95"/>
             </ns0:tcMar>
           </ns0:tcPr>
           <ns0:p>
@@ -3787,16 +3787,16 @@
             <ns0:tcW ns0:type="dxa" ns0:w="1701"/>
             <ns0:vAlign ns0:val="center"/>
             <ns0:tcBorders>
-              <ns0:top ns0:val="single" ns0:sz="4" ns0:color="D9D9D9"/>
-              <ns0:left ns0:val="single" ns0:sz="4" ns0:color="D9D9D9"/>
-              <ns0:bottom ns0:val="single" ns0:sz="4" ns0:color="D9D9D9"/>
-              <ns0:right ns0:val="single" ns0:sz="4" ns0:color="D9D9D9"/>
+              <ns0:top ns0:color="D9D9D9" ns0:sz="4" ns0:val="single"/>
+              <ns0:left ns0:color="D9D9D9" ns0:sz="4" ns0:val="single"/>
+              <ns0:bottom ns0:color="D9D9D9" ns0:sz="4" ns0:val="single"/>
+              <ns0:right ns0:color="D9D9D9" ns0:sz="4" ns0:val="single"/>
             </ns0:tcBorders>
             <ns0:tcMar>
-              <ns0:top ns0:w="95" ns0:type="dxa"/>
-              <ns0:left ns0:w="95" ns0:type="dxa"/>
-              <ns0:bottom ns0:w="95" ns0:type="dxa"/>
-              <ns0:right ns0:w="95" ns0:type="dxa"/>
+              <ns0:top ns0:type="dxa" ns0:w="95"/>
+              <ns0:left ns0:type="dxa" ns0:w="95"/>
+              <ns0:bottom ns0:type="dxa" ns0:w="95"/>
+              <ns0:right ns0:type="dxa" ns0:w="95"/>
             </ns0:tcMar>
           </ns0:tcPr>
           <ns0:p>
@@ -3819,16 +3819,16 @@
             <ns0:tcW ns0:type="dxa" ns0:w="5216"/>
             <ns0:vAlign ns0:val="center"/>
             <ns0:tcBorders>
-              <ns0:top ns0:val="single" ns0:sz="4" ns0:color="D9D9D9"/>
-              <ns0:left ns0:val="single" ns0:sz="4" ns0:color="D9D9D9"/>
-              <ns0:bottom ns0:val="single" ns0:sz="4" ns0:color="D9D9D9"/>
-              <ns0:right ns0:val="single" ns0:sz="4" ns0:color="D9D9D9"/>
+              <ns0:top ns0:color="D9D9D9" ns0:sz="4" ns0:val="single"/>
+              <ns0:left ns0:color="D9D9D9" ns0:sz="4" ns0:val="single"/>
+              <ns0:bottom ns0:color="D9D9D9" ns0:sz="4" ns0:val="single"/>
+              <ns0:right ns0:color="D9D9D9" ns0:sz="4" ns0:val="single"/>
             </ns0:tcBorders>
             <ns0:tcMar>
-              <ns0:top ns0:w="95" ns0:type="dxa"/>
-              <ns0:left ns0:w="95" ns0:type="dxa"/>
-              <ns0:bottom ns0:w="95" ns0:type="dxa"/>
-              <ns0:right ns0:w="95" ns0:type="dxa"/>
+              <ns0:top ns0:type="dxa" ns0:w="95"/>
+              <ns0:left ns0:type="dxa" ns0:w="95"/>
+              <ns0:bottom ns0:type="dxa" ns0:w="95"/>
+              <ns0:right ns0:type="dxa" ns0:w="95"/>
             </ns0:tcMar>
           </ns0:tcPr>
           <ns0:p>
@@ -3851,16 +3851,16 @@
             <ns0:tcW ns0:type="dxa" ns0:w="1984"/>
             <ns0:vAlign ns0:val="center"/>
             <ns0:tcBorders>
-              <ns0:top ns0:val="single" ns0:sz="4" ns0:color="D9D9D9"/>
-              <ns0:left ns0:val="single" ns0:sz="4" ns0:color="D9D9D9"/>
-              <ns0:bottom ns0:val="single" ns0:sz="4" ns0:color="D9D9D9"/>
-              <ns0:right ns0:val="single" ns0:sz="4" ns0:color="D9D9D9"/>
+              <ns0:top ns0:color="D9D9D9" ns0:sz="4" ns0:val="single"/>
+              <ns0:left ns0:color="D9D9D9" ns0:sz="4" ns0:val="single"/>
+              <ns0:bottom ns0:color="D9D9D9" ns0:sz="4" ns0:val="single"/>
+              <ns0:right ns0:color="D9D9D9" ns0:sz="4" ns0:val="single"/>
             </ns0:tcBorders>
             <ns0:tcMar>
-              <ns0:top ns0:w="95" ns0:type="dxa"/>
-              <ns0:left ns0:w="95" ns0:type="dxa"/>
-              <ns0:bottom ns0:w="95" ns0:type="dxa"/>
-              <ns0:right ns0:w="95" ns0:type="dxa"/>
+              <ns0:top ns0:type="dxa" ns0:w="95"/>
+              <ns0:left ns0:type="dxa" ns0:w="95"/>
+              <ns0:bottom ns0:type="dxa" ns0:w="95"/>
+              <ns0:right ns0:type="dxa" ns0:w="95"/>
             </ns0:tcMar>
           </ns0:tcPr>
           <ns0:p>
@@ -3899,13 +3899,13 @@
     </ns0:p>
     <ns0:p>
       <ns0:r>
-        <ns0:t>These requirements derive from the project concept and research implications. They are proposed criteria, not findings from users. “Must” denotes a condition for the first integrated story-to-playable-game path; the supported mechanics and numeric bounds remain to be approved.</ns0:t>
+        <ns0:t>These initial requirements translate the project concept and research implications into proposed acceptance criteria. “Must” denotes a condition for the first integrated story-to-playable-game path. Scope review will define the supported mechanics and numeric bounds.</ns0:t>
       </ns0:r>
     </ns0:p>
     <ns0:p>
       <ns0:pPr>
         <ns0:keepNext/>
-        <ns0:spacing ns0:before="160" ns0:after="80"/>
+        <ns0:spacing ns0:after="80" ns0:before="160"/>
         <ns0:ind ns0:firstLine="0"/>
         <ns0:jc ns0:val="left"/>
       </ns0:pPr>
@@ -3940,16 +3940,16 @@
             <ns0:vAlign ns0:val="center"/>
             <ns0:shd ns0:fill="F1F1F1"/>
             <ns0:tcBorders>
-              <ns0:top ns0:val="single" ns0:sz="4" ns0:color="D9D9D9"/>
-              <ns0:left ns0:val="single" ns0:sz="4" ns0:color="D9D9D9"/>
-              <ns0:bottom ns0:val="single" ns0:sz="4" ns0:color="D9D9D9"/>
-              <ns0:right ns0:val="single" ns0:sz="4" ns0:color="D9D9D9"/>
+              <ns0:top ns0:color="D9D9D9" ns0:sz="4" ns0:val="single"/>
+              <ns0:left ns0:color="D9D9D9" ns0:sz="4" ns0:val="single"/>
+              <ns0:bottom ns0:color="D9D9D9" ns0:sz="4" ns0:val="single"/>
+              <ns0:right ns0:color="D9D9D9" ns0:sz="4" ns0:val="single"/>
             </ns0:tcBorders>
             <ns0:tcMar>
-              <ns0:top ns0:w="95" ns0:type="dxa"/>
-              <ns0:left ns0:w="95" ns0:type="dxa"/>
-              <ns0:bottom ns0:w="95" ns0:type="dxa"/>
-              <ns0:right ns0:w="95" ns0:type="dxa"/>
+              <ns0:top ns0:type="dxa" ns0:w="95"/>
+              <ns0:left ns0:type="dxa" ns0:w="95"/>
+              <ns0:bottom ns0:type="dxa" ns0:w="95"/>
+              <ns0:right ns0:type="dxa" ns0:w="95"/>
             </ns0:tcMar>
           </ns0:tcPr>
           <ns0:p>
@@ -3974,16 +3974,16 @@
             <ns0:vAlign ns0:val="center"/>
             <ns0:shd ns0:fill="F1F1F1"/>
             <ns0:tcBorders>
-              <ns0:top ns0:val="single" ns0:sz="4" ns0:color="D9D9D9"/>
-              <ns0:left ns0:val="single" ns0:sz="4" ns0:color="D9D9D9"/>
-              <ns0:bottom ns0:val="single" ns0:sz="4" ns0:color="D9D9D9"/>
-              <ns0:right ns0:val="single" ns0:sz="4" ns0:color="D9D9D9"/>
+              <ns0:top ns0:color="D9D9D9" ns0:sz="4" ns0:val="single"/>
+              <ns0:left ns0:color="D9D9D9" ns0:sz="4" ns0:val="single"/>
+              <ns0:bottom ns0:color="D9D9D9" ns0:sz="4" ns0:val="single"/>
+              <ns0:right ns0:color="D9D9D9" ns0:sz="4" ns0:val="single"/>
             </ns0:tcBorders>
             <ns0:tcMar>
-              <ns0:top ns0:w="95" ns0:type="dxa"/>
-              <ns0:left ns0:w="95" ns0:type="dxa"/>
-              <ns0:bottom ns0:w="95" ns0:type="dxa"/>
-              <ns0:right ns0:w="95" ns0:type="dxa"/>
+              <ns0:top ns0:type="dxa" ns0:w="95"/>
+              <ns0:left ns0:type="dxa" ns0:w="95"/>
+              <ns0:bottom ns0:type="dxa" ns0:w="95"/>
+              <ns0:right ns0:type="dxa" ns0:w="95"/>
             </ns0:tcMar>
           </ns0:tcPr>
           <ns0:p>
@@ -4008,16 +4008,16 @@
             <ns0:vAlign ns0:val="center"/>
             <ns0:shd ns0:fill="F1F1F1"/>
             <ns0:tcBorders>
-              <ns0:top ns0:val="single" ns0:sz="4" ns0:color="D9D9D9"/>
-              <ns0:left ns0:val="single" ns0:sz="4" ns0:color="D9D9D9"/>
-              <ns0:bottom ns0:val="single" ns0:sz="4" ns0:color="D9D9D9"/>
-              <ns0:right ns0:val="single" ns0:sz="4" ns0:color="D9D9D9"/>
+              <ns0:top ns0:color="D9D9D9" ns0:sz="4" ns0:val="single"/>
+              <ns0:left ns0:color="D9D9D9" ns0:sz="4" ns0:val="single"/>
+              <ns0:bottom ns0:color="D9D9D9" ns0:sz="4" ns0:val="single"/>
+              <ns0:right ns0:color="D9D9D9" ns0:sz="4" ns0:val="single"/>
             </ns0:tcBorders>
             <ns0:tcMar>
-              <ns0:top ns0:w="95" ns0:type="dxa"/>
-              <ns0:left ns0:w="95" ns0:type="dxa"/>
-              <ns0:bottom ns0:w="95" ns0:type="dxa"/>
-              <ns0:right ns0:w="95" ns0:type="dxa"/>
+              <ns0:top ns0:type="dxa" ns0:w="95"/>
+              <ns0:left ns0:type="dxa" ns0:w="95"/>
+              <ns0:bottom ns0:type="dxa" ns0:w="95"/>
+              <ns0:right ns0:type="dxa" ns0:w="95"/>
             </ns0:tcMar>
           </ns0:tcPr>
           <ns0:p>
@@ -4046,16 +4046,16 @@
             <ns0:tcW ns0:type="dxa" ns0:w="1134"/>
             <ns0:vAlign ns0:val="center"/>
             <ns0:tcBorders>
-              <ns0:top ns0:val="single" ns0:sz="4" ns0:color="D9D9D9"/>
-              <ns0:left ns0:val="single" ns0:sz="4" ns0:color="D9D9D9"/>
-              <ns0:bottom ns0:val="single" ns0:sz="4" ns0:color="D9D9D9"/>
-              <ns0:right ns0:val="single" ns0:sz="4" ns0:color="D9D9D9"/>
+              <ns0:top ns0:color="D9D9D9" ns0:sz="4" ns0:val="single"/>
+              <ns0:left ns0:color="D9D9D9" ns0:sz="4" ns0:val="single"/>
+              <ns0:bottom ns0:color="D9D9D9" ns0:sz="4" ns0:val="single"/>
+              <ns0:right ns0:color="D9D9D9" ns0:sz="4" ns0:val="single"/>
             </ns0:tcBorders>
             <ns0:tcMar>
-              <ns0:top ns0:w="95" ns0:type="dxa"/>
-              <ns0:left ns0:w="95" ns0:type="dxa"/>
-              <ns0:bottom ns0:w="95" ns0:type="dxa"/>
-              <ns0:right ns0:w="95" ns0:type="dxa"/>
+              <ns0:top ns0:type="dxa" ns0:w="95"/>
+              <ns0:left ns0:type="dxa" ns0:w="95"/>
+              <ns0:bottom ns0:type="dxa" ns0:w="95"/>
+              <ns0:right ns0:type="dxa" ns0:w="95"/>
             </ns0:tcMar>
           </ns0:tcPr>
           <ns0:p>
@@ -4078,16 +4078,16 @@
             <ns0:tcW ns0:type="dxa" ns0:w="1417"/>
             <ns0:vAlign ns0:val="center"/>
             <ns0:tcBorders>
-              <ns0:top ns0:val="single" ns0:sz="4" ns0:color="D9D9D9"/>
-              <ns0:left ns0:val="single" ns0:sz="4" ns0:color="D9D9D9"/>
-              <ns0:bottom ns0:val="single" ns0:sz="4" ns0:color="D9D9D9"/>
-              <ns0:right ns0:val="single" ns0:sz="4" ns0:color="D9D9D9"/>
+              <ns0:top ns0:color="D9D9D9" ns0:sz="4" ns0:val="single"/>
+              <ns0:left ns0:color="D9D9D9" ns0:sz="4" ns0:val="single"/>
+              <ns0:bottom ns0:color="D9D9D9" ns0:sz="4" ns0:val="single"/>
+              <ns0:right ns0:color="D9D9D9" ns0:sz="4" ns0:val="single"/>
             </ns0:tcBorders>
             <ns0:tcMar>
-              <ns0:top ns0:w="95" ns0:type="dxa"/>
-              <ns0:left ns0:w="95" ns0:type="dxa"/>
-              <ns0:bottom ns0:w="95" ns0:type="dxa"/>
-              <ns0:right ns0:w="95" ns0:type="dxa"/>
+              <ns0:top ns0:type="dxa" ns0:w="95"/>
+              <ns0:left ns0:type="dxa" ns0:w="95"/>
+              <ns0:bottom ns0:type="dxa" ns0:w="95"/>
+              <ns0:right ns0:type="dxa" ns0:w="95"/>
             </ns0:tcMar>
           </ns0:tcPr>
           <ns0:p>
@@ -4110,16 +4110,16 @@
             <ns0:tcW ns0:type="dxa" ns0:w="6350"/>
             <ns0:vAlign ns0:val="center"/>
             <ns0:tcBorders>
-              <ns0:top ns0:val="single" ns0:sz="4" ns0:color="D9D9D9"/>
-              <ns0:left ns0:val="single" ns0:sz="4" ns0:color="D9D9D9"/>
-              <ns0:bottom ns0:val="single" ns0:sz="4" ns0:color="D9D9D9"/>
-              <ns0:right ns0:val="single" ns0:sz="4" ns0:color="D9D9D9"/>
+              <ns0:top ns0:color="D9D9D9" ns0:sz="4" ns0:val="single"/>
+              <ns0:left ns0:color="D9D9D9" ns0:sz="4" ns0:val="single"/>
+              <ns0:bottom ns0:color="D9D9D9" ns0:sz="4" ns0:val="single"/>
+              <ns0:right ns0:color="D9D9D9" ns0:sz="4" ns0:val="single"/>
             </ns0:tcBorders>
             <ns0:tcMar>
-              <ns0:top ns0:w="95" ns0:type="dxa"/>
-              <ns0:left ns0:w="95" ns0:type="dxa"/>
-              <ns0:bottom ns0:w="95" ns0:type="dxa"/>
-              <ns0:right ns0:w="95" ns0:type="dxa"/>
+              <ns0:top ns0:type="dxa" ns0:w="95"/>
+              <ns0:left ns0:type="dxa" ns0:w="95"/>
+              <ns0:bottom ns0:type="dxa" ns0:w="95"/>
+              <ns0:right ns0:type="dxa" ns0:w="95"/>
             </ns0:tcMar>
           </ns0:tcPr>
           <ns0:p>
@@ -4148,16 +4148,16 @@
             <ns0:vAlign ns0:val="center"/>
             <ns0:shd ns0:fill="FAFAFA"/>
             <ns0:tcBorders>
-              <ns0:top ns0:val="single" ns0:sz="4" ns0:color="D9D9D9"/>
-              <ns0:left ns0:val="single" ns0:sz="4" ns0:color="D9D9D9"/>
-              <ns0:bottom ns0:val="single" ns0:sz="4" ns0:color="D9D9D9"/>
-              <ns0:right ns0:val="single" ns0:sz="4" ns0:color="D9D9D9"/>
+              <ns0:top ns0:color="D9D9D9" ns0:sz="4" ns0:val="single"/>
+              <ns0:left ns0:color="D9D9D9" ns0:sz="4" ns0:val="single"/>
+              <ns0:bottom ns0:color="D9D9D9" ns0:sz="4" ns0:val="single"/>
+              <ns0:right ns0:color="D9D9D9" ns0:sz="4" ns0:val="single"/>
             </ns0:tcBorders>
             <ns0:tcMar>
-              <ns0:top ns0:w="95" ns0:type="dxa"/>
-              <ns0:left ns0:w="95" ns0:type="dxa"/>
-              <ns0:bottom ns0:w="95" ns0:type="dxa"/>
-              <ns0:right ns0:w="95" ns0:type="dxa"/>
+              <ns0:top ns0:type="dxa" ns0:w="95"/>
+              <ns0:left ns0:type="dxa" ns0:w="95"/>
+              <ns0:bottom ns0:type="dxa" ns0:w="95"/>
+              <ns0:right ns0:type="dxa" ns0:w="95"/>
             </ns0:tcMar>
           </ns0:tcPr>
           <ns0:p>
@@ -4181,16 +4181,16 @@
             <ns0:vAlign ns0:val="center"/>
             <ns0:shd ns0:fill="FAFAFA"/>
             <ns0:tcBorders>
-              <ns0:top ns0:val="single" ns0:sz="4" ns0:color="D9D9D9"/>
-              <ns0:left ns0:val="single" ns0:sz="4" ns0:color="D9D9D9"/>
-              <ns0:bottom ns0:val="single" ns0:sz="4" ns0:color="D9D9D9"/>
-              <ns0:right ns0:val="single" ns0:sz="4" ns0:color="D9D9D9"/>
+              <ns0:top ns0:color="D9D9D9" ns0:sz="4" ns0:val="single"/>
+              <ns0:left ns0:color="D9D9D9" ns0:sz="4" ns0:val="single"/>
+              <ns0:bottom ns0:color="D9D9D9" ns0:sz="4" ns0:val="single"/>
+              <ns0:right ns0:color="D9D9D9" ns0:sz="4" ns0:val="single"/>
             </ns0:tcBorders>
             <ns0:tcMar>
-              <ns0:top ns0:w="95" ns0:type="dxa"/>
-              <ns0:left ns0:w="95" ns0:type="dxa"/>
-              <ns0:bottom ns0:w="95" ns0:type="dxa"/>
-              <ns0:right ns0:w="95" ns0:type="dxa"/>
+              <ns0:top ns0:type="dxa" ns0:w="95"/>
+              <ns0:left ns0:type="dxa" ns0:w="95"/>
+              <ns0:bottom ns0:type="dxa" ns0:w="95"/>
+              <ns0:right ns0:type="dxa" ns0:w="95"/>
             </ns0:tcMar>
           </ns0:tcPr>
           <ns0:p>
@@ -4214,16 +4214,16 @@
             <ns0:vAlign ns0:val="center"/>
             <ns0:shd ns0:fill="FAFAFA"/>
             <ns0:tcBorders>
-              <ns0:top ns0:val="single" ns0:sz="4" ns0:color="D9D9D9"/>
-              <ns0:left ns0:val="single" ns0:sz="4" ns0:color="D9D9D9"/>
-              <ns0:bottom ns0:val="single" ns0:sz="4" ns0:color="D9D9D9"/>
-              <ns0:right ns0:val="single" ns0:sz="4" ns0:color="D9D9D9"/>
+              <ns0:top ns0:color="D9D9D9" ns0:sz="4" ns0:val="single"/>
+              <ns0:left ns0:color="D9D9D9" ns0:sz="4" ns0:val="single"/>
+              <ns0:bottom ns0:color="D9D9D9" ns0:sz="4" ns0:val="single"/>
+              <ns0:right ns0:color="D9D9D9" ns0:sz="4" ns0:val="single"/>
             </ns0:tcBorders>
             <ns0:tcMar>
-              <ns0:top ns0:w="95" ns0:type="dxa"/>
-              <ns0:left ns0:w="95" ns0:type="dxa"/>
-              <ns0:bottom ns0:w="95" ns0:type="dxa"/>
-              <ns0:right ns0:w="95" ns0:type="dxa"/>
+              <ns0:top ns0:type="dxa" ns0:w="95"/>
+              <ns0:left ns0:type="dxa" ns0:w="95"/>
+              <ns0:bottom ns0:type="dxa" ns0:w="95"/>
+              <ns0:right ns0:type="dxa" ns0:w="95"/>
             </ns0:tcMar>
           </ns0:tcPr>
           <ns0:p>
@@ -4251,16 +4251,16 @@
             <ns0:tcW ns0:type="dxa" ns0:w="1134"/>
             <ns0:vAlign ns0:val="center"/>
             <ns0:tcBorders>
-              <ns0:top ns0:val="single" ns0:sz="4" ns0:color="D9D9D9"/>
-              <ns0:left ns0:val="single" ns0:sz="4" ns0:color="D9D9D9"/>
-              <ns0:bottom ns0:val="single" ns0:sz="4" ns0:color="D9D9D9"/>
-              <ns0:right ns0:val="single" ns0:sz="4" ns0:color="D9D9D9"/>
+              <ns0:top ns0:color="D9D9D9" ns0:sz="4" ns0:val="single"/>
+              <ns0:left ns0:color="D9D9D9" ns0:sz="4" ns0:val="single"/>
+              <ns0:bottom ns0:color="D9D9D9" ns0:sz="4" ns0:val="single"/>
+              <ns0:right ns0:color="D9D9D9" ns0:sz="4" ns0:val="single"/>
             </ns0:tcBorders>
             <ns0:tcMar>
-              <ns0:top ns0:w="95" ns0:type="dxa"/>
-              <ns0:left ns0:w="95" ns0:type="dxa"/>
-              <ns0:bottom ns0:w="95" ns0:type="dxa"/>
-              <ns0:right ns0:w="95" ns0:type="dxa"/>
+              <ns0:top ns0:type="dxa" ns0:w="95"/>
+              <ns0:left ns0:type="dxa" ns0:w="95"/>
+              <ns0:bottom ns0:type="dxa" ns0:w="95"/>
+              <ns0:right ns0:type="dxa" ns0:w="95"/>
             </ns0:tcMar>
           </ns0:tcPr>
           <ns0:p>
@@ -4283,16 +4283,16 @@
             <ns0:tcW ns0:type="dxa" ns0:w="1417"/>
             <ns0:vAlign ns0:val="center"/>
             <ns0:tcBorders>
-              <ns0:top ns0:val="single" ns0:sz="4" ns0:color="D9D9D9"/>
-              <ns0:left ns0:val="single" ns0:sz="4" ns0:color="D9D9D9"/>
-              <ns0:bottom ns0:val="single" ns0:sz="4" ns0:color="D9D9D9"/>
-              <ns0:right ns0:val="single" ns0:sz="4" ns0:color="D9D9D9"/>
+              <ns0:top ns0:color="D9D9D9" ns0:sz="4" ns0:val="single"/>
+              <ns0:left ns0:color="D9D9D9" ns0:sz="4" ns0:val="single"/>
+              <ns0:bottom ns0:color="D9D9D9" ns0:sz="4" ns0:val="single"/>
+              <ns0:right ns0:color="D9D9D9" ns0:sz="4" ns0:val="single"/>
             </ns0:tcBorders>
             <ns0:tcMar>
-              <ns0:top ns0:w="95" ns0:type="dxa"/>
-              <ns0:left ns0:w="95" ns0:type="dxa"/>
-              <ns0:bottom ns0:w="95" ns0:type="dxa"/>
-              <ns0:right ns0:w="95" ns0:type="dxa"/>
+              <ns0:top ns0:type="dxa" ns0:w="95"/>
+              <ns0:left ns0:type="dxa" ns0:w="95"/>
+              <ns0:bottom ns0:type="dxa" ns0:w="95"/>
+              <ns0:right ns0:type="dxa" ns0:w="95"/>
             </ns0:tcMar>
           </ns0:tcPr>
           <ns0:p>
@@ -4315,16 +4315,16 @@
             <ns0:tcW ns0:type="dxa" ns0:w="6350"/>
             <ns0:vAlign ns0:val="center"/>
             <ns0:tcBorders>
-              <ns0:top ns0:val="single" ns0:sz="4" ns0:color="D9D9D9"/>
-              <ns0:left ns0:val="single" ns0:sz="4" ns0:color="D9D9D9"/>
-              <ns0:bottom ns0:val="single" ns0:sz="4" ns0:color="D9D9D9"/>
-              <ns0:right ns0:val="single" ns0:sz="4" ns0:color="D9D9D9"/>
+              <ns0:top ns0:color="D9D9D9" ns0:sz="4" ns0:val="single"/>
+              <ns0:left ns0:color="D9D9D9" ns0:sz="4" ns0:val="single"/>
+              <ns0:bottom ns0:color="D9D9D9" ns0:sz="4" ns0:val="single"/>
+              <ns0:right ns0:color="D9D9D9" ns0:sz="4" ns0:val="single"/>
             </ns0:tcBorders>
             <ns0:tcMar>
-              <ns0:top ns0:w="95" ns0:type="dxa"/>
-              <ns0:left ns0:w="95" ns0:type="dxa"/>
-              <ns0:bottom ns0:w="95" ns0:type="dxa"/>
-              <ns0:right ns0:w="95" ns0:type="dxa"/>
+              <ns0:top ns0:type="dxa" ns0:w="95"/>
+              <ns0:left ns0:type="dxa" ns0:w="95"/>
+              <ns0:bottom ns0:type="dxa" ns0:w="95"/>
+              <ns0:right ns0:type="dxa" ns0:w="95"/>
             </ns0:tcMar>
           </ns0:tcPr>
           <ns0:p>
@@ -4353,16 +4353,16 @@
             <ns0:vAlign ns0:val="center"/>
             <ns0:shd ns0:fill="FAFAFA"/>
             <ns0:tcBorders>
-              <ns0:top ns0:val="single" ns0:sz="4" ns0:color="D9D9D9"/>
-              <ns0:left ns0:val="single" ns0:sz="4" ns0:color="D9D9D9"/>
-              <ns0:bottom ns0:val="single" ns0:sz="4" ns0:color="D9D9D9"/>
-              <ns0:right ns0:val="single" ns0:sz="4" ns0:color="D9D9D9"/>
+              <ns0:top ns0:color="D9D9D9" ns0:sz="4" ns0:val="single"/>
+              <ns0:left ns0:color="D9D9D9" ns0:sz="4" ns0:val="single"/>
+              <ns0:bottom ns0:color="D9D9D9" ns0:sz="4" ns0:val="single"/>
+              <ns0:right ns0:color="D9D9D9" ns0:sz="4" ns0:val="single"/>
             </ns0:tcBorders>
             <ns0:tcMar>
-              <ns0:top ns0:w="95" ns0:type="dxa"/>
-              <ns0:left ns0:w="95" ns0:type="dxa"/>
-              <ns0:bottom ns0:w="95" ns0:type="dxa"/>
-              <ns0:right ns0:w="95" ns0:type="dxa"/>
+              <ns0:top ns0:type="dxa" ns0:w="95"/>
+              <ns0:left ns0:type="dxa" ns0:w="95"/>
+              <ns0:bottom ns0:type="dxa" ns0:w="95"/>
+              <ns0:right ns0:type="dxa" ns0:w="95"/>
             </ns0:tcMar>
           </ns0:tcPr>
           <ns0:p>
@@ -4386,16 +4386,16 @@
             <ns0:vAlign ns0:val="center"/>
             <ns0:shd ns0:fill="FAFAFA"/>
             <ns0:tcBorders>
-              <ns0:top ns0:val="single" ns0:sz="4" ns0:color="D9D9D9"/>
-              <ns0:left ns0:val="single" ns0:sz="4" ns0:color="D9D9D9"/>
-              <ns0:bottom ns0:val="single" ns0:sz="4" ns0:color="D9D9D9"/>
-              <ns0:right ns0:val="single" ns0:sz="4" ns0:color="D9D9D9"/>
+              <ns0:top ns0:color="D9D9D9" ns0:sz="4" ns0:val="single"/>
+              <ns0:left ns0:color="D9D9D9" ns0:sz="4" ns0:val="single"/>
+              <ns0:bottom ns0:color="D9D9D9" ns0:sz="4" ns0:val="single"/>
+              <ns0:right ns0:color="D9D9D9" ns0:sz="4" ns0:val="single"/>
             </ns0:tcBorders>
             <ns0:tcMar>
-              <ns0:top ns0:w="95" ns0:type="dxa"/>
-              <ns0:left ns0:w="95" ns0:type="dxa"/>
-              <ns0:bottom ns0:w="95" ns0:type="dxa"/>
-              <ns0:right ns0:w="95" ns0:type="dxa"/>
+              <ns0:top ns0:type="dxa" ns0:w="95"/>
+              <ns0:left ns0:type="dxa" ns0:w="95"/>
+              <ns0:bottom ns0:type="dxa" ns0:w="95"/>
+              <ns0:right ns0:type="dxa" ns0:w="95"/>
             </ns0:tcMar>
           </ns0:tcPr>
           <ns0:p>
@@ -4419,16 +4419,16 @@
             <ns0:vAlign ns0:val="center"/>
             <ns0:shd ns0:fill="FAFAFA"/>
             <ns0:tcBorders>
-              <ns0:top ns0:val="single" ns0:sz="4" ns0:color="D9D9D9"/>
-              <ns0:left ns0:val="single" ns0:sz="4" ns0:color="D9D9D9"/>
-              <ns0:bottom ns0:val="single" ns0:sz="4" ns0:color="D9D9D9"/>
-              <ns0:right ns0:val="single" ns0:sz="4" ns0:color="D9D9D9"/>
+              <ns0:top ns0:color="D9D9D9" ns0:sz="4" ns0:val="single"/>
+              <ns0:left ns0:color="D9D9D9" ns0:sz="4" ns0:val="single"/>
+              <ns0:bottom ns0:color="D9D9D9" ns0:sz="4" ns0:val="single"/>
+              <ns0:right ns0:color="D9D9D9" ns0:sz="4" ns0:val="single"/>
             </ns0:tcBorders>
             <ns0:tcMar>
-              <ns0:top ns0:w="95" ns0:type="dxa"/>
-              <ns0:left ns0:w="95" ns0:type="dxa"/>
-              <ns0:bottom ns0:w="95" ns0:type="dxa"/>
-              <ns0:right ns0:w="95" ns0:type="dxa"/>
+              <ns0:top ns0:type="dxa" ns0:w="95"/>
+              <ns0:left ns0:type="dxa" ns0:w="95"/>
+              <ns0:bottom ns0:type="dxa" ns0:w="95"/>
+              <ns0:right ns0:type="dxa" ns0:w="95"/>
             </ns0:tcMar>
           </ns0:tcPr>
           <ns0:p>
@@ -4442,7 +4442,7 @@
                 <ns0:rFonts ns0:ascii="Times New Roman" ns0:hAnsi="Times New Roman"/>
                 <ns0:sz ns0:val="21"/>
               </ns0:rPr>
-              <ns0:t>Any replacement or omission of a requested mechanic is stated with a reason; a result that cannot preserve the central goal fails visibly.</ns0:t>
+              <ns0:t>Any replacement or omission of a requested mechanic is stated with a reason; a result that cannot preserve the central goal and indispensable player action fails visibly.</ns0:t>
             </ns0:r>
           </ns0:p>
         </ns0:tc>
@@ -4456,16 +4456,16 @@
             <ns0:tcW ns0:type="dxa" ns0:w="1134"/>
             <ns0:vAlign ns0:val="center"/>
             <ns0:tcBorders>
-              <ns0:top ns0:val="single" ns0:sz="4" ns0:color="D9D9D9"/>
-              <ns0:left ns0:val="single" ns0:sz="4" ns0:color="D9D9D9"/>
-              <ns0:bottom ns0:val="single" ns0:sz="4" ns0:color="D9D9D9"/>
-              <ns0:right ns0:val="single" ns0:sz="4" ns0:color="D9D9D9"/>
+              <ns0:top ns0:color="D9D9D9" ns0:sz="4" ns0:val="single"/>
+              <ns0:left ns0:color="D9D9D9" ns0:sz="4" ns0:val="single"/>
+              <ns0:bottom ns0:color="D9D9D9" ns0:sz="4" ns0:val="single"/>
+              <ns0:right ns0:color="D9D9D9" ns0:sz="4" ns0:val="single"/>
             </ns0:tcBorders>
             <ns0:tcMar>
-              <ns0:top ns0:w="95" ns0:type="dxa"/>
-              <ns0:left ns0:w="95" ns0:type="dxa"/>
-              <ns0:bottom ns0:w="95" ns0:type="dxa"/>
-              <ns0:right ns0:w="95" ns0:type="dxa"/>
+              <ns0:top ns0:type="dxa" ns0:w="95"/>
+              <ns0:left ns0:type="dxa" ns0:w="95"/>
+              <ns0:bottom ns0:type="dxa" ns0:w="95"/>
+              <ns0:right ns0:type="dxa" ns0:w="95"/>
             </ns0:tcMar>
           </ns0:tcPr>
           <ns0:p>
@@ -4488,16 +4488,16 @@
             <ns0:tcW ns0:type="dxa" ns0:w="1417"/>
             <ns0:vAlign ns0:val="center"/>
             <ns0:tcBorders>
-              <ns0:top ns0:val="single" ns0:sz="4" ns0:color="D9D9D9"/>
-              <ns0:left ns0:val="single" ns0:sz="4" ns0:color="D9D9D9"/>
-              <ns0:bottom ns0:val="single" ns0:sz="4" ns0:color="D9D9D9"/>
-              <ns0:right ns0:val="single" ns0:sz="4" ns0:color="D9D9D9"/>
+              <ns0:top ns0:color="D9D9D9" ns0:sz="4" ns0:val="single"/>
+              <ns0:left ns0:color="D9D9D9" ns0:sz="4" ns0:val="single"/>
+              <ns0:bottom ns0:color="D9D9D9" ns0:sz="4" ns0:val="single"/>
+              <ns0:right ns0:color="D9D9D9" ns0:sz="4" ns0:val="single"/>
             </ns0:tcBorders>
             <ns0:tcMar>
-              <ns0:top ns0:w="95" ns0:type="dxa"/>
-              <ns0:left ns0:w="95" ns0:type="dxa"/>
-              <ns0:bottom ns0:w="95" ns0:type="dxa"/>
-              <ns0:right ns0:w="95" ns0:type="dxa"/>
+              <ns0:top ns0:type="dxa" ns0:w="95"/>
+              <ns0:left ns0:type="dxa" ns0:w="95"/>
+              <ns0:bottom ns0:type="dxa" ns0:w="95"/>
+              <ns0:right ns0:type="dxa" ns0:w="95"/>
             </ns0:tcMar>
           </ns0:tcPr>
           <ns0:p>
@@ -4520,16 +4520,16 @@
             <ns0:tcW ns0:type="dxa" ns0:w="6350"/>
             <ns0:vAlign ns0:val="center"/>
             <ns0:tcBorders>
-              <ns0:top ns0:val="single" ns0:sz="4" ns0:color="D9D9D9"/>
-              <ns0:left ns0:val="single" ns0:sz="4" ns0:color="D9D9D9"/>
-              <ns0:bottom ns0:val="single" ns0:sz="4" ns0:color="D9D9D9"/>
-              <ns0:right ns0:val="single" ns0:sz="4" ns0:color="D9D9D9"/>
+              <ns0:top ns0:color="D9D9D9" ns0:sz="4" ns0:val="single"/>
+              <ns0:left ns0:color="D9D9D9" ns0:sz="4" ns0:val="single"/>
+              <ns0:bottom ns0:color="D9D9D9" ns0:sz="4" ns0:val="single"/>
+              <ns0:right ns0:color="D9D9D9" ns0:sz="4" ns0:val="single"/>
             </ns0:tcBorders>
             <ns0:tcMar>
-              <ns0:top ns0:w="95" ns0:type="dxa"/>
-              <ns0:left ns0:w="95" ns0:type="dxa"/>
-              <ns0:bottom ns0:w="95" ns0:type="dxa"/>
-              <ns0:right ns0:w="95" ns0:type="dxa"/>
+              <ns0:top ns0:type="dxa" ns0:w="95"/>
+              <ns0:left ns0:type="dxa" ns0:w="95"/>
+              <ns0:bottom ns0:type="dxa" ns0:w="95"/>
+              <ns0:right ns0:type="dxa" ns0:w="95"/>
             </ns0:tcMar>
           </ns0:tcPr>
           <ns0:p>
@@ -4558,16 +4558,16 @@
             <ns0:vAlign ns0:val="center"/>
             <ns0:shd ns0:fill="FAFAFA"/>
             <ns0:tcBorders>
-              <ns0:top ns0:val="single" ns0:sz="4" ns0:color="D9D9D9"/>
-              <ns0:left ns0:val="single" ns0:sz="4" ns0:color="D9D9D9"/>
-              <ns0:bottom ns0:val="single" ns0:sz="4" ns0:color="D9D9D9"/>
-              <ns0:right ns0:val="single" ns0:sz="4" ns0:color="D9D9D9"/>
+              <ns0:top ns0:color="D9D9D9" ns0:sz="4" ns0:val="single"/>
+              <ns0:left ns0:color="D9D9D9" ns0:sz="4" ns0:val="single"/>
+              <ns0:bottom ns0:color="D9D9D9" ns0:sz="4" ns0:val="single"/>
+              <ns0:right ns0:color="D9D9D9" ns0:sz="4" ns0:val="single"/>
             </ns0:tcBorders>
             <ns0:tcMar>
-              <ns0:top ns0:w="95" ns0:type="dxa"/>
-              <ns0:left ns0:w="95" ns0:type="dxa"/>
-              <ns0:bottom ns0:w="95" ns0:type="dxa"/>
-              <ns0:right ns0:w="95" ns0:type="dxa"/>
+              <ns0:top ns0:type="dxa" ns0:w="95"/>
+              <ns0:left ns0:type="dxa" ns0:w="95"/>
+              <ns0:bottom ns0:type="dxa" ns0:w="95"/>
+              <ns0:right ns0:type="dxa" ns0:w="95"/>
             </ns0:tcMar>
           </ns0:tcPr>
           <ns0:p>
@@ -4591,16 +4591,16 @@
             <ns0:vAlign ns0:val="center"/>
             <ns0:shd ns0:fill="FAFAFA"/>
             <ns0:tcBorders>
-              <ns0:top ns0:val="single" ns0:sz="4" ns0:color="D9D9D9"/>
-              <ns0:left ns0:val="single" ns0:sz="4" ns0:color="D9D9D9"/>
-              <ns0:bottom ns0:val="single" ns0:sz="4" ns0:color="D9D9D9"/>
-              <ns0:right ns0:val="single" ns0:sz="4" ns0:color="D9D9D9"/>
+              <ns0:top ns0:color="D9D9D9" ns0:sz="4" ns0:val="single"/>
+              <ns0:left ns0:color="D9D9D9" ns0:sz="4" ns0:val="single"/>
+              <ns0:bottom ns0:color="D9D9D9" ns0:sz="4" ns0:val="single"/>
+              <ns0:right ns0:color="D9D9D9" ns0:sz="4" ns0:val="single"/>
             </ns0:tcBorders>
             <ns0:tcMar>
-              <ns0:top ns0:w="95" ns0:type="dxa"/>
-              <ns0:left ns0:w="95" ns0:type="dxa"/>
-              <ns0:bottom ns0:w="95" ns0:type="dxa"/>
-              <ns0:right ns0:w="95" ns0:type="dxa"/>
+              <ns0:top ns0:type="dxa" ns0:w="95"/>
+              <ns0:left ns0:type="dxa" ns0:w="95"/>
+              <ns0:bottom ns0:type="dxa" ns0:w="95"/>
+              <ns0:right ns0:type="dxa" ns0:w="95"/>
             </ns0:tcMar>
           </ns0:tcPr>
           <ns0:p>
@@ -4624,16 +4624,16 @@
             <ns0:vAlign ns0:val="center"/>
             <ns0:shd ns0:fill="FAFAFA"/>
             <ns0:tcBorders>
-              <ns0:top ns0:val="single" ns0:sz="4" ns0:color="D9D9D9"/>
-              <ns0:left ns0:val="single" ns0:sz="4" ns0:color="D9D9D9"/>
-              <ns0:bottom ns0:val="single" ns0:sz="4" ns0:color="D9D9D9"/>
-              <ns0:right ns0:val="single" ns0:sz="4" ns0:color="D9D9D9"/>
+              <ns0:top ns0:color="D9D9D9" ns0:sz="4" ns0:val="single"/>
+              <ns0:left ns0:color="D9D9D9" ns0:sz="4" ns0:val="single"/>
+              <ns0:bottom ns0:color="D9D9D9" ns0:sz="4" ns0:val="single"/>
+              <ns0:right ns0:color="D9D9D9" ns0:sz="4" ns0:val="single"/>
             </ns0:tcBorders>
             <ns0:tcMar>
-              <ns0:top ns0:w="95" ns0:type="dxa"/>
-              <ns0:left ns0:w="95" ns0:type="dxa"/>
-              <ns0:bottom ns0:w="95" ns0:type="dxa"/>
-              <ns0:right ns0:w="95" ns0:type="dxa"/>
+              <ns0:top ns0:type="dxa" ns0:w="95"/>
+              <ns0:left ns0:type="dxa" ns0:w="95"/>
+              <ns0:bottom ns0:type="dxa" ns0:w="95"/>
+              <ns0:right ns0:type="dxa" ns0:w="95"/>
             </ns0:tcMar>
           </ns0:tcPr>
           <ns0:p>
@@ -4683,7 +4683,7 @@
     <ns0:p>
       <ns0:pPr>
         <ns0:keepNext/>
-        <ns0:spacing ns0:before="160" ns0:after="80"/>
+        <ns0:spacing ns0:after="80" ns0:before="160"/>
         <ns0:ind ns0:firstLine="0"/>
         <ns0:jc ns0:val="left"/>
       </ns0:pPr>
@@ -4703,8 +4703,8 @@
       <ns0:r>
         <ns0:drawing>
           <ns2:inline>
-            <ns2:extent cx="5508000" cy="2350080"/>
-            <ns2:docPr id="1" name="Picture 1"/>
+            <ns2:extent cx="5760720" cy="2400300"/>
+            <ns2:docPr descr="Proposed diagram from diagrams/system-context.svg" id="1" name="Picture 1"/>
             <ns2:cNvGraphicFramePr>
               <ns3:graphicFrameLocks noChangeAspect="1"/>
             </ns2:cNvGraphicFramePr>
@@ -4712,7 +4712,7 @@
               <ns3:graphicData uri="http://schemas.openxmlformats.org/drawingml/2006/picture">
                 <ns4:pic>
                   <ns4:nvPicPr>
-                    <ns4:cNvPr id="0" name="context-readable.png"/>
+                    <ns4:cNvPr id="0" name="system-context.svg"/>
                     <ns4:cNvPicPr/>
                   </ns4:nvPicPr>
                   <ns4:blipFill>
@@ -4724,7 +4724,7 @@
                   <ns4:spPr>
                     <ns3:xfrm>
                       <ns3:off x="0" y="0"/>
-                      <ns3:ext cx="5508000" cy="2350080"/>
+                      <ns3:ext cx="5760720" cy="2400300"/>
                     </ns3:xfrm>
                     <ns3:prstGeom prst="rect"/>
                   </ns4:spPr>
@@ -4738,7 +4738,7 @@
     <ns0:p>
       <ns0:pPr>
         <ns0:keepNext/>
-        <ns0:spacing ns0:before="160" ns0:after="80"/>
+        <ns0:spacing ns0:after="80" ns0:before="160"/>
         <ns0:ind ns0:firstLine="0"/>
         <ns0:jc ns0:val="left"/>
       </ns0:pPr>
@@ -4751,11 +4751,14 @@
       </ns0:r>
     </ns0:p>
     <ns0:p>
+      <ns0:pPr>
+        <ns0:jc ns0:val="center"/>
+      </ns0:pPr>
       <ns0:r>
         <ns0:drawing>
           <ns2:inline>
-            <ns2:extent cx="4572000" cy="3917632"/>
-            <ns2:docPr id="2" name="Picture 2"/>
+            <ns2:extent cx="4114800" cy="4402836"/>
+            <ns2:docPr descr="Proposed diagram from diagrams/use-case.svg" id="2" name="Picture 2"/>
             <ns2:cNvGraphicFramePr>
               <ns3:graphicFrameLocks noChangeAspect="1"/>
             </ns2:cNvGraphicFramePr>
@@ -4763,7 +4766,7 @@
               <ns3:graphicData uri="http://schemas.openxmlformats.org/drawingml/2006/picture">
                 <ns4:pic>
                   <ns4:nvPicPr>
-                    <ns4:cNvPr id="0" name="use-case.png"/>
+                    <ns4:cNvPr id="0" name="use-case.svg"/>
                     <ns4:cNvPicPr/>
                   </ns4:nvPicPr>
                   <ns4:blipFill>
@@ -4775,7 +4778,7 @@
                   <ns4:spPr>
                     <ns3:xfrm>
                       <ns3:off x="0" y="0"/>
-                      <ns3:ext cx="4572000" cy="3917632"/>
+                      <ns3:ext cx="4114800" cy="4402836"/>
                     </ns3:xfrm>
                     <ns3:prstGeom prst="rect"/>
                   </ns4:spPr>
@@ -4789,7 +4792,7 @@
     <ns0:p>
       <ns0:pPr>
         <ns0:keepNext/>
-        <ns0:spacing ns0:before="160" ns0:after="80"/>
+        <ns0:spacing ns0:after="80" ns0:before="160"/>
         <ns0:ind ns0:firstLine="0"/>
         <ns0:jc ns0:val="left"/>
       </ns0:pPr>
@@ -4802,11 +4805,14 @@
       </ns0:r>
     </ns0:p>
     <ns0:p>
+      <ns0:pPr>
+        <ns0:jc ns0:val="center"/>
+      </ns0:pPr>
       <ns0:r>
         <ns0:drawing>
           <ns2:inline>
-            <ns2:extent cx="5508000" cy="2106000"/>
-            <ns2:docPr id="3" name="Picture 3"/>
+            <ns2:extent cx="5303520" cy="3664250"/>
+            <ns2:docPr descr="Proposed diagram from diagrams/component.svg" id="3" name="Picture 3"/>
             <ns2:cNvGraphicFramePr>
               <ns3:graphicFrameLocks noChangeAspect="1"/>
             </ns2:cNvGraphicFramePr>
@@ -4814,7 +4820,7 @@
               <ns3:graphicData uri="http://schemas.openxmlformats.org/drawingml/2006/picture">
                 <ns4:pic>
                   <ns4:nvPicPr>
-                    <ns4:cNvPr id="0" name="component-simple.png"/>
+                    <ns4:cNvPr id="0" name="component.svg"/>
                     <ns4:cNvPicPr/>
                   </ns4:nvPicPr>
                   <ns4:blipFill>
@@ -4826,7 +4832,7 @@
                   <ns4:spPr>
                     <ns3:xfrm>
                       <ns3:off x="0" y="0"/>
-                      <ns3:ext cx="5508000" cy="2106000"/>
+                      <ns3:ext cx="5303520" cy="3664250"/>
                     </ns3:xfrm>
                     <ns3:prstGeom prst="rect"/>
                   </ns4:spPr>
@@ -4856,13 +4862,13 @@
     </ns0:p>
     <ns0:p>
       <ns0:r>
-        <ns0:t>The interface concept follows the author’s main path. A low-fidelity storyboard is supplied in the repository; it describes intended states rather than an implemented interface.</ns0:t>
+        <ns0:t>The interface concept follows the author’s main path. The repository’s prototype/index.html presents linked static screen states for story entry, generation progress, result review, play and ending, saved versions and failure recovery. Request fields and game scenes are illustrative design examples.</ns0:t>
       </ns0:r>
     </ns0:p>
     <ns0:p>
       <ns0:pPr>
         <ns0:keepNext/>
-        <ns0:spacing ns0:before="160" ns0:after="80"/>
+        <ns0:spacing ns0:after="80" ns0:before="160"/>
         <ns0:ind ns0:firstLine="0"/>
         <ns0:jc ns0:val="left"/>
       </ns0:pPr>
@@ -4896,16 +4902,16 @@
             <ns0:vAlign ns0:val="center"/>
             <ns0:shd ns0:fill="F1F1F1"/>
             <ns0:tcBorders>
-              <ns0:top ns0:val="single" ns0:sz="4" ns0:color="D9D9D9"/>
-              <ns0:left ns0:val="single" ns0:sz="4" ns0:color="D9D9D9"/>
-              <ns0:bottom ns0:val="single" ns0:sz="4" ns0:color="D9D9D9"/>
-              <ns0:right ns0:val="single" ns0:sz="4" ns0:color="D9D9D9"/>
+              <ns0:top ns0:color="D9D9D9" ns0:sz="4" ns0:val="single"/>
+              <ns0:left ns0:color="D9D9D9" ns0:sz="4" ns0:val="single"/>
+              <ns0:bottom ns0:color="D9D9D9" ns0:sz="4" ns0:val="single"/>
+              <ns0:right ns0:color="D9D9D9" ns0:sz="4" ns0:val="single"/>
             </ns0:tcBorders>
             <ns0:tcMar>
-              <ns0:top ns0:w="95" ns0:type="dxa"/>
-              <ns0:left ns0:w="95" ns0:type="dxa"/>
-              <ns0:bottom ns0:w="95" ns0:type="dxa"/>
-              <ns0:right ns0:w="95" ns0:type="dxa"/>
+              <ns0:top ns0:type="dxa" ns0:w="95"/>
+              <ns0:left ns0:type="dxa" ns0:w="95"/>
+              <ns0:bottom ns0:type="dxa" ns0:w="95"/>
+              <ns0:right ns0:type="dxa" ns0:w="95"/>
             </ns0:tcMar>
           </ns0:tcPr>
           <ns0:p>
@@ -4930,16 +4936,16 @@
             <ns0:vAlign ns0:val="center"/>
             <ns0:shd ns0:fill="F1F1F1"/>
             <ns0:tcBorders>
-              <ns0:top ns0:val="single" ns0:sz="4" ns0:color="D9D9D9"/>
-              <ns0:left ns0:val="single" ns0:sz="4" ns0:color="D9D9D9"/>
-              <ns0:bottom ns0:val="single" ns0:sz="4" ns0:color="D9D9D9"/>
-              <ns0:right ns0:val="single" ns0:sz="4" ns0:color="D9D9D9"/>
+              <ns0:top ns0:color="D9D9D9" ns0:sz="4" ns0:val="single"/>
+              <ns0:left ns0:color="D9D9D9" ns0:sz="4" ns0:val="single"/>
+              <ns0:bottom ns0:color="D9D9D9" ns0:sz="4" ns0:val="single"/>
+              <ns0:right ns0:color="D9D9D9" ns0:sz="4" ns0:val="single"/>
             </ns0:tcBorders>
             <ns0:tcMar>
-              <ns0:top ns0:w="95" ns0:type="dxa"/>
-              <ns0:left ns0:w="95" ns0:type="dxa"/>
-              <ns0:bottom ns0:w="95" ns0:type="dxa"/>
-              <ns0:right ns0:w="95" ns0:type="dxa"/>
+              <ns0:top ns0:type="dxa" ns0:w="95"/>
+              <ns0:left ns0:type="dxa" ns0:w="95"/>
+              <ns0:bottom ns0:type="dxa" ns0:w="95"/>
+              <ns0:right ns0:type="dxa" ns0:w="95"/>
             </ns0:tcMar>
           </ns0:tcPr>
           <ns0:p>
@@ -4968,16 +4974,16 @@
             <ns0:tcW ns0:type="dxa" ns0:w="2268"/>
             <ns0:vAlign ns0:val="center"/>
             <ns0:tcBorders>
-              <ns0:top ns0:val="single" ns0:sz="4" ns0:color="D9D9D9"/>
-              <ns0:left ns0:val="single" ns0:sz="4" ns0:color="D9D9D9"/>
-              <ns0:bottom ns0:val="single" ns0:sz="4" ns0:color="D9D9D9"/>
-              <ns0:right ns0:val="single" ns0:sz="4" ns0:color="D9D9D9"/>
+              <ns0:top ns0:color="D9D9D9" ns0:sz="4" ns0:val="single"/>
+              <ns0:left ns0:color="D9D9D9" ns0:sz="4" ns0:val="single"/>
+              <ns0:bottom ns0:color="D9D9D9" ns0:sz="4" ns0:val="single"/>
+              <ns0:right ns0:color="D9D9D9" ns0:sz="4" ns0:val="single"/>
             </ns0:tcBorders>
             <ns0:tcMar>
-              <ns0:top ns0:w="95" ns0:type="dxa"/>
-              <ns0:left ns0:w="95" ns0:type="dxa"/>
-              <ns0:bottom ns0:w="95" ns0:type="dxa"/>
-              <ns0:right ns0:w="95" ns0:type="dxa"/>
+              <ns0:top ns0:type="dxa" ns0:w="95"/>
+              <ns0:left ns0:type="dxa" ns0:w="95"/>
+              <ns0:bottom ns0:type="dxa" ns0:w="95"/>
+              <ns0:right ns0:type="dxa" ns0:w="95"/>
             </ns0:tcMar>
           </ns0:tcPr>
           <ns0:p>
@@ -5000,16 +5006,16 @@
             <ns0:tcW ns0:type="dxa" ns0:w="6633"/>
             <ns0:vAlign ns0:val="center"/>
             <ns0:tcBorders>
-              <ns0:top ns0:val="single" ns0:sz="4" ns0:color="D9D9D9"/>
-              <ns0:left ns0:val="single" ns0:sz="4" ns0:color="D9D9D9"/>
-              <ns0:bottom ns0:val="single" ns0:sz="4" ns0:color="D9D9D9"/>
-              <ns0:right ns0:val="single" ns0:sz="4" ns0:color="D9D9D9"/>
+              <ns0:top ns0:color="D9D9D9" ns0:sz="4" ns0:val="single"/>
+              <ns0:left ns0:color="D9D9D9" ns0:sz="4" ns0:val="single"/>
+              <ns0:bottom ns0:color="D9D9D9" ns0:sz="4" ns0:val="single"/>
+              <ns0:right ns0:color="D9D9D9" ns0:sz="4" ns0:val="single"/>
             </ns0:tcBorders>
             <ns0:tcMar>
-              <ns0:top ns0:w="95" ns0:type="dxa"/>
-              <ns0:left ns0:w="95" ns0:type="dxa"/>
-              <ns0:bottom ns0:w="95" ns0:type="dxa"/>
-              <ns0:right ns0:w="95" ns0:type="dxa"/>
+              <ns0:top ns0:type="dxa" ns0:w="95"/>
+              <ns0:left ns0:type="dxa" ns0:w="95"/>
+              <ns0:bottom ns0:type="dxa" ns0:w="95"/>
+              <ns0:right ns0:type="dxa" ns0:w="95"/>
             </ns0:tcMar>
           </ns0:tcPr>
           <ns0:p>
@@ -5038,16 +5044,16 @@
             <ns0:vAlign ns0:val="center"/>
             <ns0:shd ns0:fill="FAFAFA"/>
             <ns0:tcBorders>
-              <ns0:top ns0:val="single" ns0:sz="4" ns0:color="D9D9D9"/>
-              <ns0:left ns0:val="single" ns0:sz="4" ns0:color="D9D9D9"/>
-              <ns0:bottom ns0:val="single" ns0:sz="4" ns0:color="D9D9D9"/>
-              <ns0:right ns0:val="single" ns0:sz="4" ns0:color="D9D9D9"/>
+              <ns0:top ns0:color="D9D9D9" ns0:sz="4" ns0:val="single"/>
+              <ns0:left ns0:color="D9D9D9" ns0:sz="4" ns0:val="single"/>
+              <ns0:bottom ns0:color="D9D9D9" ns0:sz="4" ns0:val="single"/>
+              <ns0:right ns0:color="D9D9D9" ns0:sz="4" ns0:val="single"/>
             </ns0:tcBorders>
             <ns0:tcMar>
-              <ns0:top ns0:w="95" ns0:type="dxa"/>
-              <ns0:left ns0:w="95" ns0:type="dxa"/>
-              <ns0:bottom ns0:w="95" ns0:type="dxa"/>
-              <ns0:right ns0:w="95" ns0:type="dxa"/>
+              <ns0:top ns0:type="dxa" ns0:w="95"/>
+              <ns0:left ns0:type="dxa" ns0:w="95"/>
+              <ns0:bottom ns0:type="dxa" ns0:w="95"/>
+              <ns0:right ns0:type="dxa" ns0:w="95"/>
             </ns0:tcMar>
           </ns0:tcPr>
           <ns0:p>
@@ -5071,16 +5077,16 @@
             <ns0:vAlign ns0:val="center"/>
             <ns0:shd ns0:fill="FAFAFA"/>
             <ns0:tcBorders>
-              <ns0:top ns0:val="single" ns0:sz="4" ns0:color="D9D9D9"/>
-              <ns0:left ns0:val="single" ns0:sz="4" ns0:color="D9D9D9"/>
-              <ns0:bottom ns0:val="single" ns0:sz="4" ns0:color="D9D9D9"/>
-              <ns0:right ns0:val="single" ns0:sz="4" ns0:color="D9D9D9"/>
+              <ns0:top ns0:color="D9D9D9" ns0:sz="4" ns0:val="single"/>
+              <ns0:left ns0:color="D9D9D9" ns0:sz="4" ns0:val="single"/>
+              <ns0:bottom ns0:color="D9D9D9" ns0:sz="4" ns0:val="single"/>
+              <ns0:right ns0:color="D9D9D9" ns0:sz="4" ns0:val="single"/>
             </ns0:tcBorders>
             <ns0:tcMar>
-              <ns0:top ns0:w="95" ns0:type="dxa"/>
-              <ns0:left ns0:w="95" ns0:type="dxa"/>
-              <ns0:bottom ns0:w="95" ns0:type="dxa"/>
-              <ns0:right ns0:w="95" ns0:type="dxa"/>
+              <ns0:top ns0:type="dxa" ns0:w="95"/>
+              <ns0:left ns0:type="dxa" ns0:w="95"/>
+              <ns0:bottom ns0:type="dxa" ns0:w="95"/>
+              <ns0:right ns0:type="dxa" ns0:w="95"/>
             </ns0:tcMar>
           </ns0:tcPr>
           <ns0:p>
@@ -5108,16 +5114,16 @@
             <ns0:tcW ns0:type="dxa" ns0:w="2268"/>
             <ns0:vAlign ns0:val="center"/>
             <ns0:tcBorders>
-              <ns0:top ns0:val="single" ns0:sz="4" ns0:color="D9D9D9"/>
-              <ns0:left ns0:val="single" ns0:sz="4" ns0:color="D9D9D9"/>
-              <ns0:bottom ns0:val="single" ns0:sz="4" ns0:color="D9D9D9"/>
-              <ns0:right ns0:val="single" ns0:sz="4" ns0:color="D9D9D9"/>
+              <ns0:top ns0:color="D9D9D9" ns0:sz="4" ns0:val="single"/>
+              <ns0:left ns0:color="D9D9D9" ns0:sz="4" ns0:val="single"/>
+              <ns0:bottom ns0:color="D9D9D9" ns0:sz="4" ns0:val="single"/>
+              <ns0:right ns0:color="D9D9D9" ns0:sz="4" ns0:val="single"/>
             </ns0:tcBorders>
             <ns0:tcMar>
-              <ns0:top ns0:w="95" ns0:type="dxa"/>
-              <ns0:left ns0:w="95" ns0:type="dxa"/>
-              <ns0:bottom ns0:w="95" ns0:type="dxa"/>
-              <ns0:right ns0:w="95" ns0:type="dxa"/>
+              <ns0:top ns0:type="dxa" ns0:w="95"/>
+              <ns0:left ns0:type="dxa" ns0:w="95"/>
+              <ns0:bottom ns0:type="dxa" ns0:w="95"/>
+              <ns0:right ns0:type="dxa" ns0:w="95"/>
             </ns0:tcMar>
           </ns0:tcPr>
           <ns0:p>
@@ -5140,16 +5146,16 @@
             <ns0:tcW ns0:type="dxa" ns0:w="6633"/>
             <ns0:vAlign ns0:val="center"/>
             <ns0:tcBorders>
-              <ns0:top ns0:val="single" ns0:sz="4" ns0:color="D9D9D9"/>
-              <ns0:left ns0:val="single" ns0:sz="4" ns0:color="D9D9D9"/>
-              <ns0:bottom ns0:val="single" ns0:sz="4" ns0:color="D9D9D9"/>
-              <ns0:right ns0:val="single" ns0:sz="4" ns0:color="D9D9D9"/>
+              <ns0:top ns0:color="D9D9D9" ns0:sz="4" ns0:val="single"/>
+              <ns0:left ns0:color="D9D9D9" ns0:sz="4" ns0:val="single"/>
+              <ns0:bottom ns0:color="D9D9D9" ns0:sz="4" ns0:val="single"/>
+              <ns0:right ns0:color="D9D9D9" ns0:sz="4" ns0:val="single"/>
             </ns0:tcBorders>
             <ns0:tcMar>
-              <ns0:top ns0:w="95" ns0:type="dxa"/>
-              <ns0:left ns0:w="95" ns0:type="dxa"/>
-              <ns0:bottom ns0:w="95" ns0:type="dxa"/>
-              <ns0:right ns0:w="95" ns0:type="dxa"/>
+              <ns0:top ns0:type="dxa" ns0:w="95"/>
+              <ns0:left ns0:type="dxa" ns0:w="95"/>
+              <ns0:bottom ns0:type="dxa" ns0:w="95"/>
+              <ns0:right ns0:type="dxa" ns0:w="95"/>
             </ns0:tcMar>
           </ns0:tcPr>
           <ns0:p>
@@ -5176,7 +5182,7 @@
     </ns0:p>
     <ns0:p>
       <ns0:r>
-        <ns0:t>Prototype review should test whether prospective authors understand what the system can generate, how to reach play and what changed from the requested story. No usability results are available yet.</ns0:t>
+        <ns0:t>A prototype walkthrough will examine whether prospective authors understand what the system can generate, how to reach play and what changed from the requested story. Observed confusion and resulting interface revisions will inform the design.</ns0:t>
       </ns0:r>
     </ns0:p>
     <ns0:p>
@@ -5199,7 +5205,7 @@
     <ns0:p>
       <ns0:pPr>
         <ns0:keepNext/>
-        <ns0:spacing ns0:before="160" ns0:after="80"/>
+        <ns0:spacing ns0:after="80" ns0:before="160"/>
         <ns0:ind ns0:firstLine="0"/>
         <ns0:jc ns0:val="left"/>
       </ns0:pPr>
@@ -5233,16 +5239,16 @@
             <ns0:vAlign ns0:val="center"/>
             <ns0:shd ns0:fill="F1F1F1"/>
             <ns0:tcBorders>
-              <ns0:top ns0:val="single" ns0:sz="4" ns0:color="D9D9D9"/>
-              <ns0:left ns0:val="single" ns0:sz="4" ns0:color="D9D9D9"/>
-              <ns0:bottom ns0:val="single" ns0:sz="4" ns0:color="D9D9D9"/>
-              <ns0:right ns0:val="single" ns0:sz="4" ns0:color="D9D9D9"/>
+              <ns0:top ns0:color="D9D9D9" ns0:sz="4" ns0:val="single"/>
+              <ns0:left ns0:color="D9D9D9" ns0:sz="4" ns0:val="single"/>
+              <ns0:bottom ns0:color="D9D9D9" ns0:sz="4" ns0:val="single"/>
+              <ns0:right ns0:color="D9D9D9" ns0:sz="4" ns0:val="single"/>
             </ns0:tcBorders>
             <ns0:tcMar>
-              <ns0:top ns0:w="95" ns0:type="dxa"/>
-              <ns0:left ns0:w="95" ns0:type="dxa"/>
-              <ns0:bottom ns0:w="95" ns0:type="dxa"/>
-              <ns0:right ns0:w="95" ns0:type="dxa"/>
+              <ns0:top ns0:type="dxa" ns0:w="95"/>
+              <ns0:left ns0:type="dxa" ns0:w="95"/>
+              <ns0:bottom ns0:type="dxa" ns0:w="95"/>
+              <ns0:right ns0:type="dxa" ns0:w="95"/>
             </ns0:tcMar>
           </ns0:tcPr>
           <ns0:p>
@@ -5267,16 +5273,16 @@
             <ns0:vAlign ns0:val="center"/>
             <ns0:shd ns0:fill="F1F1F1"/>
             <ns0:tcBorders>
-              <ns0:top ns0:val="single" ns0:sz="4" ns0:color="D9D9D9"/>
-              <ns0:left ns0:val="single" ns0:sz="4" ns0:color="D9D9D9"/>
-              <ns0:bottom ns0:val="single" ns0:sz="4" ns0:color="D9D9D9"/>
-              <ns0:right ns0:val="single" ns0:sz="4" ns0:color="D9D9D9"/>
+              <ns0:top ns0:color="D9D9D9" ns0:sz="4" ns0:val="single"/>
+              <ns0:left ns0:color="D9D9D9" ns0:sz="4" ns0:val="single"/>
+              <ns0:bottom ns0:color="D9D9D9" ns0:sz="4" ns0:val="single"/>
+              <ns0:right ns0:color="D9D9D9" ns0:sz="4" ns0:val="single"/>
             </ns0:tcBorders>
             <ns0:tcMar>
-              <ns0:top ns0:w="95" ns0:type="dxa"/>
-              <ns0:left ns0:w="95" ns0:type="dxa"/>
-              <ns0:bottom ns0:w="95" ns0:type="dxa"/>
-              <ns0:right ns0:w="95" ns0:type="dxa"/>
+              <ns0:top ns0:type="dxa" ns0:w="95"/>
+              <ns0:left ns0:type="dxa" ns0:w="95"/>
+              <ns0:bottom ns0:type="dxa" ns0:w="95"/>
+              <ns0:right ns0:type="dxa" ns0:w="95"/>
             </ns0:tcMar>
           </ns0:tcPr>
           <ns0:p>
@@ -5305,16 +5311,16 @@
             <ns0:tcW ns0:type="dxa" ns0:w="2324"/>
             <ns0:vAlign ns0:val="center"/>
             <ns0:tcBorders>
-              <ns0:top ns0:val="single" ns0:sz="4" ns0:color="D9D9D9"/>
-              <ns0:left ns0:val="single" ns0:sz="4" ns0:color="D9D9D9"/>
-              <ns0:bottom ns0:val="single" ns0:sz="4" ns0:color="D9D9D9"/>
-              <ns0:right ns0:val="single" ns0:sz="4" ns0:color="D9D9D9"/>
+              <ns0:top ns0:color="D9D9D9" ns0:sz="4" ns0:val="single"/>
+              <ns0:left ns0:color="D9D9D9" ns0:sz="4" ns0:val="single"/>
+              <ns0:bottom ns0:color="D9D9D9" ns0:sz="4" ns0:val="single"/>
+              <ns0:right ns0:color="D9D9D9" ns0:sz="4" ns0:val="single"/>
             </ns0:tcBorders>
             <ns0:tcMar>
-              <ns0:top ns0:w="95" ns0:type="dxa"/>
-              <ns0:left ns0:w="95" ns0:type="dxa"/>
-              <ns0:bottom ns0:w="95" ns0:type="dxa"/>
-              <ns0:right ns0:w="95" ns0:type="dxa"/>
+              <ns0:top ns0:type="dxa" ns0:w="95"/>
+              <ns0:left ns0:type="dxa" ns0:w="95"/>
+              <ns0:bottom ns0:type="dxa" ns0:w="95"/>
+              <ns0:right ns0:type="dxa" ns0:w="95"/>
             </ns0:tcMar>
           </ns0:tcPr>
           <ns0:p>
@@ -5337,16 +5343,16 @@
             <ns0:tcW ns0:type="dxa" ns0:w="6576"/>
             <ns0:vAlign ns0:val="center"/>
             <ns0:tcBorders>
-              <ns0:top ns0:val="single" ns0:sz="4" ns0:color="D9D9D9"/>
-              <ns0:left ns0:val="single" ns0:sz="4" ns0:color="D9D9D9"/>
-              <ns0:bottom ns0:val="single" ns0:sz="4" ns0:color="D9D9D9"/>
-              <ns0:right ns0:val="single" ns0:sz="4" ns0:color="D9D9D9"/>
+              <ns0:top ns0:color="D9D9D9" ns0:sz="4" ns0:val="single"/>
+              <ns0:left ns0:color="D9D9D9" ns0:sz="4" ns0:val="single"/>
+              <ns0:bottom ns0:color="D9D9D9" ns0:sz="4" ns0:val="single"/>
+              <ns0:right ns0:color="D9D9D9" ns0:sz="4" ns0:val="single"/>
             </ns0:tcBorders>
             <ns0:tcMar>
-              <ns0:top ns0:w="95" ns0:type="dxa"/>
-              <ns0:left ns0:w="95" ns0:type="dxa"/>
-              <ns0:bottom ns0:w="95" ns0:type="dxa"/>
-              <ns0:right ns0:w="95" ns0:type="dxa"/>
+              <ns0:top ns0:type="dxa" ns0:w="95"/>
+              <ns0:left ns0:type="dxa" ns0:w="95"/>
+              <ns0:bottom ns0:type="dxa" ns0:w="95"/>
+              <ns0:right ns0:type="dxa" ns0:w="95"/>
             </ns0:tcMar>
           </ns0:tcPr>
           <ns0:p>
@@ -5375,16 +5381,16 @@
             <ns0:vAlign ns0:val="center"/>
             <ns0:shd ns0:fill="FAFAFA"/>
             <ns0:tcBorders>
-              <ns0:top ns0:val="single" ns0:sz="4" ns0:color="D9D9D9"/>
-              <ns0:left ns0:val="single" ns0:sz="4" ns0:color="D9D9D9"/>
-              <ns0:bottom ns0:val="single" ns0:sz="4" ns0:color="D9D9D9"/>
-              <ns0:right ns0:val="single" ns0:sz="4" ns0:color="D9D9D9"/>
+              <ns0:top ns0:color="D9D9D9" ns0:sz="4" ns0:val="single"/>
+              <ns0:left ns0:color="D9D9D9" ns0:sz="4" ns0:val="single"/>
+              <ns0:bottom ns0:color="D9D9D9" ns0:sz="4" ns0:val="single"/>
+              <ns0:right ns0:color="D9D9D9" ns0:sz="4" ns0:val="single"/>
             </ns0:tcBorders>
             <ns0:tcMar>
-              <ns0:top ns0:w="95" ns0:type="dxa"/>
-              <ns0:left ns0:w="95" ns0:type="dxa"/>
-              <ns0:bottom ns0:w="95" ns0:type="dxa"/>
-              <ns0:right ns0:w="95" ns0:type="dxa"/>
+              <ns0:top ns0:type="dxa" ns0:w="95"/>
+              <ns0:left ns0:type="dxa" ns0:w="95"/>
+              <ns0:bottom ns0:type="dxa" ns0:w="95"/>
+              <ns0:right ns0:type="dxa" ns0:w="95"/>
             </ns0:tcMar>
           </ns0:tcPr>
           <ns0:p>
@@ -5408,16 +5414,16 @@
             <ns0:vAlign ns0:val="center"/>
             <ns0:shd ns0:fill="FAFAFA"/>
             <ns0:tcBorders>
-              <ns0:top ns0:val="single" ns0:sz="4" ns0:color="D9D9D9"/>
-              <ns0:left ns0:val="single" ns0:sz="4" ns0:color="D9D9D9"/>
-              <ns0:bottom ns0:val="single" ns0:sz="4" ns0:color="D9D9D9"/>
-              <ns0:right ns0:val="single" ns0:sz="4" ns0:color="D9D9D9"/>
+              <ns0:top ns0:color="D9D9D9" ns0:sz="4" ns0:val="single"/>
+              <ns0:left ns0:color="D9D9D9" ns0:sz="4" ns0:val="single"/>
+              <ns0:bottom ns0:color="D9D9D9" ns0:sz="4" ns0:val="single"/>
+              <ns0:right ns0:color="D9D9D9" ns0:sz="4" ns0:val="single"/>
             </ns0:tcBorders>
             <ns0:tcMar>
-              <ns0:top ns0:w="95" ns0:type="dxa"/>
-              <ns0:left ns0:w="95" ns0:type="dxa"/>
-              <ns0:bottom ns0:w="95" ns0:type="dxa"/>
-              <ns0:right ns0:w="95" ns0:type="dxa"/>
+              <ns0:top ns0:type="dxa" ns0:w="95"/>
+              <ns0:left ns0:type="dxa" ns0:w="95"/>
+              <ns0:bottom ns0:type="dxa" ns0:w="95"/>
+              <ns0:right ns0:type="dxa" ns0:w="95"/>
             </ns0:tcMar>
           </ns0:tcPr>
           <ns0:p>
@@ -5445,16 +5451,16 @@
             <ns0:tcW ns0:type="dxa" ns0:w="2324"/>
             <ns0:vAlign ns0:val="center"/>
             <ns0:tcBorders>
-              <ns0:top ns0:val="single" ns0:sz="4" ns0:color="D9D9D9"/>
-              <ns0:left ns0:val="single" ns0:sz="4" ns0:color="D9D9D9"/>
-              <ns0:bottom ns0:val="single" ns0:sz="4" ns0:color="D9D9D9"/>
-              <ns0:right ns0:val="single" ns0:sz="4" ns0:color="D9D9D9"/>
+              <ns0:top ns0:color="D9D9D9" ns0:sz="4" ns0:val="single"/>
+              <ns0:left ns0:color="D9D9D9" ns0:sz="4" ns0:val="single"/>
+              <ns0:bottom ns0:color="D9D9D9" ns0:sz="4" ns0:val="single"/>
+              <ns0:right ns0:color="D9D9D9" ns0:sz="4" ns0:val="single"/>
             </ns0:tcBorders>
             <ns0:tcMar>
-              <ns0:top ns0:w="95" ns0:type="dxa"/>
-              <ns0:left ns0:w="95" ns0:type="dxa"/>
-              <ns0:bottom ns0:w="95" ns0:type="dxa"/>
-              <ns0:right ns0:w="95" ns0:type="dxa"/>
+              <ns0:top ns0:type="dxa" ns0:w="95"/>
+              <ns0:left ns0:type="dxa" ns0:w="95"/>
+              <ns0:bottom ns0:type="dxa" ns0:w="95"/>
+              <ns0:right ns0:type="dxa" ns0:w="95"/>
             </ns0:tcMar>
           </ns0:tcPr>
           <ns0:p>
@@ -5477,16 +5483,16 @@
             <ns0:tcW ns0:type="dxa" ns0:w="6576"/>
             <ns0:vAlign ns0:val="center"/>
             <ns0:tcBorders>
-              <ns0:top ns0:val="single" ns0:sz="4" ns0:color="D9D9D9"/>
-              <ns0:left ns0:val="single" ns0:sz="4" ns0:color="D9D9D9"/>
-              <ns0:bottom ns0:val="single" ns0:sz="4" ns0:color="D9D9D9"/>
-              <ns0:right ns0:val="single" ns0:sz="4" ns0:color="D9D9D9"/>
+              <ns0:top ns0:color="D9D9D9" ns0:sz="4" ns0:val="single"/>
+              <ns0:left ns0:color="D9D9D9" ns0:sz="4" ns0:val="single"/>
+              <ns0:bottom ns0:color="D9D9D9" ns0:sz="4" ns0:val="single"/>
+              <ns0:right ns0:color="D9D9D9" ns0:sz="4" ns0:val="single"/>
             </ns0:tcBorders>
             <ns0:tcMar>
-              <ns0:top ns0:w="95" ns0:type="dxa"/>
-              <ns0:left ns0:w="95" ns0:type="dxa"/>
-              <ns0:bottom ns0:w="95" ns0:type="dxa"/>
-              <ns0:right ns0:w="95" ns0:type="dxa"/>
+              <ns0:top ns0:type="dxa" ns0:w="95"/>
+              <ns0:left ns0:type="dxa" ns0:w="95"/>
+              <ns0:bottom ns0:type="dxa" ns0:w="95"/>
+              <ns0:right ns0:type="dxa" ns0:w="95"/>
             </ns0:tcMar>
           </ns0:tcPr>
           <ns0:p>
@@ -5515,16 +5521,16 @@
             <ns0:vAlign ns0:val="center"/>
             <ns0:shd ns0:fill="FAFAFA"/>
             <ns0:tcBorders>
-              <ns0:top ns0:val="single" ns0:sz="4" ns0:color="D9D9D9"/>
-              <ns0:left ns0:val="single" ns0:sz="4" ns0:color="D9D9D9"/>
-              <ns0:bottom ns0:val="single" ns0:sz="4" ns0:color="D9D9D9"/>
-              <ns0:right ns0:val="single" ns0:sz="4" ns0:color="D9D9D9"/>
+              <ns0:top ns0:color="D9D9D9" ns0:sz="4" ns0:val="single"/>
+              <ns0:left ns0:color="D9D9D9" ns0:sz="4" ns0:val="single"/>
+              <ns0:bottom ns0:color="D9D9D9" ns0:sz="4" ns0:val="single"/>
+              <ns0:right ns0:color="D9D9D9" ns0:sz="4" ns0:val="single"/>
             </ns0:tcBorders>
             <ns0:tcMar>
-              <ns0:top ns0:w="95" ns0:type="dxa"/>
-              <ns0:left ns0:w="95" ns0:type="dxa"/>
-              <ns0:bottom ns0:w="95" ns0:type="dxa"/>
-              <ns0:right ns0:w="95" ns0:type="dxa"/>
+              <ns0:top ns0:type="dxa" ns0:w="95"/>
+              <ns0:left ns0:type="dxa" ns0:w="95"/>
+              <ns0:bottom ns0:type="dxa" ns0:w="95"/>
+              <ns0:right ns0:type="dxa" ns0:w="95"/>
             </ns0:tcMar>
           </ns0:tcPr>
           <ns0:p>
@@ -5548,16 +5554,16 @@
             <ns0:vAlign ns0:val="center"/>
             <ns0:shd ns0:fill="FAFAFA"/>
             <ns0:tcBorders>
-              <ns0:top ns0:val="single" ns0:sz="4" ns0:color="D9D9D9"/>
-              <ns0:left ns0:val="single" ns0:sz="4" ns0:color="D9D9D9"/>
-              <ns0:bottom ns0:val="single" ns0:sz="4" ns0:color="D9D9D9"/>
-              <ns0:right ns0:val="single" ns0:sz="4" ns0:color="D9D9D9"/>
+              <ns0:top ns0:color="D9D9D9" ns0:sz="4" ns0:val="single"/>
+              <ns0:left ns0:color="D9D9D9" ns0:sz="4" ns0:val="single"/>
+              <ns0:bottom ns0:color="D9D9D9" ns0:sz="4" ns0:val="single"/>
+              <ns0:right ns0:color="D9D9D9" ns0:sz="4" ns0:val="single"/>
             </ns0:tcBorders>
             <ns0:tcMar>
-              <ns0:top ns0:w="95" ns0:type="dxa"/>
-              <ns0:left ns0:w="95" ns0:type="dxa"/>
-              <ns0:bottom ns0:w="95" ns0:type="dxa"/>
-              <ns0:right ns0:w="95" ns0:type="dxa"/>
+              <ns0:top ns0:type="dxa" ns0:w="95"/>
+              <ns0:left ns0:type="dxa" ns0:w="95"/>
+              <ns0:bottom ns0:type="dxa" ns0:w="95"/>
+              <ns0:right ns0:type="dxa" ns0:w="95"/>
             </ns0:tcMar>
           </ns0:tcPr>
           <ns0:p>
@@ -5584,7 +5590,7 @@
     </ns0:p>
     <ns0:p>
       <ns0:r>
-        <ns0:t>No implementation tests or generation-quality measurements have been run. Thresholds will be agreed before the first measured comparison.</ns0:t>
+        <ns0:t>Evaluation thresholds will be agreed before the first measured comparison.</ns0:t>
       </ns0:r>
     </ns0:p>
     <ns0:p>
@@ -5601,13 +5607,13 @@
     </ns0:p>
     <ns0:p>
       <ns0:r>
-        <ns0:t>The three students own frontend and UX, platform services, and AI generation respectively (Table 1); shared interfaces and research synthesis require cross-review. Draft artifacts are versioned in the GitHub repository lastnurik/diploma on branch pre-defense-draft. The proposed eight-issue project backlog is recorded locally; actual YouTrack issue links and a reviewed submission tag are not documented. The milestones remain subject to supervisor review.</ns0:t>
+        <ns0:t>The three students own frontend and UX, platform services, and AI generation respectively (Table 1); shared interfaces and research synthesis require cross-review. Draft artifacts are versioned in the GitHub repository lastnurik/diploma on branch pre-defense-draft. The team uses the YouTrack workspace at https://aitu-gamegen.youtrack.cloud/. The repository backlog specifies development deliverables, dependencies and acceptance conditions. The milestones provide the proposed sequence for implementation and evaluation.</ns0:t>
       </ns0:r>
     </ns0:p>
     <ns0:p>
       <ns0:pPr>
         <ns0:keepNext/>
-        <ns0:spacing ns0:before="160" ns0:after="80"/>
+        <ns0:spacing ns0:after="80" ns0:before="160"/>
         <ns0:ind ns0:firstLine="0"/>
         <ns0:jc ns0:val="left"/>
       </ns0:pPr>
@@ -5641,16 +5647,16 @@
             <ns0:vAlign ns0:val="center"/>
             <ns0:shd ns0:fill="F1F1F1"/>
             <ns0:tcBorders>
-              <ns0:top ns0:val="single" ns0:sz="4" ns0:color="D9D9D9"/>
-              <ns0:left ns0:val="single" ns0:sz="4" ns0:color="D9D9D9"/>
-              <ns0:bottom ns0:val="single" ns0:sz="4" ns0:color="D9D9D9"/>
-              <ns0:right ns0:val="single" ns0:sz="4" ns0:color="D9D9D9"/>
+              <ns0:top ns0:color="D9D9D9" ns0:sz="4" ns0:val="single"/>
+              <ns0:left ns0:color="D9D9D9" ns0:sz="4" ns0:val="single"/>
+              <ns0:bottom ns0:color="D9D9D9" ns0:sz="4" ns0:val="single"/>
+              <ns0:right ns0:color="D9D9D9" ns0:sz="4" ns0:val="single"/>
             </ns0:tcBorders>
             <ns0:tcMar>
-              <ns0:top ns0:w="95" ns0:type="dxa"/>
-              <ns0:left ns0:w="95" ns0:type="dxa"/>
-              <ns0:bottom ns0:w="95" ns0:type="dxa"/>
-              <ns0:right ns0:w="95" ns0:type="dxa"/>
+              <ns0:top ns0:type="dxa" ns0:w="95"/>
+              <ns0:left ns0:type="dxa" ns0:w="95"/>
+              <ns0:bottom ns0:type="dxa" ns0:w="95"/>
+              <ns0:right ns0:type="dxa" ns0:w="95"/>
             </ns0:tcMar>
           </ns0:tcPr>
           <ns0:p>
@@ -5675,16 +5681,16 @@
             <ns0:vAlign ns0:val="center"/>
             <ns0:shd ns0:fill="F1F1F1"/>
             <ns0:tcBorders>
-              <ns0:top ns0:val="single" ns0:sz="4" ns0:color="D9D9D9"/>
-              <ns0:left ns0:val="single" ns0:sz="4" ns0:color="D9D9D9"/>
-              <ns0:bottom ns0:val="single" ns0:sz="4" ns0:color="D9D9D9"/>
-              <ns0:right ns0:val="single" ns0:sz="4" ns0:color="D9D9D9"/>
+              <ns0:top ns0:color="D9D9D9" ns0:sz="4" ns0:val="single"/>
+              <ns0:left ns0:color="D9D9D9" ns0:sz="4" ns0:val="single"/>
+              <ns0:bottom ns0:color="D9D9D9" ns0:sz="4" ns0:val="single"/>
+              <ns0:right ns0:color="D9D9D9" ns0:sz="4" ns0:val="single"/>
             </ns0:tcBorders>
             <ns0:tcMar>
-              <ns0:top ns0:w="95" ns0:type="dxa"/>
-              <ns0:left ns0:w="95" ns0:type="dxa"/>
-              <ns0:bottom ns0:w="95" ns0:type="dxa"/>
-              <ns0:right ns0:w="95" ns0:type="dxa"/>
+              <ns0:top ns0:type="dxa" ns0:w="95"/>
+              <ns0:left ns0:type="dxa" ns0:w="95"/>
+              <ns0:bottom ns0:type="dxa" ns0:w="95"/>
+              <ns0:right ns0:type="dxa" ns0:w="95"/>
             </ns0:tcMar>
           </ns0:tcPr>
           <ns0:p>
@@ -5713,16 +5719,16 @@
             <ns0:tcW ns0:type="dxa" ns0:w="2438"/>
             <ns0:vAlign ns0:val="center"/>
             <ns0:tcBorders>
-              <ns0:top ns0:val="single" ns0:sz="4" ns0:color="D9D9D9"/>
-              <ns0:left ns0:val="single" ns0:sz="4" ns0:color="D9D9D9"/>
-              <ns0:bottom ns0:val="single" ns0:sz="4" ns0:color="D9D9D9"/>
-              <ns0:right ns0:val="single" ns0:sz="4" ns0:color="D9D9D9"/>
+              <ns0:top ns0:color="D9D9D9" ns0:sz="4" ns0:val="single"/>
+              <ns0:left ns0:color="D9D9D9" ns0:sz="4" ns0:val="single"/>
+              <ns0:bottom ns0:color="D9D9D9" ns0:sz="4" ns0:val="single"/>
+              <ns0:right ns0:color="D9D9D9" ns0:sz="4" ns0:val="single"/>
             </ns0:tcBorders>
             <ns0:tcMar>
-              <ns0:top ns0:w="95" ns0:type="dxa"/>
-              <ns0:left ns0:w="95" ns0:type="dxa"/>
-              <ns0:bottom ns0:w="95" ns0:type="dxa"/>
-              <ns0:right ns0:w="95" ns0:type="dxa"/>
+              <ns0:top ns0:type="dxa" ns0:w="95"/>
+              <ns0:left ns0:type="dxa" ns0:w="95"/>
+              <ns0:bottom ns0:type="dxa" ns0:w="95"/>
+              <ns0:right ns0:type="dxa" ns0:w="95"/>
             </ns0:tcMar>
           </ns0:tcPr>
           <ns0:p>
@@ -5745,16 +5751,16 @@
             <ns0:tcW ns0:type="dxa" ns0:w="6463"/>
             <ns0:vAlign ns0:val="center"/>
             <ns0:tcBorders>
-              <ns0:top ns0:val="single" ns0:sz="4" ns0:color="D9D9D9"/>
-              <ns0:left ns0:val="single" ns0:sz="4" ns0:color="D9D9D9"/>
-              <ns0:bottom ns0:val="single" ns0:sz="4" ns0:color="D9D9D9"/>
-              <ns0:right ns0:val="single" ns0:sz="4" ns0:color="D9D9D9"/>
+              <ns0:top ns0:color="D9D9D9" ns0:sz="4" ns0:val="single"/>
+              <ns0:left ns0:color="D9D9D9" ns0:sz="4" ns0:val="single"/>
+              <ns0:bottom ns0:color="D9D9D9" ns0:sz="4" ns0:val="single"/>
+              <ns0:right ns0:color="D9D9D9" ns0:sz="4" ns0:val="single"/>
             </ns0:tcBorders>
             <ns0:tcMar>
-              <ns0:top ns0:w="95" ns0:type="dxa"/>
-              <ns0:left ns0:w="95" ns0:type="dxa"/>
-              <ns0:bottom ns0:w="95" ns0:type="dxa"/>
-              <ns0:right ns0:w="95" ns0:type="dxa"/>
+              <ns0:top ns0:type="dxa" ns0:w="95"/>
+              <ns0:left ns0:type="dxa" ns0:w="95"/>
+              <ns0:bottom ns0:type="dxa" ns0:w="95"/>
+              <ns0:right ns0:type="dxa" ns0:w="95"/>
             </ns0:tcMar>
           </ns0:tcPr>
           <ns0:p>
@@ -5783,16 +5789,16 @@
             <ns0:vAlign ns0:val="center"/>
             <ns0:shd ns0:fill="FAFAFA"/>
             <ns0:tcBorders>
-              <ns0:top ns0:val="single" ns0:sz="4" ns0:color="D9D9D9"/>
-              <ns0:left ns0:val="single" ns0:sz="4" ns0:color="D9D9D9"/>
-              <ns0:bottom ns0:val="single" ns0:sz="4" ns0:color="D9D9D9"/>
-              <ns0:right ns0:val="single" ns0:sz="4" ns0:color="D9D9D9"/>
+              <ns0:top ns0:color="D9D9D9" ns0:sz="4" ns0:val="single"/>
+              <ns0:left ns0:color="D9D9D9" ns0:sz="4" ns0:val="single"/>
+              <ns0:bottom ns0:color="D9D9D9" ns0:sz="4" ns0:val="single"/>
+              <ns0:right ns0:color="D9D9D9" ns0:sz="4" ns0:val="single"/>
             </ns0:tcBorders>
             <ns0:tcMar>
-              <ns0:top ns0:w="95" ns0:type="dxa"/>
-              <ns0:left ns0:w="95" ns0:type="dxa"/>
-              <ns0:bottom ns0:w="95" ns0:type="dxa"/>
-              <ns0:right ns0:w="95" ns0:type="dxa"/>
+              <ns0:top ns0:type="dxa" ns0:w="95"/>
+              <ns0:left ns0:type="dxa" ns0:w="95"/>
+              <ns0:bottom ns0:type="dxa" ns0:w="95"/>
+              <ns0:right ns0:type="dxa" ns0:w="95"/>
             </ns0:tcMar>
           </ns0:tcPr>
           <ns0:p>
@@ -5816,16 +5822,16 @@
             <ns0:vAlign ns0:val="center"/>
             <ns0:shd ns0:fill="FAFAFA"/>
             <ns0:tcBorders>
-              <ns0:top ns0:val="single" ns0:sz="4" ns0:color="D9D9D9"/>
-              <ns0:left ns0:val="single" ns0:sz="4" ns0:color="D9D9D9"/>
-              <ns0:bottom ns0:val="single" ns0:sz="4" ns0:color="D9D9D9"/>
-              <ns0:right ns0:val="single" ns0:sz="4" ns0:color="D9D9D9"/>
+              <ns0:top ns0:color="D9D9D9" ns0:sz="4" ns0:val="single"/>
+              <ns0:left ns0:color="D9D9D9" ns0:sz="4" ns0:val="single"/>
+              <ns0:bottom ns0:color="D9D9D9" ns0:sz="4" ns0:val="single"/>
+              <ns0:right ns0:color="D9D9D9" ns0:sz="4" ns0:val="single"/>
             </ns0:tcBorders>
             <ns0:tcMar>
-              <ns0:top ns0:w="95" ns0:type="dxa"/>
-              <ns0:left ns0:w="95" ns0:type="dxa"/>
-              <ns0:bottom ns0:w="95" ns0:type="dxa"/>
-              <ns0:right ns0:w="95" ns0:type="dxa"/>
+              <ns0:top ns0:type="dxa" ns0:w="95"/>
+              <ns0:left ns0:type="dxa" ns0:w="95"/>
+              <ns0:bottom ns0:type="dxa" ns0:w="95"/>
+              <ns0:right ns0:type="dxa" ns0:w="95"/>
             </ns0:tcMar>
           </ns0:tcPr>
           <ns0:p>
@@ -5853,16 +5859,16 @@
             <ns0:tcW ns0:type="dxa" ns0:w="2438"/>
             <ns0:vAlign ns0:val="center"/>
             <ns0:tcBorders>
-              <ns0:top ns0:val="single" ns0:sz="4" ns0:color="D9D9D9"/>
-              <ns0:left ns0:val="single" ns0:sz="4" ns0:color="D9D9D9"/>
-              <ns0:bottom ns0:val="single" ns0:sz="4" ns0:color="D9D9D9"/>
-              <ns0:right ns0:val="single" ns0:sz="4" ns0:color="D9D9D9"/>
+              <ns0:top ns0:color="D9D9D9" ns0:sz="4" ns0:val="single"/>
+              <ns0:left ns0:color="D9D9D9" ns0:sz="4" ns0:val="single"/>
+              <ns0:bottom ns0:color="D9D9D9" ns0:sz="4" ns0:val="single"/>
+              <ns0:right ns0:color="D9D9D9" ns0:sz="4" ns0:val="single"/>
             </ns0:tcBorders>
             <ns0:tcMar>
-              <ns0:top ns0:w="95" ns0:type="dxa"/>
-              <ns0:left ns0:w="95" ns0:type="dxa"/>
-              <ns0:bottom ns0:w="95" ns0:type="dxa"/>
-              <ns0:right ns0:w="95" ns0:type="dxa"/>
+              <ns0:top ns0:type="dxa" ns0:w="95"/>
+              <ns0:left ns0:type="dxa" ns0:w="95"/>
+              <ns0:bottom ns0:type="dxa" ns0:w="95"/>
+              <ns0:right ns0:type="dxa" ns0:w="95"/>
             </ns0:tcMar>
           </ns0:tcPr>
           <ns0:p>
@@ -5885,16 +5891,16 @@
             <ns0:tcW ns0:type="dxa" ns0:w="6463"/>
             <ns0:vAlign ns0:val="center"/>
             <ns0:tcBorders>
-              <ns0:top ns0:val="single" ns0:sz="4" ns0:color="D9D9D9"/>
-              <ns0:left ns0:val="single" ns0:sz="4" ns0:color="D9D9D9"/>
-              <ns0:bottom ns0:val="single" ns0:sz="4" ns0:color="D9D9D9"/>
-              <ns0:right ns0:val="single" ns0:sz="4" ns0:color="D9D9D9"/>
+              <ns0:top ns0:color="D9D9D9" ns0:sz="4" ns0:val="single"/>
+              <ns0:left ns0:color="D9D9D9" ns0:sz="4" ns0:val="single"/>
+              <ns0:bottom ns0:color="D9D9D9" ns0:sz="4" ns0:val="single"/>
+              <ns0:right ns0:color="D9D9D9" ns0:sz="4" ns0:val="single"/>
             </ns0:tcBorders>
             <ns0:tcMar>
-              <ns0:top ns0:w="95" ns0:type="dxa"/>
-              <ns0:left ns0:w="95" ns0:type="dxa"/>
-              <ns0:bottom ns0:w="95" ns0:type="dxa"/>
-              <ns0:right ns0:w="95" ns0:type="dxa"/>
+              <ns0:top ns0:type="dxa" ns0:w="95"/>
+              <ns0:left ns0:type="dxa" ns0:w="95"/>
+              <ns0:bottom ns0:type="dxa" ns0:w="95"/>
+              <ns0:right ns0:type="dxa" ns0:w="95"/>
             </ns0:tcMar>
           </ns0:tcPr>
           <ns0:p>
@@ -5923,16 +5929,16 @@
             <ns0:vAlign ns0:val="center"/>
             <ns0:shd ns0:fill="FAFAFA"/>
             <ns0:tcBorders>
-              <ns0:top ns0:val="single" ns0:sz="4" ns0:color="D9D9D9"/>
-              <ns0:left ns0:val="single" ns0:sz="4" ns0:color="D9D9D9"/>
-              <ns0:bottom ns0:val="single" ns0:sz="4" ns0:color="D9D9D9"/>
-              <ns0:right ns0:val="single" ns0:sz="4" ns0:color="D9D9D9"/>
+              <ns0:top ns0:color="D9D9D9" ns0:sz="4" ns0:val="single"/>
+              <ns0:left ns0:color="D9D9D9" ns0:sz="4" ns0:val="single"/>
+              <ns0:bottom ns0:color="D9D9D9" ns0:sz="4" ns0:val="single"/>
+              <ns0:right ns0:color="D9D9D9" ns0:sz="4" ns0:val="single"/>
             </ns0:tcBorders>
             <ns0:tcMar>
-              <ns0:top ns0:w="95" ns0:type="dxa"/>
-              <ns0:left ns0:w="95" ns0:type="dxa"/>
-              <ns0:bottom ns0:w="95" ns0:type="dxa"/>
-              <ns0:right ns0:w="95" ns0:type="dxa"/>
+              <ns0:top ns0:type="dxa" ns0:w="95"/>
+              <ns0:left ns0:type="dxa" ns0:w="95"/>
+              <ns0:bottom ns0:type="dxa" ns0:w="95"/>
+              <ns0:right ns0:type="dxa" ns0:w="95"/>
             </ns0:tcMar>
           </ns0:tcPr>
           <ns0:p>
@@ -5956,16 +5962,16 @@
             <ns0:vAlign ns0:val="center"/>
             <ns0:shd ns0:fill="FAFAFA"/>
             <ns0:tcBorders>
-              <ns0:top ns0:val="single" ns0:sz="4" ns0:color="D9D9D9"/>
-              <ns0:left ns0:val="single" ns0:sz="4" ns0:color="D9D9D9"/>
-              <ns0:bottom ns0:val="single" ns0:sz="4" ns0:color="D9D9D9"/>
-              <ns0:right ns0:val="single" ns0:sz="4" ns0:color="D9D9D9"/>
+              <ns0:top ns0:color="D9D9D9" ns0:sz="4" ns0:val="single"/>
+              <ns0:left ns0:color="D9D9D9" ns0:sz="4" ns0:val="single"/>
+              <ns0:bottom ns0:color="D9D9D9" ns0:sz="4" ns0:val="single"/>
+              <ns0:right ns0:color="D9D9D9" ns0:sz="4" ns0:val="single"/>
             </ns0:tcBorders>
             <ns0:tcMar>
-              <ns0:top ns0:w="95" ns0:type="dxa"/>
-              <ns0:left ns0:w="95" ns0:type="dxa"/>
-              <ns0:bottom ns0:w="95" ns0:type="dxa"/>
-              <ns0:right ns0:w="95" ns0:type="dxa"/>
+              <ns0:top ns0:type="dxa" ns0:w="95"/>
+              <ns0:left ns0:type="dxa" ns0:w="95"/>
+              <ns0:bottom ns0:type="dxa" ns0:w="95"/>
+              <ns0:right ns0:type="dxa" ns0:w="95"/>
             </ns0:tcMar>
           </ns0:tcPr>
           <ns0:p>
@@ -6009,13 +6015,12 @@
     </ns0:p>
     <ns0:p>
       <ns0:r>
-        <ns0:t>Substantive supervisor review of the research comparison, proposed specification and diagrams remains pending. The next review will address the initial mechanic set, research evidence and evaluation criteria. Each resulting decision will be recorded with its date, affected artifact, responsible author and revision.</ns0:t>
+        <ns0:t>The recorded supervisor guidance prioritizes the project proposal and relevance and calls for concise treatment of the remaining required sections. This manuscript follows that emphasis through the detailed proposal and relevance analysis in Sections 1 and 2, supported by compact research, design and evaluation sections. Subsequent consultation will address the initial mechanic set, interpretation of questionnaire findings and evaluation criteria. Decisions and resulting revisions will be recorded with the consultation date, affected artifact and responsible author.</ns0:t>
       </ns0:r>
     </ns0:p>
     <ns0:p>
       <ns0:pPr>
         <ns0:pStyle ns0:val="Heading1"/>
-        <ns0:pageBreakBefore/>
       </ns0:pPr>
       <ns0:r>
         <ns0:rPr>
@@ -6155,8 +6160,8 @@
     </ns0:p>
     <ns0:sectPr ns0:rsidR="00FC693F" ns0:rsidRPr="0006063C" ns0:rsidSect="00034616">
       <ns0:footerReference ns0:type="default" ns5:id="rId12"/>
-      <ns0:pgSz ns0:w="11906" ns0:h="16838"/>
-      <ns0:pgMar ns0:top="1134" ns0:right="850" ns0:bottom="1134" ns0:left="1701" ns0:header="510" ns0:footer="567" ns0:gutter="0"/>
+      <ns0:pgSz ns0:h="16838" ns0:w="11906"/>
+      <ns0:pgMar ns0:bottom="1134" ns0:footer="567" ns0:gutter="0" ns0:header="510" ns0:left="1701" ns0:right="850" ns0:top="1134"/>
       <ns0:cols ns0:space="720"/>
       <ns0:titlePg/>
       <ns0:docGrid ns0:linePitch="360"/>

</xml_diff>